<commit_message>
Include Workflow Architecture Diagrams and Process Flowcharts across all frequently updated Word documents
</commit_message>
<xml_diff>
--- a/docs/Complete_3_Portals_Workflow_Guide.docx
+++ b/docs/Complete_3_Portals_Workflow_Guide.docx
@@ -213,92 +213,245 @@
     </w:p>
     <w:p>
       <w:pPr>
-        <w:pStyle w:val="ListBullet"/>
-        <w:spacing w:after="80"/>
+        <w:keepNext/>
+        <w:spacing w:before="320" w:after="120"/>
       </w:pPr>
       <w:r>
         <w:rPr>
           <w:rFonts w:ascii="Times New Roman" w:hAnsi="Times New Roman"/>
           <w:b/>
-          <w:color w:val="0F766E"/>
+          <w:color w:val="0369A1"/>
           <w:sz w:val="28"/>
         </w:rPr>
-        <w:t xml:space="preserve">Step 1 — Login Authentication: </w:t>
-      </w:r>
-      <w:r>
-        <w:rPr>
-          <w:rFonts w:ascii="Times New Roman" w:hAnsi="Times New Roman"/>
-          <w:sz w:val="28"/>
-        </w:rPr>
-        <w:t>User submits credentials and role selection (Faculty, Dept Admin, System Admin). Backend verifies hashed password via bcryptjs.</w:t>
+        <w:t>❖ Workflow Architecture Diagram: Centralized JWT Authentication &amp; Portal Access Routing</w:t>
       </w:r>
     </w:p>
-    <w:p>
-      <w:pPr>
-        <w:pStyle w:val="ListBullet"/>
-        <w:spacing w:after="80"/>
-      </w:pPr>
-      <w:r>
-        <w:rPr>
-          <w:rFonts w:ascii="Times New Roman" w:hAnsi="Times New Roman"/>
-          <w:b/>
-          <w:color w:val="0F766E"/>
-          <w:sz w:val="28"/>
-        </w:rPr>
-        <w:t xml:space="preserve">Step 2 — JWT Claim Issuance: </w:t>
-      </w:r>
-      <w:r>
-        <w:rPr>
-          <w:rFonts w:ascii="Times New Roman" w:hAnsi="Times New Roman"/>
-          <w:sz w:val="28"/>
-        </w:rPr>
-        <w:t>Server generates a 24-hour JWT token embedding staffId, role, name, designation, department, isHod, isInstitutionalAdmin, isSupervisorEligible, and isClubCoordinator.</w:t>
-      </w:r>
-    </w:p>
-    <w:p>
-      <w:pPr>
-        <w:pStyle w:val="ListBullet"/>
-        <w:spacing w:after="80"/>
-      </w:pPr>
-      <w:r>
-        <w:rPr>
-          <w:rFonts w:ascii="Times New Roman" w:hAnsi="Times New Roman"/>
-          <w:b/>
-          <w:color w:val="0F766E"/>
-          <w:sz w:val="28"/>
-        </w:rPr>
-        <w:t xml:space="preserve">Step 3 — Client Session Initialization: </w:t>
-      </w:r>
-      <w:r>
-        <w:rPr>
-          <w:rFonts w:ascii="Times New Roman" w:hAnsi="Times New Roman"/>
-          <w:sz w:val="28"/>
-        </w:rPr>
-        <w:t>Token and claims stored in client localStorage. React router (App.jsx) initializes sidebar navigation tree and route guards.</w:t>
-      </w:r>
-    </w:p>
-    <w:p>
-      <w:pPr>
-        <w:pStyle w:val="ListBullet"/>
-        <w:spacing w:after="80"/>
-      </w:pPr>
-      <w:r>
-        <w:rPr>
-          <w:rFonts w:ascii="Times New Roman" w:hAnsi="Times New Roman"/>
-          <w:b/>
-          <w:color w:val="0F766E"/>
-          <w:sz w:val="28"/>
-        </w:rPr>
-        <w:t xml:space="preserve">Step 4 — Protected Request Middleware: </w:t>
-      </w:r>
-      <w:r>
-        <w:rPr>
-          <w:rFonts w:ascii="Times New Roman" w:hAnsi="Times New Roman"/>
-          <w:sz w:val="28"/>
-        </w:rPr>
-        <w:t>All API requests attach Bearer token header. Static file uploads under /uploads/* and /SREC/* are protected by requireFileAuth middleware.</w:t>
-      </w:r>
-    </w:p>
+    <w:tbl>
+      <w:tblPr>
+        <w:tblW w:type="auto" w:w="0"/>
+        <w:jc w:val="center"/>
+        <w:tblLayout w:type="fixed"/>
+        <w:tblLook w:firstColumn="1" w:firstRow="1" w:lastColumn="0" w:lastRow="0" w:noHBand="0" w:noVBand="1" w:val="04A0"/>
+        <w:tblBorders>
+          <w:top w:val="single" w:sz="8" w:space="0" w:color="0F331F"/>
+          <w:left w:val="single" w:sz="8" w:space="0" w:color="0F331F"/>
+          <w:bottom w:val="single" w:sz="8" w:space="0" w:color="0F331F"/>
+          <w:right w:val="single" w:sz="8" w:space="0" w:color="0F331F"/>
+          <w:insideH w:val="single" w:sz="8" w:space="0" w:color="0F331F"/>
+          <w:insideV w:val="none"/>
+        </w:tblBorders>
+      </w:tblPr>
+      <w:tblGrid>
+        <w:gridCol w:w="10080"/>
+      </w:tblGrid>
+      <w:tr>
+        <w:tc>
+          <w:tcPr>
+            <w:tcW w:type="dxa" w:w="10080"/>
+            <w:shd w:val="clear" w:color="auto" w:fill="F8FAFC"/>
+            <w:tcMar>
+              <w:top w:w="140" w:type="dxa"/>
+              <w:bottom w:w="140" w:type="dxa"/>
+              <w:left w:w="180" w:type="dxa"/>
+              <w:right w:w="180" w:type="dxa"/>
+            </w:tcMar>
+          </w:tcPr>
+          <w:p>
+            <w:pPr>
+              <w:spacing w:before="80" w:after="120"/>
+            </w:pPr>
+            <w:r>
+              <w:rPr>
+                <w:rFonts w:ascii="Times New Roman" w:hAnsi="Times New Roman"/>
+                <w:b/>
+                <w:color w:val="0F331F"/>
+                <w:sz w:val="28"/>
+              </w:rPr>
+              <w:t>ARCHITECTURAL FLOW: CENTRALIZED JWT AUTHENTICATION &amp; PORTAL ACCESS ROUTING</w:t>
+              <w:br/>
+            </w:r>
+          </w:p>
+          <w:p>
+            <w:pPr>
+              <w:spacing w:before="40" w:after="80"/>
+            </w:pPr>
+            <w:r>
+              <w:rPr>
+                <w:rFonts w:ascii="Times New Roman" w:hAnsi="Times New Roman"/>
+                <w:b/>
+                <w:color w:val="0369A1"/>
+                <w:sz w:val="28"/>
+              </w:rPr>
+              <w:t xml:space="preserve">► Step 1: </w:t>
+            </w:r>
+            <w:r>
+              <w:rPr>
+                <w:rFonts w:ascii="Times New Roman" w:hAnsi="Times New Roman"/>
+                <w:color w:val="1E293B"/>
+                <w:sz w:val="28"/>
+              </w:rPr>
+              <w:t>User inputs credentials (Staff ID / Password / Role Selection) at /login.</w:t>
+            </w:r>
+          </w:p>
+          <w:p>
+            <w:pPr>
+              <w:spacing w:before="0" w:after="0"/>
+              <w:jc w:val="center"/>
+            </w:pPr>
+            <w:r>
+              <w:rPr>
+                <w:rFonts w:ascii="Times New Roman" w:hAnsi="Times New Roman"/>
+                <w:b/>
+                <w:color w:val="0F766E"/>
+                <w:sz w:val="28"/>
+              </w:rPr>
+              <w:t>│</w:t>
+              <w:br/>
+              <w:t>▼</w:t>
+            </w:r>
+          </w:p>
+          <w:p>
+            <w:pPr>
+              <w:spacing w:before="40" w:after="80"/>
+            </w:pPr>
+            <w:r>
+              <w:rPr>
+                <w:rFonts w:ascii="Times New Roman" w:hAnsi="Times New Roman"/>
+                <w:b/>
+                <w:color w:val="0369A1"/>
+                <w:sz w:val="28"/>
+              </w:rPr>
+              <w:t xml:space="preserve">► Step 2: </w:t>
+            </w:r>
+            <w:r>
+              <w:rPr>
+                <w:rFonts w:ascii="Times New Roman" w:hAnsi="Times New Roman"/>
+                <w:color w:val="1E293B"/>
+                <w:sz w:val="28"/>
+              </w:rPr>
+              <w:t>Backend verifies password via bcryptjs against staff_user or admin tables.</w:t>
+            </w:r>
+          </w:p>
+          <w:p>
+            <w:pPr>
+              <w:spacing w:before="0" w:after="0"/>
+              <w:jc w:val="center"/>
+            </w:pPr>
+            <w:r>
+              <w:rPr>
+                <w:rFonts w:ascii="Times New Roman" w:hAnsi="Times New Roman"/>
+                <w:b/>
+                <w:color w:val="0F766E"/>
+                <w:sz w:val="28"/>
+              </w:rPr>
+              <w:t>│</w:t>
+              <w:br/>
+              <w:t>▼</w:t>
+            </w:r>
+          </w:p>
+          <w:p>
+            <w:pPr>
+              <w:spacing w:before="40" w:after="80"/>
+            </w:pPr>
+            <w:r>
+              <w:rPr>
+                <w:rFonts w:ascii="Times New Roman" w:hAnsi="Times New Roman"/>
+                <w:b/>
+                <w:color w:val="0369A1"/>
+                <w:sz w:val="28"/>
+              </w:rPr>
+              <w:t xml:space="preserve">► Step 3: </w:t>
+            </w:r>
+            <w:r>
+              <w:rPr>
+                <w:rFonts w:ascii="Times New Roman" w:hAnsi="Times New Roman"/>
+                <w:color w:val="1E293B"/>
+                <w:sz w:val="28"/>
+              </w:rPr>
+              <w:t>Server generates 24-hour JWT token with claims: role, isHod, isInstitutionalAdmin, isSupervisorEligible, isClubCoordinator.</w:t>
+            </w:r>
+          </w:p>
+          <w:p>
+            <w:pPr>
+              <w:spacing w:before="0" w:after="0"/>
+              <w:jc w:val="center"/>
+            </w:pPr>
+            <w:r>
+              <w:rPr>
+                <w:rFonts w:ascii="Times New Roman" w:hAnsi="Times New Roman"/>
+                <w:b/>
+                <w:color w:val="0F766E"/>
+                <w:sz w:val="28"/>
+              </w:rPr>
+              <w:t>│</w:t>
+              <w:br/>
+              <w:t>▼</w:t>
+            </w:r>
+          </w:p>
+          <w:p>
+            <w:pPr>
+              <w:spacing w:before="40" w:after="80"/>
+            </w:pPr>
+            <w:r>
+              <w:rPr>
+                <w:rFonts w:ascii="Times New Roman" w:hAnsi="Times New Roman"/>
+                <w:b/>
+                <w:color w:val="0369A1"/>
+                <w:sz w:val="28"/>
+              </w:rPr>
+              <w:t xml:space="preserve">► Step 4: </w:t>
+            </w:r>
+            <w:r>
+              <w:rPr>
+                <w:rFonts w:ascii="Times New Roman" w:hAnsi="Times New Roman"/>
+                <w:color w:val="1E293B"/>
+                <w:sz w:val="28"/>
+              </w:rPr>
+              <w:t>Client stores token in localStorage and passes Bearer Authorization Header on all API calls.</w:t>
+            </w:r>
+          </w:p>
+          <w:p>
+            <w:pPr>
+              <w:spacing w:before="0" w:after="0"/>
+              <w:jc w:val="center"/>
+            </w:pPr>
+            <w:r>
+              <w:rPr>
+                <w:rFonts w:ascii="Times New Roman" w:hAnsi="Times New Roman"/>
+                <w:b/>
+                <w:color w:val="0F766E"/>
+                <w:sz w:val="28"/>
+              </w:rPr>
+              <w:t>│</w:t>
+              <w:br/>
+              <w:t>▼</w:t>
+            </w:r>
+          </w:p>
+          <w:p>
+            <w:pPr>
+              <w:spacing w:before="40" w:after="80"/>
+            </w:pPr>
+            <w:r>
+              <w:rPr>
+                <w:rFonts w:ascii="Times New Roman" w:hAnsi="Times New Roman"/>
+                <w:b/>
+                <w:color w:val="0369A1"/>
+                <w:sz w:val="28"/>
+              </w:rPr>
+              <w:t xml:space="preserve">► Step 5: </w:t>
+            </w:r>
+            <w:r>
+              <w:rPr>
+                <w:rFonts w:ascii="Times New Roman" w:hAnsi="Times New Roman"/>
+                <w:color w:val="1E293B"/>
+                <w:sz w:val="28"/>
+              </w:rPr>
+              <w:t>React Router (App.jsx) dynamically mounts Portal 1 (Faculty), Portal 2 (Dept Admin), or Portal 3 (System Admin).</w:t>
+            </w:r>
+          </w:p>
+        </w:tc>
+      </w:tr>
+    </w:tbl>
     <w:p>
       <w:pPr>
         <w:spacing w:after="160"/>
@@ -487,6 +640,247 @@
     </w:p>
     <w:p>
       <w:pPr>
+        <w:keepNext/>
+        <w:spacing w:before="320" w:after="120"/>
+      </w:pPr>
+      <w:r>
+        <w:rPr>
+          <w:rFonts w:ascii="Times New Roman" w:hAnsi="Times New Roman"/>
+          <w:b/>
+          <w:color w:val="0369A1"/>
+          <w:sz w:val="28"/>
+        </w:rPr>
+        <w:t>❖ Workflow Architecture Diagram: Faculty Annual FPI Appraisal Self-Submission Process</w:t>
+      </w:r>
+    </w:p>
+    <w:tbl>
+      <w:tblPr>
+        <w:tblW w:type="auto" w:w="0"/>
+        <w:jc w:val="center"/>
+        <w:tblLayout w:type="fixed"/>
+        <w:tblLook w:firstColumn="1" w:firstRow="1" w:lastColumn="0" w:lastRow="0" w:noHBand="0" w:noVBand="1" w:val="04A0"/>
+        <w:tblBorders>
+          <w:top w:val="single" w:sz="8" w:space="0" w:color="0F331F"/>
+          <w:left w:val="single" w:sz="8" w:space="0" w:color="0F331F"/>
+          <w:bottom w:val="single" w:sz="8" w:space="0" w:color="0F331F"/>
+          <w:right w:val="single" w:sz="8" w:space="0" w:color="0F331F"/>
+          <w:insideH w:val="single" w:sz="8" w:space="0" w:color="0F331F"/>
+          <w:insideV w:val="none"/>
+        </w:tblBorders>
+      </w:tblPr>
+      <w:tblGrid>
+        <w:gridCol w:w="10080"/>
+      </w:tblGrid>
+      <w:tr>
+        <w:tc>
+          <w:tcPr>
+            <w:tcW w:type="dxa" w:w="10080"/>
+            <w:shd w:val="clear" w:color="auto" w:fill="F8FAFC"/>
+            <w:tcMar>
+              <w:top w:w="140" w:type="dxa"/>
+              <w:bottom w:w="140" w:type="dxa"/>
+              <w:left w:w="180" w:type="dxa"/>
+              <w:right w:w="180" w:type="dxa"/>
+            </w:tcMar>
+          </w:tcPr>
+          <w:p>
+            <w:pPr>
+              <w:spacing w:before="80" w:after="120"/>
+            </w:pPr>
+            <w:r>
+              <w:rPr>
+                <w:rFonts w:ascii="Times New Roman" w:hAnsi="Times New Roman"/>
+                <w:b/>
+                <w:color w:val="0F331F"/>
+                <w:sz w:val="28"/>
+              </w:rPr>
+              <w:t>ARCHITECTURAL FLOW: FACULTY ANNUAL FPI APPRAISAL SELF-SUBMISSION PROCESS</w:t>
+              <w:br/>
+            </w:r>
+          </w:p>
+          <w:p>
+            <w:pPr>
+              <w:spacing w:before="40" w:after="80"/>
+            </w:pPr>
+            <w:r>
+              <w:rPr>
+                <w:rFonts w:ascii="Times New Roman" w:hAnsi="Times New Roman"/>
+                <w:b/>
+                <w:color w:val="0369A1"/>
+                <w:sz w:val="28"/>
+              </w:rPr>
+              <w:t xml:space="preserve">► Step 1: </w:t>
+            </w:r>
+            <w:r>
+              <w:rPr>
+                <w:rFonts w:ascii="Times New Roman" w:hAnsi="Times New Roman"/>
+                <w:color w:val="1E293B"/>
+                <w:sz w:val="28"/>
+              </w:rPr>
+              <w:t>Faculty accesses /appraisal for completed academic year (2025-2026).</w:t>
+            </w:r>
+          </w:p>
+          <w:p>
+            <w:pPr>
+              <w:spacing w:before="0" w:after="0"/>
+              <w:jc w:val="center"/>
+            </w:pPr>
+            <w:r>
+              <w:rPr>
+                <w:rFonts w:ascii="Times New Roman" w:hAnsi="Times New Roman"/>
+                <w:b/>
+                <w:color w:val="0F766E"/>
+                <w:sz w:val="28"/>
+              </w:rPr>
+              <w:t>│</w:t>
+              <w:br/>
+              <w:t>▼</w:t>
+            </w:r>
+          </w:p>
+          <w:p>
+            <w:pPr>
+              <w:spacing w:before="40" w:after="80"/>
+            </w:pPr>
+            <w:r>
+              <w:rPr>
+                <w:rFonts w:ascii="Times New Roman" w:hAnsi="Times New Roman"/>
+                <w:b/>
+                <w:color w:val="0369A1"/>
+                <w:sz w:val="28"/>
+              </w:rPr>
+              <w:t xml:space="preserve">► Step 2: </w:t>
+            </w:r>
+            <w:r>
+              <w:rPr>
+                <w:rFonts w:ascii="Times New Roman" w:hAnsi="Times New Roman"/>
+                <w:color w:val="1E293B"/>
+                <w:sz w:val="28"/>
+              </w:rPr>
+              <w:t>Engine auto-fetches logged portal data (Pass %, Feedback, FDPs, Publications, Grants, Responsibilities).</w:t>
+            </w:r>
+          </w:p>
+          <w:p>
+            <w:pPr>
+              <w:spacing w:before="0" w:after="0"/>
+              <w:jc w:val="center"/>
+            </w:pPr>
+            <w:r>
+              <w:rPr>
+                <w:rFonts w:ascii="Times New Roman" w:hAnsi="Times New Roman"/>
+                <w:b/>
+                <w:color w:val="0F766E"/>
+                <w:sz w:val="28"/>
+              </w:rPr>
+              <w:t>│</w:t>
+              <w:br/>
+              <w:t>▼</w:t>
+            </w:r>
+          </w:p>
+          <w:p>
+            <w:pPr>
+              <w:spacing w:before="40" w:after="80"/>
+            </w:pPr>
+            <w:r>
+              <w:rPr>
+                <w:rFonts w:ascii="Times New Roman" w:hAnsi="Times New Roman"/>
+                <w:b/>
+                <w:color w:val="0369A1"/>
+                <w:sz w:val="28"/>
+              </w:rPr>
+              <w:t xml:space="preserve">► Step 3: </w:t>
+            </w:r>
+            <w:r>
+              <w:rPr>
+                <w:rFonts w:ascii="Times New Roman" w:hAnsi="Times New Roman"/>
+                <w:color w:val="1E293B"/>
+                <w:sz w:val="28"/>
+              </w:rPr>
+              <w:t>System calculates auto-mapped scores across PART A (Max 60), PART B (Max 40), PART C (Max 80), PART D (Max 20).</w:t>
+            </w:r>
+          </w:p>
+          <w:p>
+            <w:pPr>
+              <w:spacing w:before="0" w:after="0"/>
+              <w:jc w:val="center"/>
+            </w:pPr>
+            <w:r>
+              <w:rPr>
+                <w:rFonts w:ascii="Times New Roman" w:hAnsi="Times New Roman"/>
+                <w:b/>
+                <w:color w:val="0F766E"/>
+                <w:sz w:val="28"/>
+              </w:rPr>
+              <w:t>│</w:t>
+              <w:br/>
+              <w:t>▼</w:t>
+            </w:r>
+          </w:p>
+          <w:p>
+            <w:pPr>
+              <w:spacing w:before="40" w:after="80"/>
+            </w:pPr>
+            <w:r>
+              <w:rPr>
+                <w:rFonts w:ascii="Times New Roman" w:hAnsi="Times New Roman"/>
+                <w:b/>
+                <w:color w:val="0369A1"/>
+                <w:sz w:val="28"/>
+              </w:rPr>
+              <w:t xml:space="preserve">► Step 4: </w:t>
+            </w:r>
+            <w:r>
+              <w:rPr>
+                <w:rFonts w:ascii="Times New Roman" w:hAnsi="Times New Roman"/>
+                <w:color w:val="1E293B"/>
+                <w:sz w:val="28"/>
+              </w:rPr>
+              <w:t>Faculty inspects auto-mapped proof documents via 👁️ View Proof buttons.</w:t>
+            </w:r>
+          </w:p>
+          <w:p>
+            <w:pPr>
+              <w:spacing w:before="0" w:after="0"/>
+              <w:jc w:val="center"/>
+            </w:pPr>
+            <w:r>
+              <w:rPr>
+                <w:rFonts w:ascii="Times New Roman" w:hAnsi="Times New Roman"/>
+                <w:b/>
+                <w:color w:val="0F766E"/>
+                <w:sz w:val="28"/>
+              </w:rPr>
+              <w:t>│</w:t>
+              <w:br/>
+              <w:t>▼</w:t>
+            </w:r>
+          </w:p>
+          <w:p>
+            <w:pPr>
+              <w:spacing w:before="40" w:after="80"/>
+            </w:pPr>
+            <w:r>
+              <w:rPr>
+                <w:rFonts w:ascii="Times New Roman" w:hAnsi="Times New Roman"/>
+                <w:b/>
+                <w:color w:val="0369A1"/>
+                <w:sz w:val="28"/>
+              </w:rPr>
+              <w:t xml:space="preserve">► Step 5: </w:t>
+            </w:r>
+            <w:r>
+              <w:rPr>
+                <w:rFonts w:ascii="Times New Roman" w:hAnsi="Times New Roman"/>
+                <w:color w:val="1E293B"/>
+                <w:sz w:val="28"/>
+              </w:rPr>
+              <w:t>Faculty fills goals for next year, signs form, and clicks 'Submit FPI Form' (Status set to 'Submitted').</w:t>
+            </w:r>
+          </w:p>
+        </w:tc>
+      </w:tr>
+    </w:tbl>
+    <w:p>
+      <w:pPr>
         <w:spacing w:after="160"/>
       </w:pPr>
     </w:p>
@@ -607,6 +1001,247 @@
     </w:p>
     <w:p>
       <w:pPr>
+        <w:keepNext/>
+        <w:spacing w:before="320" w:after="120"/>
+      </w:pPr>
+      <w:r>
+        <w:rPr>
+          <w:rFonts w:ascii="Times New Roman" w:hAnsi="Times New Roman"/>
+          <w:b/>
+          <w:color w:val="0369A1"/>
+          <w:sz w:val="28"/>
+        </w:rPr>
+        <w:t>❖ Workflow Architecture Diagram: HOD Part-by-Part Appraisal Verification &amp; Score Evaluation</w:t>
+      </w:r>
+    </w:p>
+    <w:tbl>
+      <w:tblPr>
+        <w:tblW w:type="auto" w:w="0"/>
+        <w:jc w:val="center"/>
+        <w:tblLayout w:type="fixed"/>
+        <w:tblLook w:firstColumn="1" w:firstRow="1" w:lastColumn="0" w:lastRow="0" w:noHBand="0" w:noVBand="1" w:val="04A0"/>
+        <w:tblBorders>
+          <w:top w:val="single" w:sz="8" w:space="0" w:color="0F331F"/>
+          <w:left w:val="single" w:sz="8" w:space="0" w:color="0F331F"/>
+          <w:bottom w:val="single" w:sz="8" w:space="0" w:color="0F331F"/>
+          <w:right w:val="single" w:sz="8" w:space="0" w:color="0F331F"/>
+          <w:insideH w:val="single" w:sz="8" w:space="0" w:color="0F331F"/>
+          <w:insideV w:val="none"/>
+        </w:tblBorders>
+      </w:tblPr>
+      <w:tblGrid>
+        <w:gridCol w:w="10080"/>
+      </w:tblGrid>
+      <w:tr>
+        <w:tc>
+          <w:tcPr>
+            <w:tcW w:type="dxa" w:w="10080"/>
+            <w:shd w:val="clear" w:color="auto" w:fill="F8FAFC"/>
+            <w:tcMar>
+              <w:top w:w="140" w:type="dxa"/>
+              <w:bottom w:w="140" w:type="dxa"/>
+              <w:left w:w="180" w:type="dxa"/>
+              <w:right w:w="180" w:type="dxa"/>
+            </w:tcMar>
+          </w:tcPr>
+          <w:p>
+            <w:pPr>
+              <w:spacing w:before="80" w:after="120"/>
+            </w:pPr>
+            <w:r>
+              <w:rPr>
+                <w:rFonts w:ascii="Times New Roman" w:hAnsi="Times New Roman"/>
+                <w:b/>
+                <w:color w:val="0F331F"/>
+                <w:sz w:val="28"/>
+              </w:rPr>
+              <w:t>ARCHITECTURAL FLOW: HOD PART-BY-PART APPRAISAL VERIFICATION &amp; SCORE EVALUATION</w:t>
+              <w:br/>
+            </w:r>
+          </w:p>
+          <w:p>
+            <w:pPr>
+              <w:spacing w:before="40" w:after="80"/>
+            </w:pPr>
+            <w:r>
+              <w:rPr>
+                <w:rFonts w:ascii="Times New Roman" w:hAnsi="Times New Roman"/>
+                <w:b/>
+                <w:color w:val="0369A1"/>
+                <w:sz w:val="28"/>
+              </w:rPr>
+              <w:t xml:space="preserve">► Step 1: </w:t>
+            </w:r>
+            <w:r>
+              <w:rPr>
+                <w:rFonts w:ascii="Times New Roman" w:hAnsi="Times New Roman"/>
+                <w:color w:val="1E293B"/>
+                <w:sz w:val="28"/>
+              </w:rPr>
+              <w:t>HOD monitors department submissions queue (Status: 'Submitted').</w:t>
+            </w:r>
+          </w:p>
+          <w:p>
+            <w:pPr>
+              <w:spacing w:before="0" w:after="0"/>
+              <w:jc w:val="center"/>
+            </w:pPr>
+            <w:r>
+              <w:rPr>
+                <w:rFonts w:ascii="Times New Roman" w:hAnsi="Times New Roman"/>
+                <w:b/>
+                <w:color w:val="0F766E"/>
+                <w:sz w:val="28"/>
+              </w:rPr>
+              <w:t>│</w:t>
+              <w:br/>
+              <w:t>▼</w:t>
+            </w:r>
+          </w:p>
+          <w:p>
+            <w:pPr>
+              <w:spacing w:before="40" w:after="80"/>
+            </w:pPr>
+            <w:r>
+              <w:rPr>
+                <w:rFonts w:ascii="Times New Roman" w:hAnsi="Times New Roman"/>
+                <w:b/>
+                <w:color w:val="0369A1"/>
+                <w:sz w:val="28"/>
+              </w:rPr>
+              <w:t xml:space="preserve">► Step 2: </w:t>
+            </w:r>
+            <w:r>
+              <w:rPr>
+                <w:rFonts w:ascii="Times New Roman" w:hAnsi="Times New Roman"/>
+                <w:color w:val="1E293B"/>
+                <w:sz w:val="28"/>
+              </w:rPr>
+              <w:t>HOD opens Auto-Mapped Activity Verification Panel and clicks 👁️ View Proof to verify uploaded evidence.</w:t>
+            </w:r>
+          </w:p>
+          <w:p>
+            <w:pPr>
+              <w:spacing w:before="0" w:after="0"/>
+              <w:jc w:val="center"/>
+            </w:pPr>
+            <w:r>
+              <w:rPr>
+                <w:rFonts w:ascii="Times New Roman" w:hAnsi="Times New Roman"/>
+                <w:b/>
+                <w:color w:val="0F766E"/>
+                <w:sz w:val="28"/>
+              </w:rPr>
+              <w:t>│</w:t>
+              <w:br/>
+              <w:t>▼</w:t>
+            </w:r>
+          </w:p>
+          <w:p>
+            <w:pPr>
+              <w:spacing w:before="40" w:after="80"/>
+            </w:pPr>
+            <w:r>
+              <w:rPr>
+                <w:rFonts w:ascii="Times New Roman" w:hAnsi="Times New Roman"/>
+                <w:b/>
+                <w:color w:val="0369A1"/>
+                <w:sz w:val="28"/>
+              </w:rPr>
+              <w:t xml:space="preserve">► Step 3: </w:t>
+            </w:r>
+            <w:r>
+              <w:rPr>
+                <w:rFonts w:ascii="Times New Roman" w:hAnsi="Times New Roman"/>
+                <w:color w:val="1E293B"/>
+                <w:sz w:val="28"/>
+              </w:rPr>
+              <w:t>HOD inputs evaluated marks for PART A, PART B, PART C, and PART D based on institutional rubric.</w:t>
+            </w:r>
+          </w:p>
+          <w:p>
+            <w:pPr>
+              <w:spacing w:before="0" w:after="0"/>
+              <w:jc w:val="center"/>
+            </w:pPr>
+            <w:r>
+              <w:rPr>
+                <w:rFonts w:ascii="Times New Roman" w:hAnsi="Times New Roman"/>
+                <w:b/>
+                <w:color w:val="0F766E"/>
+                <w:sz w:val="28"/>
+              </w:rPr>
+              <w:t>│</w:t>
+              <w:br/>
+              <w:t>▼</w:t>
+            </w:r>
+          </w:p>
+          <w:p>
+            <w:pPr>
+              <w:spacing w:before="40" w:after="80"/>
+            </w:pPr>
+            <w:r>
+              <w:rPr>
+                <w:rFonts w:ascii="Times New Roman" w:hAnsi="Times New Roman"/>
+                <w:b/>
+                <w:color w:val="0369A1"/>
+                <w:sz w:val="28"/>
+              </w:rPr>
+              <w:t xml:space="preserve">► Step 4: </w:t>
+            </w:r>
+            <w:r>
+              <w:rPr>
+                <w:rFonts w:ascii="Times New Roman" w:hAnsi="Times New Roman"/>
+                <w:color w:val="1E293B"/>
+                <w:sz w:val="28"/>
+              </w:rPr>
+              <w:t>HOD adds qualitative evaluation remarks and submits form.</w:t>
+            </w:r>
+          </w:p>
+          <w:p>
+            <w:pPr>
+              <w:spacing w:before="0" w:after="0"/>
+              <w:jc w:val="center"/>
+            </w:pPr>
+            <w:r>
+              <w:rPr>
+                <w:rFonts w:ascii="Times New Roman" w:hAnsi="Times New Roman"/>
+                <w:b/>
+                <w:color w:val="0F766E"/>
+                <w:sz w:val="28"/>
+              </w:rPr>
+              <w:t>│</w:t>
+              <w:br/>
+              <w:t>▼</w:t>
+            </w:r>
+          </w:p>
+          <w:p>
+            <w:pPr>
+              <w:spacing w:before="40" w:after="80"/>
+            </w:pPr>
+            <w:r>
+              <w:rPr>
+                <w:rFonts w:ascii="Times New Roman" w:hAnsi="Times New Roman"/>
+                <w:b/>
+                <w:color w:val="0369A1"/>
+                <w:sz w:val="28"/>
+              </w:rPr>
+              <w:t xml:space="preserve">► Step 5: </w:t>
+            </w:r>
+            <w:r>
+              <w:rPr>
+                <w:rFonts w:ascii="Times New Roman" w:hAnsi="Times New Roman"/>
+                <w:color w:val="1E293B"/>
+                <w:sz w:val="28"/>
+              </w:rPr>
+              <w:t>System updates appraisal status to 'HOD Approved' and forwards queue to Principal/HR.</w:t>
+            </w:r>
+          </w:p>
+        </w:tc>
+      </w:tr>
+    </w:tbl>
+    <w:p>
+      <w:pPr>
         <w:spacing w:after="160"/>
       </w:pPr>
     </w:p>
@@ -656,7 +1291,7 @@
           <w:rFonts w:ascii="Times New Roman" w:hAnsi="Times New Roman"/>
           <w:sz w:val="28"/>
         </w:rPr>
-        <w:t>Admin accesses System Admins (/admin/system-admins), Dept Admins (/admin/dept-admins), Faculty Directory (/admin/faculty), and Club Coordinators (/admin/clubs). Has full permission to edit personal/academic details, update designations, reset credentials, or mark faculty as relieved (is_relieved === 1).</w:t>
+        <w:t>Admin accesses System Admins (/admin/system-admins), Dept Admins (/admin/dept-admins), Faculty Directory (/admin/faculty), and Club Coordinators (/admin/clubs). Has full permission to edit personal/academic details, update designations, reset credentials, assign Coordinators &amp; Co-Coordinators, or mark faculty as relieved (is_relieved === 1).</w:t>
       </w:r>
     </w:p>
     <w:p>
@@ -771,11 +1406,6 @@
     </w:p>
     <w:p>
       <w:pPr>
-        <w:spacing w:after="160"/>
-      </w:pPr>
-    </w:p>
-    <w:p>
-      <w:pPr>
         <w:keepNext/>
         <w:spacing w:before="320" w:after="120"/>
       </w:pPr>
@@ -783,111 +1413,242 @@
         <w:rPr>
           <w:rFonts w:ascii="Times New Roman" w:hAnsi="Times New Roman"/>
           <w:b/>
-          <w:color w:val="0F172A"/>
-          <w:sz w:val="32"/>
+          <w:color w:val="0369A1"/>
+          <w:sz w:val="28"/>
         </w:rPr>
-        <w:t>5. Automated Documentation Maintenance Protocol</w:t>
+        <w:t>❖ Workflow Architecture Diagram: Faculty Department Transfer &amp; Directory Relocation Lifecycle</w:t>
       </w:r>
     </w:p>
+    <w:tbl>
+      <w:tblPr>
+        <w:tblW w:type="auto" w:w="0"/>
+        <w:jc w:val="center"/>
+        <w:tblLayout w:type="fixed"/>
+        <w:tblLook w:firstColumn="1" w:firstRow="1" w:lastColumn="0" w:lastRow="0" w:noHBand="0" w:noVBand="1" w:val="04A0"/>
+        <w:tblBorders>
+          <w:top w:val="single" w:sz="8" w:space="0" w:color="0F331F"/>
+          <w:left w:val="single" w:sz="8" w:space="0" w:color="0F331F"/>
+          <w:bottom w:val="single" w:sz="8" w:space="0" w:color="0F331F"/>
+          <w:right w:val="single" w:sz="8" w:space="0" w:color="0F331F"/>
+          <w:insideH w:val="single" w:sz="8" w:space="0" w:color="0F331F"/>
+          <w:insideV w:val="none"/>
+        </w:tblBorders>
+      </w:tblPr>
+      <w:tblGrid>
+        <w:gridCol w:w="10080"/>
+      </w:tblGrid>
+      <w:tr>
+        <w:tc>
+          <w:tcPr>
+            <w:tcW w:type="dxa" w:w="10080"/>
+            <w:shd w:val="clear" w:color="auto" w:fill="F8FAFC"/>
+            <w:tcMar>
+              <w:top w:w="140" w:type="dxa"/>
+              <w:bottom w:w="140" w:type="dxa"/>
+              <w:left w:w="180" w:type="dxa"/>
+              <w:right w:w="180" w:type="dxa"/>
+            </w:tcMar>
+          </w:tcPr>
+          <w:p>
+            <w:pPr>
+              <w:spacing w:before="80" w:after="120"/>
+            </w:pPr>
+            <w:r>
+              <w:rPr>
+                <w:rFonts w:ascii="Times New Roman" w:hAnsi="Times New Roman"/>
+                <w:b/>
+                <w:color w:val="0F331F"/>
+                <w:sz w:val="28"/>
+              </w:rPr>
+              <w:t>ARCHITECTURAL FLOW: FACULTY DEPARTMENT TRANSFER &amp; DIRECTORY RELOCATION LIFECYCLE</w:t>
+              <w:br/>
+            </w:r>
+          </w:p>
+          <w:p>
+            <w:pPr>
+              <w:spacing w:before="40" w:after="80"/>
+            </w:pPr>
+            <w:r>
+              <w:rPr>
+                <w:rFonts w:ascii="Times New Roman" w:hAnsi="Times New Roman"/>
+                <w:b/>
+                <w:color w:val="0369A1"/>
+                <w:sz w:val="28"/>
+              </w:rPr>
+              <w:t xml:space="preserve">► Step 1: </w:t>
+            </w:r>
+            <w:r>
+              <w:rPr>
+                <w:rFonts w:ascii="Times New Roman" w:hAnsi="Times New Roman"/>
+                <w:color w:val="1E293B"/>
+                <w:sz w:val="28"/>
+              </w:rPr>
+              <w:t>System Admin submits transfer request at /api/admin/faculty/transfer (Old Dept -&gt; New Dept).</w:t>
+            </w:r>
+          </w:p>
+          <w:p>
+            <w:pPr>
+              <w:spacing w:before="0" w:after="0"/>
+              <w:jc w:val="center"/>
+            </w:pPr>
+            <w:r>
+              <w:rPr>
+                <w:rFonts w:ascii="Times New Roman" w:hAnsi="Times New Roman"/>
+                <w:b/>
+                <w:color w:val="0F766E"/>
+                <w:sz w:val="28"/>
+              </w:rPr>
+              <w:t>│</w:t>
+              <w:br/>
+              <w:t>▼</w:t>
+            </w:r>
+          </w:p>
+          <w:p>
+            <w:pPr>
+              <w:spacing w:before="40" w:after="80"/>
+            </w:pPr>
+            <w:r>
+              <w:rPr>
+                <w:rFonts w:ascii="Times New Roman" w:hAnsi="Times New Roman"/>
+                <w:b/>
+                <w:color w:val="0369A1"/>
+                <w:sz w:val="28"/>
+              </w:rPr>
+              <w:t xml:space="preserve">► Step 2: </w:t>
+            </w:r>
+            <w:r>
+              <w:rPr>
+                <w:rFonts w:ascii="Times New Roman" w:hAnsi="Times New Roman"/>
+                <w:color w:val="1E293B"/>
+                <w:sz w:val="28"/>
+              </w:rPr>
+              <w:t>System inserts immutable audit record in staff_department_history.</w:t>
+            </w:r>
+          </w:p>
+          <w:p>
+            <w:pPr>
+              <w:spacing w:before="0" w:after="0"/>
+              <w:jc w:val="center"/>
+            </w:pPr>
+            <w:r>
+              <w:rPr>
+                <w:rFonts w:ascii="Times New Roman" w:hAnsi="Times New Roman"/>
+                <w:b/>
+                <w:color w:val="0F766E"/>
+                <w:sz w:val="28"/>
+              </w:rPr>
+              <w:t>│</w:t>
+              <w:br/>
+              <w:t>▼</w:t>
+            </w:r>
+          </w:p>
+          <w:p>
+            <w:pPr>
+              <w:spacing w:before="40" w:after="80"/>
+            </w:pPr>
+            <w:r>
+              <w:rPr>
+                <w:rFonts w:ascii="Times New Roman" w:hAnsi="Times New Roman"/>
+                <w:b/>
+                <w:color w:val="0369A1"/>
+                <w:sz w:val="28"/>
+              </w:rPr>
+              <w:t xml:space="preserve">► Step 3: </w:t>
+            </w:r>
+            <w:r>
+              <w:rPr>
+                <w:rFonts w:ascii="Times New Roman" w:hAnsi="Times New Roman"/>
+                <w:color w:val="1E293B"/>
+                <w:sz w:val="28"/>
+              </w:rPr>
+              <w:t>System updates Department field in staff_academics and updates admin_dep scope if applicable.</w:t>
+            </w:r>
+          </w:p>
+          <w:p>
+            <w:pPr>
+              <w:spacing w:before="0" w:after="0"/>
+              <w:jc w:val="center"/>
+            </w:pPr>
+            <w:r>
+              <w:rPr>
+                <w:rFonts w:ascii="Times New Roman" w:hAnsi="Times New Roman"/>
+                <w:b/>
+                <w:color w:val="0F766E"/>
+                <w:sz w:val="28"/>
+              </w:rPr>
+              <w:t>│</w:t>
+              <w:br/>
+              <w:t>▼</w:t>
+            </w:r>
+          </w:p>
+          <w:p>
+            <w:pPr>
+              <w:spacing w:before="40" w:after="80"/>
+            </w:pPr>
+            <w:r>
+              <w:rPr>
+                <w:rFonts w:ascii="Times New Roman" w:hAnsi="Times New Roman"/>
+                <w:b/>
+                <w:color w:val="0369A1"/>
+                <w:sz w:val="28"/>
+              </w:rPr>
+              <w:t xml:space="preserve">► Step 4: </w:t>
+            </w:r>
+            <w:r>
+              <w:rPr>
+                <w:rFonts w:ascii="Times New Roman" w:hAnsi="Times New Roman"/>
+                <w:color w:val="1E293B"/>
+                <w:sz w:val="28"/>
+              </w:rPr>
+              <w:t>Disk Mover (moveFacultyDirectory) relocates files: /SREC/OldDept/ID/ ➔ /SREC/NewDept/ID/.</w:t>
+            </w:r>
+          </w:p>
+          <w:p>
+            <w:pPr>
+              <w:spacing w:before="0" w:after="0"/>
+              <w:jc w:val="center"/>
+            </w:pPr>
+            <w:r>
+              <w:rPr>
+                <w:rFonts w:ascii="Times New Roman" w:hAnsi="Times New Roman"/>
+                <w:b/>
+                <w:color w:val="0F766E"/>
+                <w:sz w:val="28"/>
+              </w:rPr>
+              <w:t>│</w:t>
+              <w:br/>
+              <w:t>▼</w:t>
+            </w:r>
+          </w:p>
+          <w:p>
+            <w:pPr>
+              <w:spacing w:before="40" w:after="80"/>
+            </w:pPr>
+            <w:r>
+              <w:rPr>
+                <w:rFonts w:ascii="Times New Roman" w:hAnsi="Times New Roman"/>
+                <w:b/>
+                <w:color w:val="0369A1"/>
+                <w:sz w:val="28"/>
+              </w:rPr>
+              <w:t xml:space="preserve">► Step 5: </w:t>
+            </w:r>
+            <w:r>
+              <w:rPr>
+                <w:rFonts w:ascii="Times New Roman" w:hAnsi="Times New Roman"/>
+                <w:color w:val="1E293B"/>
+                <w:sz w:val="28"/>
+              </w:rPr>
+              <w:t>System remaps document path strings in activity tables and re-queues faculty under New Department HOD.</w:t>
+            </w:r>
+          </w:p>
+        </w:tc>
+      </w:tr>
+    </w:tbl>
     <w:p>
       <w:pPr>
-        <w:spacing w:after="120"/>
+        <w:spacing w:after="160"/>
       </w:pPr>
-      <w:r>
-        <w:rPr>
-          <w:rFonts w:ascii="Times New Roman" w:hAnsi="Times New Roman"/>
-          <w:sz w:val="28"/>
-        </w:rPr>
-        <w:t>To ensure permanent synchronization between system modifications and workflow documentation, the following automated generator scripts must be executed whenever code rules or workflows change:</w:t>
-      </w:r>
-    </w:p>
-    <w:p>
-      <w:pPr>
-        <w:pStyle w:val="ListBullet"/>
-        <w:spacing w:after="80"/>
-      </w:pPr>
-      <w:r>
-        <w:rPr>
-          <w:rFonts w:ascii="Times New Roman" w:hAnsi="Times New Roman"/>
-          <w:b/>
-          <w:color w:val="0F331F"/>
-          <w:sz w:val="28"/>
-        </w:rPr>
-        <w:t xml:space="preserve">Database Schema Reference: </w:t>
-      </w:r>
-      <w:r>
-        <w:rPr>
-          <w:rFonts w:ascii="Times New Roman" w:hAnsi="Times New Roman"/>
-          <w:sz w:val="28"/>
-        </w:rPr>
-        <w:t>python3 scripts/generate_schema_doc.py -&gt; Updates docs/Database_Schema.docx</w:t>
-      </w:r>
-    </w:p>
-    <w:p>
-      <w:pPr>
-        <w:pStyle w:val="ListBullet"/>
-        <w:spacing w:after="80"/>
-      </w:pPr>
-      <w:r>
-        <w:rPr>
-          <w:rFonts w:ascii="Times New Roman" w:hAnsi="Times New Roman"/>
-          <w:b/>
-          <w:color w:val="0F331F"/>
-          <w:sz w:val="28"/>
-        </w:rPr>
-        <w:t xml:space="preserve">System Constraints &amp; Rules: </w:t>
-      </w:r>
-      <w:r>
-        <w:rPr>
-          <w:rFonts w:ascii="Times New Roman" w:hAnsi="Times New Roman"/>
-          <w:sz w:val="28"/>
-        </w:rPr>
-        <w:t>python3 scripts/generate_system_constraints_doc.py -&gt; Updates docs/System_Constraints_and_Portal_Rules.docx</w:t>
-      </w:r>
-    </w:p>
-    <w:p>
-      <w:pPr>
-        <w:pStyle w:val="ListBullet"/>
-        <w:spacing w:after="80"/>
-      </w:pPr>
-      <w:r>
-        <w:rPr>
-          <w:rFonts w:ascii="Times New Roman" w:hAnsi="Times New Roman"/>
-          <w:b/>
-          <w:color w:val="0F331F"/>
-          <w:sz w:val="28"/>
-        </w:rPr>
-        <w:t xml:space="preserve">Technical File Modification Guide: </w:t>
-      </w:r>
-      <w:r>
-        <w:rPr>
-          <w:rFonts w:ascii="Times New Roman" w:hAnsi="Times New Roman"/>
-          <w:sz w:val="28"/>
-        </w:rPr>
-        <w:t>python3 scripts/generate_tech_file_guide_doc.py -&gt; Updates docs/Technical_Constraints_and_File_Modification_Guide.docx</w:t>
-      </w:r>
-    </w:p>
-    <w:p>
-      <w:pPr>
-        <w:pStyle w:val="ListBullet"/>
-        <w:spacing w:after="80"/>
-      </w:pPr>
-      <w:r>
-        <w:rPr>
-          <w:rFonts w:ascii="Times New Roman" w:hAnsi="Times New Roman"/>
-          <w:b/>
-          <w:color w:val="0F331F"/>
-          <w:sz w:val="28"/>
-        </w:rPr>
-        <w:t xml:space="preserve">Complete 3-Portal Workflow Guide: </w:t>
-      </w:r>
-      <w:r>
-        <w:rPr>
-          <w:rFonts w:ascii="Times New Roman" w:hAnsi="Times New Roman"/>
-          <w:sz w:val="28"/>
-        </w:rPr>
-        <w:t>python3 scripts/generate_portal_workflows_doc.py -&gt; Updates docs/Complete_3_Portals_Workflow_Guide.docx</w:t>
-      </w:r>
     </w:p>
     <w:sectPr>
       <w:footerReference w:type="default" r:id="rId9"/>

</xml_diff>

<commit_message>
Resize SNR Sons Trust logo to match college logo visual width across all document headers
</commit_message>
<xml_diff>
--- a/docs/Complete_3_Portals_Workflow_Guide.docx
+++ b/docs/Complete_3_Portals_Workflow_Guide.docx
@@ -71,7 +71,7 @@
             <w:r>
               <w:drawing>
                 <wp:inline xmlns:a="http://schemas.openxmlformats.org/drawingml/2006/main" xmlns:pic="http://schemas.openxmlformats.org/drawingml/2006/picture">
-                  <wp:extent cx="1044480" cy="777240"/>
+                  <wp:extent cx="2286000" cy="1701105"/>
                   <wp:docPr id="2" name="Picture 2"/>
                   <wp:cNvGraphicFramePr>
                     <a:graphicFrameLocks noChangeAspect="1"/>
@@ -92,7 +92,7 @@
                         <pic:spPr>
                           <a:xfrm>
                             <a:off x="0" y="0"/>
-                            <a:ext cx="1044480" cy="777240"/>
+                            <a:ext cx="2286000" cy="1701105"/>
                           </a:xfrm>
                           <a:prstGeom prst="rect"/>
                         </pic:spPr>

</xml_diff>

<commit_message>
Replace dual logo table with official SREC header banner (srec-header-banner.png) matching PDF report header across all 4 Word documents
</commit_message>
<xml_diff>
--- a/docs/Complete_3_Portals_Workflow_Guide.docx
+++ b/docs/Complete_3_Portals_Workflow_Guide.docx
@@ -2,143 +2,49 @@
 <file path=word/document.xml><?xml version="1.0" encoding="utf-8"?>
 <w:document xmlns:wpc="http://schemas.microsoft.com/office/word/2010/wordprocessingCanvas" xmlns:mo="http://schemas.microsoft.com/office/mac/office/2008/main" xmlns:mc="http://schemas.openxmlformats.org/markup-compatibility/2006" xmlns:mv="urn:schemas-microsoft-com:mac:vml" xmlns:o="urn:schemas-microsoft-com:office:office" xmlns:r="http://schemas.openxmlformats.org/officeDocument/2006/relationships" xmlns:m="http://schemas.openxmlformats.org/officeDocument/2006/math" xmlns:v="urn:schemas-microsoft-com:vml" xmlns:wp14="http://schemas.microsoft.com/office/word/2010/wordprocessingDrawing" xmlns:wp="http://schemas.openxmlformats.org/drawingml/2006/wordprocessingDrawing" xmlns:w10="urn:schemas-microsoft-com:office:word" xmlns:w="http://schemas.openxmlformats.org/wordprocessingml/2006/main" xmlns:w14="http://schemas.microsoft.com/office/word/2010/wordml" xmlns:wpg="http://schemas.microsoft.com/office/word/2010/wordprocessingGroup" xmlns:wpi="http://schemas.microsoft.com/office/word/2010/wordprocessingInk" xmlns:wne="http://schemas.microsoft.com/office/word/2006/wordml" xmlns:wps="http://schemas.microsoft.com/office/word/2010/wordprocessingShape" mc:Ignorable="w14 wp14">
   <w:body>
-    <w:tbl>
-      <w:tblPr>
-        <w:tblW w:type="auto" w:w="0"/>
-        <w:jc w:val="center"/>
-        <w:tblLayout w:type="fixed"/>
-        <w:tblLook w:firstColumn="1" w:firstRow="1" w:lastColumn="0" w:lastRow="0" w:noHBand="0" w:noVBand="1" w:val="04A0"/>
-      </w:tblPr>
-      <w:tblGrid>
-        <w:gridCol w:w="5040"/>
-        <w:gridCol w:w="5040"/>
-      </w:tblGrid>
-      <w:tr>
-        <w:tc>
-          <w:tcPr>
-            <w:tcW w:type="dxa" w:w="5040"/>
-          </w:tcPr>
-          <w:p>
-            <w:pPr>
-              <w:spacing w:before="0" w:after="0"/>
-              <w:jc w:val="left"/>
-            </w:pPr>
-            <w:r>
-              <w:drawing>
-                <wp:inline xmlns:a="http://schemas.openxmlformats.org/drawingml/2006/main" xmlns:pic="http://schemas.openxmlformats.org/drawingml/2006/picture">
-                  <wp:extent cx="2464273" cy="777240"/>
-                  <wp:docPr id="1" name="Picture 1"/>
-                  <wp:cNvGraphicFramePr>
-                    <a:graphicFrameLocks noChangeAspect="1"/>
-                  </wp:cNvGraphicFramePr>
-                  <a:graphic>
-                    <a:graphicData uri="http://schemas.openxmlformats.org/drawingml/2006/picture">
-                      <pic:pic>
-                        <pic:nvPicPr>
-                          <pic:cNvPr id="0" name="report-logo-left.png"/>
-                          <pic:cNvPicPr/>
-                        </pic:nvPicPr>
-                        <pic:blipFill>
-                          <a:blip r:embed="rId10"/>
-                          <a:stretch>
-                            <a:fillRect/>
-                          </a:stretch>
-                        </pic:blipFill>
-                        <pic:spPr>
-                          <a:xfrm>
-                            <a:off x="0" y="0"/>
-                            <a:ext cx="2464273" cy="777240"/>
-                          </a:xfrm>
-                          <a:prstGeom prst="rect"/>
-                        </pic:spPr>
-                      </pic:pic>
-                    </a:graphicData>
-                  </a:graphic>
-                </wp:inline>
-              </w:drawing>
-            </w:r>
-          </w:p>
-        </w:tc>
-        <w:tc>
-          <w:tcPr>
-            <w:tcW w:type="dxa" w:w="5040"/>
-          </w:tcPr>
-          <w:p>
-            <w:pPr>
-              <w:spacing w:before="0" w:after="0"/>
-              <w:jc w:val="right"/>
-            </w:pPr>
-            <w:r>
-              <w:drawing>
-                <wp:inline xmlns:a="http://schemas.openxmlformats.org/drawingml/2006/main" xmlns:pic="http://schemas.openxmlformats.org/drawingml/2006/picture">
-                  <wp:extent cx="2286000" cy="1701105"/>
-                  <wp:docPr id="2" name="Picture 2"/>
-                  <wp:cNvGraphicFramePr>
-                    <a:graphicFrameLocks noChangeAspect="1"/>
-                  </wp:cNvGraphicFramePr>
-                  <a:graphic>
-                    <a:graphicData uri="http://schemas.openxmlformats.org/drawingml/2006/picture">
-                      <pic:pic>
-                        <pic:nvPicPr>
-                          <pic:cNvPr id="0" name="report-logo-right.png"/>
-                          <pic:cNvPicPr/>
-                        </pic:nvPicPr>
-                        <pic:blipFill>
-                          <a:blip r:embed="rId11"/>
-                          <a:stretch>
-                            <a:fillRect/>
-                          </a:stretch>
-                        </pic:blipFill>
-                        <pic:spPr>
-                          <a:xfrm>
-                            <a:off x="0" y="0"/>
-                            <a:ext cx="2286000" cy="1701105"/>
-                          </a:xfrm>
-                          <a:prstGeom prst="rect"/>
-                        </pic:spPr>
-                      </pic:pic>
-                    </a:graphicData>
-                  </a:graphic>
-                </wp:inline>
-              </w:drawing>
-            </w:r>
-          </w:p>
-        </w:tc>
-      </w:tr>
-    </w:tbl>
     <w:p>
       <w:pPr>
-        <w:spacing w:before="120" w:after="40"/>
+        <w:spacing w:before="0" w:after="120"/>
         <w:jc w:val="center"/>
       </w:pPr>
       <w:r>
-        <w:rPr>
-          <w:rFonts w:ascii="Times New Roman" w:hAnsi="Times New Roman"/>
-          <w:b/>
-          <w:color w:val="0F331F"/>
-          <w:sz w:val="36"/>
-        </w:rPr>
-        <w:t>SRI RAMAKRISHNA ENGINEERING COLLEGE</w:t>
+        <w:drawing>
+          <wp:inline xmlns:a="http://schemas.openxmlformats.org/drawingml/2006/main" xmlns:pic="http://schemas.openxmlformats.org/drawingml/2006/picture">
+            <wp:extent cx="6400800" cy="1162645"/>
+            <wp:docPr id="1" name="Picture 1"/>
+            <wp:cNvGraphicFramePr>
+              <a:graphicFrameLocks noChangeAspect="1"/>
+            </wp:cNvGraphicFramePr>
+            <a:graphic>
+              <a:graphicData uri="http://schemas.openxmlformats.org/drawingml/2006/picture">
+                <pic:pic>
+                  <pic:nvPicPr>
+                    <pic:cNvPr id="0" name="srec-header-banner.png"/>
+                    <pic:cNvPicPr/>
+                  </pic:nvPicPr>
+                  <pic:blipFill>
+                    <a:blip r:embed="rId10"/>
+                    <a:stretch>
+                      <a:fillRect/>
+                    </a:stretch>
+                  </pic:blipFill>
+                  <pic:spPr>
+                    <a:xfrm>
+                      <a:off x="0" y="0"/>
+                      <a:ext cx="6400800" cy="1162645"/>
+                    </a:xfrm>
+                    <a:prstGeom prst="rect"/>
+                  </pic:spPr>
+                </pic:pic>
+              </a:graphicData>
+            </a:graphic>
+          </wp:inline>
+        </w:drawing>
       </w:r>
     </w:p>
     <w:p>
       <w:pPr>
-        <w:spacing w:before="0" w:after="80"/>
-        <w:jc w:val="center"/>
-      </w:pPr>
-      <w:r>
-        <w:rPr>
-          <w:rFonts w:ascii="Times New Roman" w:hAnsi="Times New Roman"/>
-          <w:i/>
-          <w:color w:val="475569"/>
-          <w:sz w:val="24"/>
-        </w:rPr>
-        <w:t>[An Autonomous Institution | Re-Accredited by NAAC with 'A+' Grade]</w:t>
-      </w:r>
-    </w:p>
-    <w:p>
-      <w:pPr>
-        <w:spacing w:before="0" w:after="280"/>
+        <w:spacing w:before="0" w:after="200"/>
         <w:jc w:val="center"/>
       </w:pPr>
       <w:r>

</xml_diff>

<commit_message>
feat(appraisal): Add bulk digital sign and approval for HOD and System Admin logins
</commit_message>
<xml_diff>
--- a/docs/Complete_3_Portals_Workflow_Guide.docx
+++ b/docs/Complete_3_Portals_Workflow_Guide.docx
@@ -82,7 +82,7 @@
           <w:color w:val="64748B"/>
           <w:sz w:val="22"/>
         </w:rPr>
-        <w:t>Document Generated: August 16, 2026 | Version 3.0 | Status: Operational Workflow Specification</w:t>
+        <w:t>Document Generated: August 17, 2026 | Version 3.0 | Status: Operational Workflow Specification</w:t>
       </w:r>
     </w:p>
     <w:p>
@@ -873,14 +873,14 @@
           <w:color w:val="0F331F"/>
           <w:sz w:val="28"/>
         </w:rPr>
-        <w:t xml:space="preserve">Workflow 2.3 — HOD Annual Appraisal Review &amp; Part-by-Part Evaluation: </w:t>
+        <w:t xml:space="preserve">Workflow 2.3 — HOD Annual Appraisal Review, Part-by-Part Evaluation &amp; Bulk Sign/Approval: </w:t>
       </w:r>
       <w:r>
         <w:rPr>
           <w:rFonts w:ascii="Times New Roman" w:hAnsi="Times New Roman"/>
           <w:sz w:val="28"/>
         </w:rPr>
-        <w:t>HOD opens Appraisal Form (/appraisal) and monitors pending department submissions (status === 'Submitted'). Opens Auto-Mapped Activity Verification Panel and clicks 👁️ View Proof next to publications, grants, patents, certifications, and events to inspect original uploaded evidence. Opens evaluation modal, enters HOD evaluated scores for PART A, B, C, D, adds feedback remarks, and clicks 'Approve &amp; Forward to Principal/HR'. Form status updates to 'HOD Approved'.</w:t>
+        <w:t>HOD opens Appraisal Form (/appraisal) and monitors pending department submissions (status === 'Submitted'). Opens Auto-Mapped Activity Verification Panel and clicks 👁️ View Proof next to publications, grants, patents, certifications, and events to inspect original uploaded evidence. For individual reviews, opens evaluation modal, enters HOD evaluated scores for PART A, B, C, D, adds feedback remarks, and clicks 'Approve &amp; Forward to Principal/HR'. For batch actions, HOD selects multiple or all pending forms via checkboxes, clicks '✍️ Sign &amp; Approve Selected', inspects the digital signature credentials (signer name, ISO timestamp, client IP), confirms bulk remarks, and submits in one step. Form status updates to 'HOD Approved' and notification emails are dispatched to faculty.</w:t>
       </w:r>
     </w:p>
     <w:p>
@@ -917,7 +917,7 @@
           <w:color w:val="0369A1"/>
           <w:sz w:val="28"/>
         </w:rPr>
-        <w:t>❖ Workflow Architecture Diagram: HOD Part-by-Part Appraisal Verification &amp; Score Evaluation</w:t>
+        <w:t>❖ Workflow Architecture Diagram: HOD Part-by-Part Appraisal Verification &amp; Bulk Score Evaluation</w:t>
       </w:r>
     </w:p>
     <w:tbl>
@@ -961,7 +961,7 @@
                 <w:color w:val="0F331F"/>
                 <w:sz w:val="28"/>
               </w:rPr>
-              <w:t>ARCHITECTURAL FLOW: HOD PART-BY-PART APPRAISAL VERIFICATION &amp; SCORE EVALUATION</w:t>
+              <w:t>ARCHITECTURAL FLOW: HOD PART-BY-PART APPRAISAL VERIFICATION &amp; BULK SCORE EVALUATION</w:t>
               <w:br/>
             </w:r>
           </w:p>
@@ -1023,7 +1023,7 @@
                 <w:color w:val="1E293B"/>
                 <w:sz w:val="28"/>
               </w:rPr>
-              <w:t>HOD opens Auto-Mapped Activity Verification Panel and clicks 👁️ View Proof to verify uploaded evidence.</w:t>
+              <w:t>HOD verifies uploaded evidence via 👁️ View Proof or selects multiple pending forms in bulk.</w:t>
             </w:r>
           </w:p>
           <w:p>
@@ -1062,7 +1062,7 @@
                 <w:color w:val="1E293B"/>
                 <w:sz w:val="28"/>
               </w:rPr>
-              <w:t>HOD inputs evaluated marks for PART A, PART B, PART C, and PART D based on institutional rubric.</w:t>
+              <w:t>HOD executes individual Part-by-Part evaluation or batch digital signing via /api/faculty/appraisals/bulk-hod-sign-approve.</w:t>
             </w:r>
           </w:p>
           <w:p>
@@ -1101,7 +1101,7 @@
                 <w:color w:val="1E293B"/>
                 <w:sz w:val="28"/>
               </w:rPr>
-              <w:t>HOD adds qualitative evaluation remarks and submits form.</w:t>
+              <w:t>System records official digital signature timestamps, IP address, and HOD remarks.</w:t>
             </w:r>
           </w:p>
           <w:p>
@@ -1175,7 +1175,7 @@
           <w:rFonts w:ascii="Times New Roman" w:hAnsi="Times New Roman"/>
           <w:sz w:val="28"/>
         </w:rPr>
-        <w:t>The System Admin &amp; Executive Portal equips Principal, HR, and System Administrators with institution-wide administration, full CRUD control, dynamic form building, appraisal rubric customization, final executive appraisal approval, and faculty transfer execution.</w:t>
+        <w:t>The System Admin &amp; Executive Portal equips Principal, HR, and System Administrators with institution-wide administration, full CRUD control, dynamic form building, appraisal rubric customization, final executive appraisal approval (individual &amp; bulk), and faculty transfer execution.</w:t>
       </w:r>
     </w:p>
     <w:p>
@@ -1278,14 +1278,14 @@
           <w:color w:val="B91C1C"/>
           <w:sz w:val="28"/>
         </w:rPr>
-        <w:t xml:space="preserve">Workflow 3.5 — Final Executive Appraisal Approval: </w:t>
+        <w:t xml:space="preserve">Workflow 3.5 — Final Executive Appraisal Approval &amp; Bulk Sign-Off: </w:t>
       </w:r>
       <w:r>
         <w:rPr>
           <w:rFonts w:ascii="Times New Roman" w:hAnsi="Times New Roman"/>
           <w:sz w:val="28"/>
         </w:rPr>
-        <w:t>Executive Admin reviews HOD-approved submissions (status === 'HOD Approved'). Inspects auto-mapped proof documents (👁️ View Proof), inputs final executive scores and remarks, and clicks 'Final Approve'. Form status updates to 'Final Approved'.</w:t>
+        <w:t>Executive Admin reviews HOD-approved submissions (status === 'HOD Approved') or submitted forms across all departments. Inspects auto-mapped proof documents (👁️ View Proof), inputs final executive scores and remarks, and clicks 'Final Approve'. For bulk approval, Admin selects multiple submissions, opens Bulk Sign &amp; Approve Modal, selects approval mode (Auto, Final Executive Approval, or HOD Stage), applies digital signatures, and finalizes all selected records in one click. Form status updates to 'Final Approved' with automated email confirmations sent to faculty.</w:t>
       </w:r>
     </w:p>
     <w:p>

</xml_diff>

<commit_message>
feat: Add 1-Click AI CV & Bio-Data Generator and PWA Web Push Notifications
</commit_message>
<xml_diff>
--- a/docs/Complete_3_Portals_Workflow_Guide.docx
+++ b/docs/Complete_3_Portals_Workflow_Guide.docx
@@ -542,6 +542,50 @@
           <w:sz w:val="28"/>
         </w:rPr>
         <w:t>Faculty opens Reports (/reports) to generate and download self academic dossier in PDF, Excel, or ZIP format.</w:t>
+      </w:r>
+    </w:p>
+    <w:p>
+      <w:pPr>
+        <w:pStyle w:val="ListBullet"/>
+        <w:spacing w:after="80"/>
+      </w:pPr>
+      <w:r>
+        <w:rPr>
+          <w:rFonts w:ascii="Times New Roman" w:hAnsi="Times New Roman"/>
+          <w:b/>
+          <w:color w:val="0369A1"/>
+          <w:sz w:val="28"/>
+        </w:rPr>
+        <w:t xml:space="preserve">Workflow 1.8 — 1-Click AI CV &amp; Bio-Data Generator: </w:t>
+      </w:r>
+      <w:r>
+        <w:rPr>
+          <w:rFonts w:ascii="Times New Roman" w:hAnsi="Times New Roman"/>
+          <w:sz w:val="28"/>
+        </w:rPr>
+        <w:t>Faculty opens /cv-generator to generate comprehensive, professional resumes. Selects from 3 standard formats (SREC Official Letterhead, AICTE/Anna University Statutory Format, Modern Technical Europass). Chooses AI Summary style (Executive, Research, Teaching), customizes section visibility toggles, and exports high-definition vector PDFs or prints directly.</w:t>
+      </w:r>
+    </w:p>
+    <w:p>
+      <w:pPr>
+        <w:pStyle w:val="ListBullet"/>
+        <w:spacing w:after="80"/>
+      </w:pPr>
+      <w:r>
+        <w:rPr>
+          <w:rFonts w:ascii="Times New Roman" w:hAnsi="Times New Roman"/>
+          <w:b/>
+          <w:color w:val="0369A1"/>
+          <w:sz w:val="28"/>
+        </w:rPr>
+        <w:t xml:space="preserve">Workflow 1.9 — Real-Time Web Push Notification Enrollment: </w:t>
+      </w:r>
+      <w:r>
+        <w:rPr>
+          <w:rFonts w:ascii="Times New Roman" w:hAnsi="Times New Roman"/>
+          <w:sz w:val="28"/>
+        </w:rPr>
+        <w:t>Faculty clicks Notification Bell in Navbar to enable browser/mobile push alerts via Service Worker. Receives instant real-time alerts on appraisal status approvals, bulk sign-offs, revision requests, and administrative circulars with zero SMS latency.</w:t>
       </w:r>
     </w:p>
     <w:p>

</xml_diff>

<commit_message>
fix(admin): Restrict Certificates option to system admin and add automatic profile pic white background standardization
</commit_message>
<xml_diff>
--- a/docs/Complete_3_Portals_Workflow_Guide.docx
+++ b/docs/Complete_3_Portals_Workflow_Guide.docx
@@ -82,7 +82,7 @@
           <w:color w:val="64748B"/>
           <w:sz w:val="22"/>
         </w:rPr>
-        <w:t>Document Generated: August 17, 2026 | Version 3.0 | Status: Operational Workflow Specification</w:t>
+        <w:t>Document Generated: August 18, 2026 | Version 3.0 | Status: Operational Workflow Specification</w:t>
       </w:r>
     </w:p>
     <w:p>
@@ -590,6 +590,28 @@
     </w:p>
     <w:p>
       <w:pPr>
+        <w:pStyle w:val="ListBullet"/>
+        <w:spacing w:after="80"/>
+      </w:pPr>
+      <w:r>
+        <w:rPr>
+          <w:rFonts w:ascii="Times New Roman" w:hAnsi="Times New Roman"/>
+          <w:b/>
+          <w:color w:val="0369A1"/>
+          <w:sz w:val="28"/>
+        </w:rPr>
+        <w:t xml:space="preserve">Workflow 1.10 — Profile Picture Upload &amp; Automated White Background Standardization: </w:t>
+      </w:r>
+      <w:r>
+        <w:rPr>
+          <w:rFonts w:ascii="Times New Roman" w:hAnsi="Times New Roman"/>
+          <w:sz w:val="28"/>
+        </w:rPr>
+        <w:t>Faculty accesses Settings &amp; Security (/settings) to upload a new profile picture (JPG/PNG). The backend automatically processes the image via AI portrait segmentation (rembg) to isolate the portrait and standardize the background to pure solid white (#FFFFFF), automatically updating the avatar across Navbar, Dashboard, and CV.</w:t>
+      </w:r>
+    </w:p>
+    <w:p>
+      <w:pPr>
         <w:keepNext/>
         <w:spacing w:before="320" w:after="120"/>
       </w:pPr>
@@ -880,7 +902,7 @@
           <w:rFonts w:ascii="Times New Roman" w:hAnsi="Times New Roman"/>
           <w:sz w:val="28"/>
         </w:rPr>
-        <w:t>HOD/Dept Admin accesses Faculty Directory (/admin/faculty) to view department faculty listings. Opens Personal Details (/profile/personal) to inspect DOB, Gender, Mobile, PAN, Aadhaar, and Address. All input fields are explicitly disabled (disabled={auth.role === 'dept_admin'}) to prevent unauthorized editing.</w:t>
+        <w:t>HOD/Dept Admin accesses Faculty Directory (/admin/faculty) to view department faculty listings with access to 'View Dossier' and 'Docs' ZIP downloads. HR service certificates (Experience, Salary, Relieving) are restricted exclusively to System/Executive Admins. Opens Personal Details (/profile/personal) to inspect DOB, Gender, Mobile, PAN, Aadhaar, and Address. All input fields are explicitly disabled (disabled={auth.role === 'dept_admin'}) to prevent unauthorized editing.</w:t>
       </w:r>
     </w:p>
     <w:p>

</xml_diff>

<commit_message>
feat: SREC FIS V3.0 AI-Assisted Data Entry, Smart Classification, Duplicate Detection & Internal Co-Author Mapping
</commit_message>
<xml_diff>
--- a/docs/Complete_3_Portals_Workflow_Guide.docx
+++ b/docs/Complete_3_Portals_Workflow_Guide.docx
@@ -44,7 +44,7 @@
     </w:p>
     <w:p>
       <w:pPr>
-        <w:spacing w:before="0" w:after="200"/>
+        <w:spacing w:before="0" w:after="160"/>
         <w:jc w:val="center"/>
       </w:pPr>
       <w:r>
@@ -52,14 +52,14 @@
           <w:rFonts w:ascii="Times New Roman" w:hAnsi="Times New Roman"/>
           <w:b/>
           <w:color w:val="0284C7"/>
-          <w:sz w:val="28"/>
+          <w:sz w:val="26"/>
         </w:rPr>
         <w:t>FACULTY INFORMATION SYSTEM (SREC FIS V3.0)</w:t>
       </w:r>
     </w:p>
     <w:p>
       <w:pPr>
-        <w:spacing w:before="120" w:after="120"/>
+        <w:spacing w:before="80" w:after="80"/>
       </w:pPr>
       <w:r>
         <w:rPr>
@@ -68,23 +68,76 @@
           <w:color w:val="0F172A"/>
           <w:sz w:val="32"/>
         </w:rPr>
-        <w:t>COMPLETE &amp; DETAILED WORKFLOW GUIDE FOR ALL 3 PORTALS</w:t>
+        <w:t>COMPLETE STRUCTURAL WORKFLOW SPECIFICATION FOR ALL 3 PORTALS</w:t>
       </w:r>
     </w:p>
     <w:p>
       <w:pPr>
-        <w:spacing w:before="0" w:after="280"/>
+        <w:spacing w:before="0" w:after="240"/>
       </w:pPr>
       <w:r>
         <w:rPr>
           <w:rFonts w:ascii="Times New Roman" w:hAnsi="Times New Roman"/>
           <w:i/>
           <w:color w:val="64748B"/>
-          <w:sz w:val="22"/>
+          <w:sz w:val="20"/>
         </w:rPr>
-        <w:t>Document Generated: August 18, 2026 | Version 3.0 | Status: Operational Workflow Specification</w:t>
+        <w:t>Document Generated: August 18, 2026 | Version 3.0 | Status: Active Synchronized Workflow Specification</w:t>
       </w:r>
     </w:p>
+    <w:tbl>
+      <w:tblPr>
+        <w:tblW w:type="auto" w:w="0"/>
+        <w:jc w:val="center"/>
+        <w:tblLayout w:type="fixed"/>
+        <w:tblLook w:firstColumn="1" w:firstRow="1" w:lastColumn="0" w:lastRow="0" w:noHBand="0" w:noVBand="1" w:val="04A0"/>
+        <w:tblBorders>
+          <w:top w:val="single" w:sz="6" w:space="0" w:color="0284C7"/>
+          <w:left w:val="single" w:sz="6" w:space="0" w:color="0284C7"/>
+          <w:bottom w:val="single" w:sz="6" w:space="0" w:color="0284C7"/>
+          <w:right w:val="single" w:sz="6" w:space="0" w:color="0284C7"/>
+          <w:insideH w:val="single" w:sz="6" w:space="0" w:color="0284C7"/>
+          <w:insideV w:val="none"/>
+        </w:tblBorders>
+      </w:tblPr>
+      <w:tblGrid>
+        <w:gridCol w:w="10080"/>
+      </w:tblGrid>
+      <w:tr>
+        <w:tc>
+          <w:tcPr>
+            <w:tcW w:type="dxa" w:w="10080"/>
+            <w:shd w:val="clear" w:color="auto" w:fill="EFF6FF"/>
+            <w:tcMar>
+              <w:top w:w="100" w:type="dxa"/>
+              <w:bottom w:w="100" w:type="dxa"/>
+              <w:left w:w="140" w:type="dxa"/>
+              <w:right w:w="140" w:type="dxa"/>
+            </w:tcMar>
+          </w:tcPr>
+          <w:p>
+            <w:r>
+              <w:rPr>
+                <w:rFonts w:ascii="Times New Roman" w:hAnsi="Times New Roman"/>
+                <w:b/>
+                <w:color w:val="0F172A"/>
+                <w:sz w:val="22"/>
+              </w:rPr>
+              <w:t>📌 AUTOMATIC LIVING DOCUMENTATION NOTICE</w:t>
+              <w:br/>
+            </w:r>
+            <w:r>
+              <w:rPr>
+                <w:rFonts w:ascii="Times New Roman" w:hAnsi="Times New Roman"/>
+                <w:color w:val="334155"/>
+                <w:sz w:val="20"/>
+              </w:rPr>
+              <w:t>This single comprehensive Word document is automatically updated and regenerated whenever changes are made to user workflows, portal structures, approval lifecycles, or role permissions. The backend server automatically synchronizes this document upon system initialization and via automated CLI commands (`npm run update-docs`).</w:t>
+            </w:r>
+          </w:p>
+        </w:tc>
+      </w:tr>
+    </w:tbl>
     <w:p>
       <w:pPr>
         <w:spacing w:after="80"/>
@@ -102,25 +155,785 @@
           <w:color w:val="0F172A"/>
           <w:sz w:val="32"/>
         </w:rPr>
-        <w:t>1. System Architectural Overview &amp; Authentication Workflow</w:t>
+        <w:t>1. System Architectural Overview &amp; Authentication Framework</w:t>
       </w:r>
     </w:p>
     <w:p>
       <w:pPr>
-        <w:spacing w:after="160"/>
+        <w:spacing w:after="120"/>
       </w:pPr>
       <w:r>
         <w:rPr>
           <w:rFonts w:ascii="Times New Roman" w:hAnsi="Times New Roman"/>
-          <w:sz w:val="28"/>
+          <w:sz w:val="22"/>
         </w:rPr>
-        <w:t>The SREC FIS V3.0 system is designed with a multi-role, modular architecture servicing three distinct user portals: (1) Faculty Portal, (2) Department Admin / HOD Portal, and (3) System Admin &amp; Executive Portal. Authentication is centralized via JWT (JSON Web Token) tokens issued upon authenticating at /api/auth/login.</w:t>
+        <w:t>The SREC FIS V3.0 platform is engineered as a secure, high-performance, multi-tenant academic ERP designed to manage the entire lifecycle of faculty records, research outputs, institutional duties, accreditation metrics, and performance evaluations. The system operates across three distinct portals governed by a strict Role-Based Access Control (RBAC) matrix and centralized JSON Web Token (JWT) authentication.</w:t>
       </w:r>
     </w:p>
     <w:p>
       <w:pPr>
         <w:keepNext/>
-        <w:spacing w:before="320" w:after="120"/>
+        <w:spacing w:before="240" w:after="120"/>
+      </w:pPr>
+      <w:r>
+        <w:rPr>
+          <w:rFonts w:ascii="Times New Roman" w:hAnsi="Times New Roman"/>
+          <w:b/>
+          <w:color w:val="0369A1"/>
+          <w:sz w:val="28"/>
+        </w:rPr>
+        <w:t>1.1 Role-Based Access Control (RBAC) Matrix</w:t>
+      </w:r>
+    </w:p>
+    <w:tbl>
+      <w:tblPr>
+        <w:tblW w:type="auto" w:w="0"/>
+        <w:jc w:val="center"/>
+        <w:tblLayout w:type="fixed"/>
+        <w:tblLook w:firstColumn="1" w:firstRow="1" w:lastColumn="0" w:lastRow="0" w:noHBand="0" w:noVBand="1" w:val="04A0"/>
+        <w:tblBorders>
+          <w:top w:val="single" w:sz="4" w:space="0" w:color="CBD5E1"/>
+          <w:left w:val="single" w:sz="4" w:space="0" w:color="CBD5E1"/>
+          <w:bottom w:val="single" w:sz="4" w:space="0" w:color="CBD5E1"/>
+          <w:right w:val="single" w:sz="4" w:space="0" w:color="CBD5E1"/>
+          <w:insideH w:val="single" w:sz="4" w:space="0" w:color="CBD5E1"/>
+          <w:insideV w:val="none"/>
+        </w:tblBorders>
+      </w:tblPr>
+      <w:tblGrid>
+        <w:gridCol w:w="2520"/>
+        <w:gridCol w:w="2520"/>
+        <w:gridCol w:w="2520"/>
+        <w:gridCol w:w="2520"/>
+      </w:tblGrid>
+      <w:tr>
+        <w:tc>
+          <w:tcPr>
+            <w:tcW w:type="dxa" w:w="2016"/>
+            <w:shd w:val="clear" w:color="auto" w:fill="0F331F"/>
+            <w:tcMar>
+              <w:top w:w="100" w:type="dxa"/>
+              <w:bottom w:w="100" w:type="dxa"/>
+              <w:left w:w="120" w:type="dxa"/>
+              <w:right w:w="120" w:type="dxa"/>
+            </w:tcMar>
+          </w:tcPr>
+          <w:p>
+            <w:pPr>
+              <w:jc w:val="left"/>
+            </w:pPr>
+            <w:r>
+              <w:rPr>
+                <w:rFonts w:ascii="Times New Roman" w:hAnsi="Times New Roman"/>
+                <w:b/>
+                <w:color w:val="FFFFFF"/>
+                <w:sz w:val="22"/>
+              </w:rPr>
+              <w:t>User Role / Claim</w:t>
+            </w:r>
+          </w:p>
+        </w:tc>
+        <w:tc>
+          <w:tcPr>
+            <w:tcW w:type="dxa" w:w="2304"/>
+            <w:shd w:val="clear" w:color="auto" w:fill="0F331F"/>
+            <w:tcMar>
+              <w:top w:w="100" w:type="dxa"/>
+              <w:bottom w:w="100" w:type="dxa"/>
+              <w:left w:w="120" w:type="dxa"/>
+              <w:right w:w="120" w:type="dxa"/>
+            </w:tcMar>
+          </w:tcPr>
+          <w:p>
+            <w:pPr>
+              <w:jc w:val="left"/>
+            </w:pPr>
+            <w:r>
+              <w:rPr>
+                <w:rFonts w:ascii="Times New Roman" w:hAnsi="Times New Roman"/>
+                <w:b/>
+                <w:color w:val="FFFFFF"/>
+                <w:sz w:val="22"/>
+              </w:rPr>
+              <w:t>Portal Access</w:t>
+            </w:r>
+          </w:p>
+        </w:tc>
+        <w:tc>
+          <w:tcPr>
+            <w:tcW w:type="dxa" w:w="2016"/>
+            <w:shd w:val="clear" w:color="auto" w:fill="0F331F"/>
+            <w:tcMar>
+              <w:top w:w="100" w:type="dxa"/>
+              <w:bottom w:w="100" w:type="dxa"/>
+              <w:left w:w="120" w:type="dxa"/>
+              <w:right w:w="120" w:type="dxa"/>
+            </w:tcMar>
+          </w:tcPr>
+          <w:p>
+            <w:pPr>
+              <w:jc w:val="left"/>
+            </w:pPr>
+            <w:r>
+              <w:rPr>
+                <w:rFonts w:ascii="Times New Roman" w:hAnsi="Times New Roman"/>
+                <w:b/>
+                <w:color w:val="FFFFFF"/>
+                <w:sz w:val="22"/>
+              </w:rPr>
+              <w:t>Permission Scope</w:t>
+            </w:r>
+          </w:p>
+        </w:tc>
+        <w:tc>
+          <w:tcPr>
+            <w:tcW w:type="dxa" w:w="3744"/>
+            <w:shd w:val="clear" w:color="auto" w:fill="0F331F"/>
+            <w:tcMar>
+              <w:top w:w="100" w:type="dxa"/>
+              <w:bottom w:w="100" w:type="dxa"/>
+              <w:left w:w="120" w:type="dxa"/>
+              <w:right w:w="120" w:type="dxa"/>
+            </w:tcMar>
+          </w:tcPr>
+          <w:p>
+            <w:pPr>
+              <w:jc w:val="left"/>
+            </w:pPr>
+            <w:r>
+              <w:rPr>
+                <w:rFonts w:ascii="Times New Roman" w:hAnsi="Times New Roman"/>
+                <w:b/>
+                <w:color w:val="FFFFFF"/>
+                <w:sz w:val="22"/>
+              </w:rPr>
+              <w:t>Primary Functional Capabilities</w:t>
+            </w:r>
+          </w:p>
+        </w:tc>
+      </w:tr>
+      <w:tr>
+        <w:tc>
+          <w:tcPr>
+            <w:tcW w:type="dxa" w:w="2016"/>
+            <w:shd w:val="clear" w:color="auto" w:fill="FFFFFF"/>
+            <w:tcMar>
+              <w:top w:w="80" w:type="dxa"/>
+              <w:bottom w:w="80" w:type="dxa"/>
+              <w:left w:w="120" w:type="dxa"/>
+              <w:right w:w="120" w:type="dxa"/>
+            </w:tcMar>
+          </w:tcPr>
+          <w:p>
+            <w:pPr>
+              <w:jc w:val="left"/>
+            </w:pPr>
+            <w:r>
+              <w:rPr>
+                <w:rFonts w:ascii="Times New Roman" w:hAnsi="Times New Roman"/>
+                <w:color w:val="1E293B"/>
+                <w:sz w:val="20"/>
+              </w:rPr>
+              <w:t>faculty</w:t>
+            </w:r>
+          </w:p>
+        </w:tc>
+        <w:tc>
+          <w:tcPr>
+            <w:tcW w:type="dxa" w:w="2304"/>
+            <w:shd w:val="clear" w:color="auto" w:fill="FFFFFF"/>
+            <w:tcMar>
+              <w:top w:w="80" w:type="dxa"/>
+              <w:bottom w:w="80" w:type="dxa"/>
+              <w:left w:w="120" w:type="dxa"/>
+              <w:right w:w="120" w:type="dxa"/>
+            </w:tcMar>
+          </w:tcPr>
+          <w:p>
+            <w:pPr>
+              <w:jc w:val="left"/>
+            </w:pPr>
+            <w:r>
+              <w:rPr>
+                <w:rFonts w:ascii="Times New Roman" w:hAnsi="Times New Roman"/>
+                <w:color w:val="1E293B"/>
+                <w:sz w:val="20"/>
+              </w:rPr>
+              <w:t>Portal 1: Regular Faculty</w:t>
+            </w:r>
+          </w:p>
+        </w:tc>
+        <w:tc>
+          <w:tcPr>
+            <w:tcW w:type="dxa" w:w="2016"/>
+            <w:shd w:val="clear" w:color="auto" w:fill="FFFFFF"/>
+            <w:tcMar>
+              <w:top w:w="80" w:type="dxa"/>
+              <w:bottom w:w="80" w:type="dxa"/>
+              <w:left w:w="120" w:type="dxa"/>
+              <w:right w:w="120" w:type="dxa"/>
+            </w:tcMar>
+          </w:tcPr>
+          <w:p>
+            <w:pPr>
+              <w:jc w:val="left"/>
+            </w:pPr>
+            <w:r>
+              <w:rPr>
+                <w:rFonts w:ascii="Times New Roman" w:hAnsi="Times New Roman"/>
+                <w:color w:val="1E293B"/>
+                <w:sz w:val="20"/>
+              </w:rPr>
+              <w:t>Self Profile &amp; Activities</w:t>
+            </w:r>
+          </w:p>
+        </w:tc>
+        <w:tc>
+          <w:tcPr>
+            <w:tcW w:type="dxa" w:w="3744"/>
+            <w:shd w:val="clear" w:color="auto" w:fill="FFFFFF"/>
+            <w:tcMar>
+              <w:top w:w="80" w:type="dxa"/>
+              <w:bottom w:w="80" w:type="dxa"/>
+              <w:left w:w="120" w:type="dxa"/>
+              <w:right w:w="120" w:type="dxa"/>
+            </w:tcMar>
+          </w:tcPr>
+          <w:p>
+            <w:pPr>
+              <w:jc w:val="left"/>
+            </w:pPr>
+            <w:r>
+              <w:rPr>
+                <w:rFonts w:ascii="Times New Roman" w:hAnsi="Times New Roman"/>
+                <w:color w:val="1E293B"/>
+                <w:sz w:val="20"/>
+              </w:rPr>
+              <w:t>Profile logging, research/patent submissions, self FPI appraisal, AI CV builder, self dossier.</w:t>
+            </w:r>
+          </w:p>
+        </w:tc>
+      </w:tr>
+      <w:tr>
+        <w:tc>
+          <w:tcPr>
+            <w:tcW w:type="dxa" w:w="2016"/>
+            <w:shd w:val="clear" w:color="auto" w:fill="F8FAFC"/>
+            <w:tcMar>
+              <w:top w:w="80" w:type="dxa"/>
+              <w:bottom w:w="80" w:type="dxa"/>
+              <w:left w:w="120" w:type="dxa"/>
+              <w:right w:w="120" w:type="dxa"/>
+            </w:tcMar>
+          </w:tcPr>
+          <w:p>
+            <w:pPr>
+              <w:jc w:val="left"/>
+            </w:pPr>
+            <w:r>
+              <w:rPr>
+                <w:rFonts w:ascii="Times New Roman" w:hAnsi="Times New Roman"/>
+                <w:color w:val="1E293B"/>
+                <w:sz w:val="20"/>
+              </w:rPr>
+              <w:t>dept_admin (isHod: true)</w:t>
+            </w:r>
+          </w:p>
+        </w:tc>
+        <w:tc>
+          <w:tcPr>
+            <w:tcW w:type="dxa" w:w="2304"/>
+            <w:shd w:val="clear" w:color="auto" w:fill="F8FAFC"/>
+            <w:tcMar>
+              <w:top w:w="80" w:type="dxa"/>
+              <w:bottom w:w="80" w:type="dxa"/>
+              <w:left w:w="120" w:type="dxa"/>
+              <w:right w:w="120" w:type="dxa"/>
+            </w:tcMar>
+          </w:tcPr>
+          <w:p>
+            <w:pPr>
+              <w:jc w:val="left"/>
+            </w:pPr>
+            <w:r>
+              <w:rPr>
+                <w:rFonts w:ascii="Times New Roman" w:hAnsi="Times New Roman"/>
+                <w:color w:val="1E293B"/>
+                <w:sz w:val="20"/>
+              </w:rPr>
+              <w:t>Portal 2: Dept Admin / HOD</w:t>
+            </w:r>
+          </w:p>
+        </w:tc>
+        <w:tc>
+          <w:tcPr>
+            <w:tcW w:type="dxa" w:w="2016"/>
+            <w:shd w:val="clear" w:color="auto" w:fill="F8FAFC"/>
+            <w:tcMar>
+              <w:top w:w="80" w:type="dxa"/>
+              <w:bottom w:w="80" w:type="dxa"/>
+              <w:left w:w="120" w:type="dxa"/>
+              <w:right w:w="120" w:type="dxa"/>
+            </w:tcMar>
+          </w:tcPr>
+          <w:p>
+            <w:pPr>
+              <w:jc w:val="left"/>
+            </w:pPr>
+            <w:r>
+              <w:rPr>
+                <w:rFonts w:ascii="Times New Roman" w:hAnsi="Times New Roman"/>
+                <w:color w:val="1E293B"/>
+                <w:sz w:val="20"/>
+              </w:rPr>
+              <w:t>Department Wide</w:t>
+            </w:r>
+          </w:p>
+        </w:tc>
+        <w:tc>
+          <w:tcPr>
+            <w:tcW w:type="dxa" w:w="3744"/>
+            <w:shd w:val="clear" w:color="auto" w:fill="F8FAFC"/>
+            <w:tcMar>
+              <w:top w:w="80" w:type="dxa"/>
+              <w:bottom w:w="80" w:type="dxa"/>
+              <w:left w:w="120" w:type="dxa"/>
+              <w:right w:w="120" w:type="dxa"/>
+            </w:tcMar>
+          </w:tcPr>
+          <w:p>
+            <w:pPr>
+              <w:jc w:val="left"/>
+            </w:pPr>
+            <w:r>
+              <w:rPr>
+                <w:rFonts w:ascii="Times New Roman" w:hAnsi="Times New Roman"/>
+                <w:color w:val="1E293B"/>
+                <w:sz w:val="20"/>
+              </w:rPr>
+              <w:t>Read-only faculty profile view, assign dept duties, evaluate FPI appraisals, bulk sign-off, dept dossiers.</w:t>
+            </w:r>
+          </w:p>
+        </w:tc>
+      </w:tr>
+      <w:tr>
+        <w:tc>
+          <w:tcPr>
+            <w:tcW w:type="dxa" w:w="2016"/>
+            <w:shd w:val="clear" w:color="auto" w:fill="FFFFFF"/>
+            <w:tcMar>
+              <w:top w:w="80" w:type="dxa"/>
+              <w:bottom w:w="80" w:type="dxa"/>
+              <w:left w:w="120" w:type="dxa"/>
+              <w:right w:w="120" w:type="dxa"/>
+            </w:tcMar>
+          </w:tcPr>
+          <w:p>
+            <w:pPr>
+              <w:jc w:val="left"/>
+            </w:pPr>
+            <w:r>
+              <w:rPr>
+                <w:rFonts w:ascii="Times New Roman" w:hAnsi="Times New Roman"/>
+                <w:color w:val="1E293B"/>
+                <w:sz w:val="20"/>
+              </w:rPr>
+              <w:t>admin (isInstitutionalAdmin)</w:t>
+            </w:r>
+          </w:p>
+        </w:tc>
+        <w:tc>
+          <w:tcPr>
+            <w:tcW w:type="dxa" w:w="2304"/>
+            <w:shd w:val="clear" w:color="auto" w:fill="FFFFFF"/>
+            <w:tcMar>
+              <w:top w:w="80" w:type="dxa"/>
+              <w:bottom w:w="80" w:type="dxa"/>
+              <w:left w:w="120" w:type="dxa"/>
+              <w:right w:w="120" w:type="dxa"/>
+            </w:tcMar>
+          </w:tcPr>
+          <w:p>
+            <w:pPr>
+              <w:jc w:val="left"/>
+            </w:pPr>
+            <w:r>
+              <w:rPr>
+                <w:rFonts w:ascii="Times New Roman" w:hAnsi="Times New Roman"/>
+                <w:color w:val="1E293B"/>
+                <w:sz w:val="20"/>
+              </w:rPr>
+              <w:t>Portal 3: System Admin</w:t>
+            </w:r>
+          </w:p>
+        </w:tc>
+        <w:tc>
+          <w:tcPr>
+            <w:tcW w:type="dxa" w:w="2016"/>
+            <w:shd w:val="clear" w:color="auto" w:fill="FFFFFF"/>
+            <w:tcMar>
+              <w:top w:w="80" w:type="dxa"/>
+              <w:bottom w:w="80" w:type="dxa"/>
+              <w:left w:w="120" w:type="dxa"/>
+              <w:right w:w="120" w:type="dxa"/>
+            </w:tcMar>
+          </w:tcPr>
+          <w:p>
+            <w:pPr>
+              <w:jc w:val="left"/>
+            </w:pPr>
+            <w:r>
+              <w:rPr>
+                <w:rFonts w:ascii="Times New Roman" w:hAnsi="Times New Roman"/>
+                <w:color w:val="1E293B"/>
+                <w:sz w:val="20"/>
+              </w:rPr>
+              <w:t>Institution Wide</w:t>
+            </w:r>
+          </w:p>
+        </w:tc>
+        <w:tc>
+          <w:tcPr>
+            <w:tcW w:type="dxa" w:w="3744"/>
+            <w:shd w:val="clear" w:color="auto" w:fill="FFFFFF"/>
+            <w:tcMar>
+              <w:top w:w="80" w:type="dxa"/>
+              <w:bottom w:w="80" w:type="dxa"/>
+              <w:left w:w="120" w:type="dxa"/>
+              <w:right w:w="120" w:type="dxa"/>
+            </w:tcMar>
+          </w:tcPr>
+          <w:p>
+            <w:pPr>
+              <w:jc w:val="left"/>
+            </w:pPr>
+            <w:r>
+              <w:rPr>
+                <w:rFonts w:ascii="Times New Roman" w:hAnsi="Times New Roman"/>
+                <w:color w:val="1E293B"/>
+                <w:sz w:val="20"/>
+              </w:rPr>
+              <w:t>Full CRUD user management, rubric builder, final FPI approval, bulk sign-off, faculty transfers, accreditation suite.</w:t>
+            </w:r>
+          </w:p>
+        </w:tc>
+      </w:tr>
+      <w:tr>
+        <w:tc>
+          <w:tcPr>
+            <w:tcW w:type="dxa" w:w="2016"/>
+            <w:shd w:val="clear" w:color="auto" w:fill="F8FAFC"/>
+            <w:tcMar>
+              <w:top w:w="80" w:type="dxa"/>
+              <w:bottom w:w="80" w:type="dxa"/>
+              <w:left w:w="120" w:type="dxa"/>
+              <w:right w:w="120" w:type="dxa"/>
+            </w:tcMar>
+          </w:tcPr>
+          <w:p>
+            <w:pPr>
+              <w:jc w:val="left"/>
+            </w:pPr>
+            <w:r>
+              <w:rPr>
+                <w:rFonts w:ascii="Times New Roman" w:hAnsi="Times New Roman"/>
+                <w:color w:val="1E293B"/>
+                <w:sz w:val="20"/>
+              </w:rPr>
+              <w:t>principal / hr</w:t>
+            </w:r>
+          </w:p>
+        </w:tc>
+        <w:tc>
+          <w:tcPr>
+            <w:tcW w:type="dxa" w:w="2304"/>
+            <w:shd w:val="clear" w:color="auto" w:fill="F8FAFC"/>
+            <w:tcMar>
+              <w:top w:w="80" w:type="dxa"/>
+              <w:bottom w:w="80" w:type="dxa"/>
+              <w:left w:w="120" w:type="dxa"/>
+              <w:right w:w="120" w:type="dxa"/>
+            </w:tcMar>
+          </w:tcPr>
+          <w:p>
+            <w:pPr>
+              <w:jc w:val="left"/>
+            </w:pPr>
+            <w:r>
+              <w:rPr>
+                <w:rFonts w:ascii="Times New Roman" w:hAnsi="Times New Roman"/>
+                <w:color w:val="1E293B"/>
+                <w:sz w:val="20"/>
+              </w:rPr>
+              <w:t>Portal 3: Executive Admin</w:t>
+            </w:r>
+          </w:p>
+        </w:tc>
+        <w:tc>
+          <w:tcPr>
+            <w:tcW w:type="dxa" w:w="2016"/>
+            <w:shd w:val="clear" w:color="auto" w:fill="F8FAFC"/>
+            <w:tcMar>
+              <w:top w:w="80" w:type="dxa"/>
+              <w:bottom w:w="80" w:type="dxa"/>
+              <w:left w:w="120" w:type="dxa"/>
+              <w:right w:w="120" w:type="dxa"/>
+            </w:tcMar>
+          </w:tcPr>
+          <w:p>
+            <w:pPr>
+              <w:jc w:val="left"/>
+            </w:pPr>
+            <w:r>
+              <w:rPr>
+                <w:rFonts w:ascii="Times New Roman" w:hAnsi="Times New Roman"/>
+                <w:color w:val="1E293B"/>
+                <w:sz w:val="20"/>
+              </w:rPr>
+              <w:t>Institution Wide</w:t>
+            </w:r>
+          </w:p>
+        </w:tc>
+        <w:tc>
+          <w:tcPr>
+            <w:tcW w:type="dxa" w:w="3744"/>
+            <w:shd w:val="clear" w:color="auto" w:fill="F8FAFC"/>
+            <w:tcMar>
+              <w:top w:w="80" w:type="dxa"/>
+              <w:bottom w:w="80" w:type="dxa"/>
+              <w:left w:w="120" w:type="dxa"/>
+              <w:right w:w="120" w:type="dxa"/>
+            </w:tcMar>
+          </w:tcPr>
+          <w:p>
+            <w:pPr>
+              <w:jc w:val="left"/>
+            </w:pPr>
+            <w:r>
+              <w:rPr>
+                <w:rFonts w:ascii="Times New Roman" w:hAnsi="Times New Roman"/>
+                <w:color w:val="1E293B"/>
+                <w:sz w:val="20"/>
+              </w:rPr>
+              <w:t>Executive appraisal reviews, institutional duty allocations, salary/experience certificate access, campus analytics.</w:t>
+            </w:r>
+          </w:p>
+        </w:tc>
+      </w:tr>
+      <w:tr>
+        <w:tc>
+          <w:tcPr>
+            <w:tcW w:type="dxa" w:w="2016"/>
+            <w:shd w:val="clear" w:color="auto" w:fill="FFFFFF"/>
+            <w:tcMar>
+              <w:top w:w="80" w:type="dxa"/>
+              <w:bottom w:w="80" w:type="dxa"/>
+              <w:left w:w="120" w:type="dxa"/>
+              <w:right w:w="120" w:type="dxa"/>
+            </w:tcMar>
+          </w:tcPr>
+          <w:p>
+            <w:pPr>
+              <w:jc w:val="left"/>
+            </w:pPr>
+            <w:r>
+              <w:rPr>
+                <w:rFonts w:ascii="Times New Roman" w:hAnsi="Times New Roman"/>
+                <w:color w:val="1E293B"/>
+                <w:sz w:val="20"/>
+              </w:rPr>
+              <w:t>isClubCoordinator: true</w:t>
+            </w:r>
+          </w:p>
+        </w:tc>
+        <w:tc>
+          <w:tcPr>
+            <w:tcW w:type="dxa" w:w="2304"/>
+            <w:shd w:val="clear" w:color="auto" w:fill="FFFFFF"/>
+            <w:tcMar>
+              <w:top w:w="80" w:type="dxa"/>
+              <w:bottom w:w="80" w:type="dxa"/>
+              <w:left w:w="120" w:type="dxa"/>
+              <w:right w:w="120" w:type="dxa"/>
+            </w:tcMar>
+          </w:tcPr>
+          <w:p>
+            <w:pPr>
+              <w:jc w:val="left"/>
+            </w:pPr>
+            <w:r>
+              <w:rPr>
+                <w:rFonts w:ascii="Times New Roman" w:hAnsi="Times New Roman"/>
+                <w:color w:val="1E293B"/>
+                <w:sz w:val="20"/>
+              </w:rPr>
+              <w:t>Portal 1 + Club Module</w:t>
+            </w:r>
+          </w:p>
+        </w:tc>
+        <w:tc>
+          <w:tcPr>
+            <w:tcW w:type="dxa" w:w="2016"/>
+            <w:shd w:val="clear" w:color="auto" w:fill="FFFFFF"/>
+            <w:tcMar>
+              <w:top w:w="80" w:type="dxa"/>
+              <w:bottom w:w="80" w:type="dxa"/>
+              <w:left w:w="120" w:type="dxa"/>
+              <w:right w:w="120" w:type="dxa"/>
+            </w:tcMar>
+          </w:tcPr>
+          <w:p>
+            <w:pPr>
+              <w:jc w:val="left"/>
+            </w:pPr>
+            <w:r>
+              <w:rPr>
+                <w:rFonts w:ascii="Times New Roman" w:hAnsi="Times New Roman"/>
+                <w:color w:val="1E293B"/>
+                <w:sz w:val="20"/>
+              </w:rPr>
+              <w:t>Assigned Club/Cell</w:t>
+            </w:r>
+          </w:p>
+        </w:tc>
+        <w:tc>
+          <w:tcPr>
+            <w:tcW w:type="dxa" w:w="3744"/>
+            <w:shd w:val="clear" w:color="auto" w:fill="FFFFFF"/>
+            <w:tcMar>
+              <w:top w:w="80" w:type="dxa"/>
+              <w:bottom w:w="80" w:type="dxa"/>
+              <w:left w:w="120" w:type="dxa"/>
+              <w:right w:w="120" w:type="dxa"/>
+            </w:tcMar>
+          </w:tcPr>
+          <w:p>
+            <w:pPr>
+              <w:jc w:val="left"/>
+            </w:pPr>
+            <w:r>
+              <w:rPr>
+                <w:rFonts w:ascii="Times New Roman" w:hAnsi="Times New Roman"/>
+                <w:color w:val="1E293B"/>
+                <w:sz w:val="20"/>
+              </w:rPr>
+              <w:t>Log student events, guest speakers, budget utilization, participant rosters, club activity dossiers.</w:t>
+            </w:r>
+          </w:p>
+        </w:tc>
+      </w:tr>
+      <w:tr>
+        <w:tc>
+          <w:tcPr>
+            <w:tcW w:type="dxa" w:w="2016"/>
+            <w:shd w:val="clear" w:color="auto" w:fill="F8FAFC"/>
+            <w:tcMar>
+              <w:top w:w="80" w:type="dxa"/>
+              <w:bottom w:w="80" w:type="dxa"/>
+              <w:left w:w="120" w:type="dxa"/>
+              <w:right w:w="120" w:type="dxa"/>
+            </w:tcMar>
+          </w:tcPr>
+          <w:p>
+            <w:pPr>
+              <w:jc w:val="left"/>
+            </w:pPr>
+            <w:r>
+              <w:rPr>
+                <w:rFonts w:ascii="Times New Roman" w:hAnsi="Times New Roman"/>
+                <w:color w:val="1E293B"/>
+                <w:sz w:val="20"/>
+              </w:rPr>
+              <w:t>isSupervisorEligible (Ph.D)</w:t>
+            </w:r>
+          </w:p>
+        </w:tc>
+        <w:tc>
+          <w:tcPr>
+            <w:tcW w:type="dxa" w:w="2304"/>
+            <w:shd w:val="clear" w:color="auto" w:fill="F8FAFC"/>
+            <w:tcMar>
+              <w:top w:w="80" w:type="dxa"/>
+              <w:bottom w:w="80" w:type="dxa"/>
+              <w:left w:w="120" w:type="dxa"/>
+              <w:right w:w="120" w:type="dxa"/>
+            </w:tcMar>
+          </w:tcPr>
+          <w:p>
+            <w:pPr>
+              <w:jc w:val="left"/>
+            </w:pPr>
+            <w:r>
+              <w:rPr>
+                <w:rFonts w:ascii="Times New Roman" w:hAnsi="Times New Roman"/>
+                <w:color w:val="1E293B"/>
+                <w:sz w:val="20"/>
+              </w:rPr>
+              <w:t>Portal 1 + Supervisor</w:t>
+            </w:r>
+          </w:p>
+        </w:tc>
+        <w:tc>
+          <w:tcPr>
+            <w:tcW w:type="dxa" w:w="2016"/>
+            <w:shd w:val="clear" w:color="auto" w:fill="F8FAFC"/>
+            <w:tcMar>
+              <w:top w:w="80" w:type="dxa"/>
+              <w:bottom w:w="80" w:type="dxa"/>
+              <w:left w:w="120" w:type="dxa"/>
+              <w:right w:w="120" w:type="dxa"/>
+            </w:tcMar>
+          </w:tcPr>
+          <w:p>
+            <w:pPr>
+              <w:jc w:val="left"/>
+            </w:pPr>
+            <w:r>
+              <w:rPr>
+                <w:rFonts w:ascii="Times New Roman" w:hAnsi="Times New Roman"/>
+                <w:color w:val="1E293B"/>
+                <w:sz w:val="20"/>
+              </w:rPr>
+              <w:t>Research Guidance</w:t>
+            </w:r>
+          </w:p>
+        </w:tc>
+        <w:tc>
+          <w:tcPr>
+            <w:tcW w:type="dxa" w:w="3744"/>
+            <w:shd w:val="clear" w:color="auto" w:fill="F8FAFC"/>
+            <w:tcMar>
+              <w:top w:w="80" w:type="dxa"/>
+              <w:bottom w:w="80" w:type="dxa"/>
+              <w:left w:w="120" w:type="dxa"/>
+              <w:right w:w="120" w:type="dxa"/>
+            </w:tcMar>
+          </w:tcPr>
+          <w:p>
+            <w:pPr>
+              <w:jc w:val="left"/>
+            </w:pPr>
+            <w:r>
+              <w:rPr>
+                <w:rFonts w:ascii="Times New Roman" w:hAnsi="Times New Roman"/>
+                <w:color w:val="1E293B"/>
+                <w:sz w:val="20"/>
+              </w:rPr>
+              <w:t>Register Ph.D. scholars guided, joint publications, thesis completion milestones, university allocations.</w:t>
+            </w:r>
+          </w:p>
+        </w:tc>
+      </w:tr>
+    </w:tbl>
+    <w:p>
+      <w:pPr>
+        <w:spacing w:before="80" w:after="120"/>
+      </w:pPr>
+    </w:p>
+    <w:p>
+      <w:pPr>
+        <w:keepNext/>
+        <w:spacing w:before="240" w:after="120"/>
       </w:pPr>
       <w:r>
         <w:rPr>
@@ -171,7 +984,7 @@
                 <w:rFonts w:ascii="Times New Roman" w:hAnsi="Times New Roman"/>
                 <w:b/>
                 <w:color w:val="0F331F"/>
-                <w:sz w:val="28"/>
+                <w:sz w:val="26"/>
               </w:rPr>
               <w:t>ARCHITECTURAL FLOW: CENTRALIZED JWT AUTHENTICATION &amp; PORTAL ACCESS ROUTING</w:t>
               <w:br/>
@@ -186,7 +999,7 @@
                 <w:rFonts w:ascii="Times New Roman" w:hAnsi="Times New Roman"/>
                 <w:b/>
                 <w:color w:val="0369A1"/>
-                <w:sz w:val="28"/>
+                <w:sz w:val="22"/>
               </w:rPr>
               <w:t xml:space="preserve">► Step 1: </w:t>
             </w:r>
@@ -194,9 +1007,9 @@
               <w:rPr>
                 <w:rFonts w:ascii="Times New Roman" w:hAnsi="Times New Roman"/>
                 <w:color w:val="1E293B"/>
-                <w:sz w:val="28"/>
+                <w:sz w:val="22"/>
               </w:rPr>
-              <w:t>User inputs credentials (Staff ID / Password / Role Selection) at /login.</w:t>
+              <w:t>User enters credentials (Staff ID / Password / Role Selection) at /login.</w:t>
             </w:r>
           </w:p>
           <w:p>
@@ -209,7 +1022,7 @@
                 <w:rFonts w:ascii="Times New Roman" w:hAnsi="Times New Roman"/>
                 <w:b/>
                 <w:color w:val="0F766E"/>
-                <w:sz w:val="28"/>
+                <w:sz w:val="24"/>
               </w:rPr>
               <w:t>│</w:t>
               <w:br/>
@@ -225,7 +1038,7 @@
                 <w:rFonts w:ascii="Times New Roman" w:hAnsi="Times New Roman"/>
                 <w:b/>
                 <w:color w:val="0369A1"/>
-                <w:sz w:val="28"/>
+                <w:sz w:val="22"/>
               </w:rPr>
               <w:t xml:space="preserve">► Step 2: </w:t>
             </w:r>
@@ -233,9 +1046,9 @@
               <w:rPr>
                 <w:rFonts w:ascii="Times New Roman" w:hAnsi="Times New Roman"/>
                 <w:color w:val="1E293B"/>
-                <w:sz w:val="28"/>
+                <w:sz w:val="22"/>
               </w:rPr>
-              <w:t>Backend verifies password via bcryptjs against staff_user or admin tables.</w:t>
+              <w:t>Backend verifies password hash via bcryptjs against staff_user or admin tables.</w:t>
             </w:r>
           </w:p>
           <w:p>
@@ -248,7 +1061,7 @@
                 <w:rFonts w:ascii="Times New Roman" w:hAnsi="Times New Roman"/>
                 <w:b/>
                 <w:color w:val="0F766E"/>
-                <w:sz w:val="28"/>
+                <w:sz w:val="24"/>
               </w:rPr>
               <w:t>│</w:t>
               <w:br/>
@@ -264,7 +1077,7 @@
                 <w:rFonts w:ascii="Times New Roman" w:hAnsi="Times New Roman"/>
                 <w:b/>
                 <w:color w:val="0369A1"/>
-                <w:sz w:val="28"/>
+                <w:sz w:val="22"/>
               </w:rPr>
               <w:t xml:space="preserve">► Step 3: </w:t>
             </w:r>
@@ -272,9 +1085,9 @@
               <w:rPr>
                 <w:rFonts w:ascii="Times New Roman" w:hAnsi="Times New Roman"/>
                 <w:color w:val="1E293B"/>
-                <w:sz w:val="28"/>
+                <w:sz w:val="22"/>
               </w:rPr>
-              <w:t>Server generates 24-hour JWT token with claims: role, isHod, isInstitutionalAdmin, isSupervisorEligible, isClubCoordinator.</w:t>
+              <w:t>Server generates 24-hour cryptographic JWT containing: staffId, role, isHod, isInstitutionalAdmin, isSupervisorEligible, isClubCoordinator.</w:t>
             </w:r>
           </w:p>
           <w:p>
@@ -287,7 +1100,7 @@
                 <w:rFonts w:ascii="Times New Roman" w:hAnsi="Times New Roman"/>
                 <w:b/>
                 <w:color w:val="0F766E"/>
-                <w:sz w:val="28"/>
+                <w:sz w:val="24"/>
               </w:rPr>
               <w:t>│</w:t>
               <w:br/>
@@ -303,7 +1116,7 @@
                 <w:rFonts w:ascii="Times New Roman" w:hAnsi="Times New Roman"/>
                 <w:b/>
                 <w:color w:val="0369A1"/>
-                <w:sz w:val="28"/>
+                <w:sz w:val="22"/>
               </w:rPr>
               <w:t xml:space="preserve">► Step 4: </w:t>
             </w:r>
@@ -311,9 +1124,9 @@
               <w:rPr>
                 <w:rFonts w:ascii="Times New Roman" w:hAnsi="Times New Roman"/>
                 <w:color w:val="1E293B"/>
-                <w:sz w:val="28"/>
+                <w:sz w:val="22"/>
               </w:rPr>
-              <w:t>Client stores token in localStorage and passes Bearer Authorization Header on all API calls.</w:t>
+              <w:t>Client browser caches JWT in localStorage and attaches 'Authorization: Bearer &lt;token&gt;' to all subsequent API requests.</w:t>
             </w:r>
           </w:p>
           <w:p>
@@ -326,7 +1139,7 @@
                 <w:rFonts w:ascii="Times New Roman" w:hAnsi="Times New Roman"/>
                 <w:b/>
                 <w:color w:val="0F766E"/>
-                <w:sz w:val="28"/>
+                <w:sz w:val="24"/>
               </w:rPr>
               <w:t>│</w:t>
               <w:br/>
@@ -342,7 +1155,7 @@
                 <w:rFonts w:ascii="Times New Roman" w:hAnsi="Times New Roman"/>
                 <w:b/>
                 <w:color w:val="0369A1"/>
-                <w:sz w:val="28"/>
+                <w:sz w:val="22"/>
               </w:rPr>
               <w:t xml:space="preserve">► Step 5: </w:t>
             </w:r>
@@ -350,9 +1163,9 @@
               <w:rPr>
                 <w:rFonts w:ascii="Times New Roman" w:hAnsi="Times New Roman"/>
                 <w:color w:val="1E293B"/>
-                <w:sz w:val="28"/>
+                <w:sz w:val="22"/>
               </w:rPr>
-              <w:t>React Router (App.jsx) dynamically mounts Portal 1 (Faculty), Portal 2 (Dept Admin), or Portal 3 (System Admin).</w:t>
+              <w:t>React Router (App.jsx) and Role Guards dynamically mount Portal 1 (Faculty), Portal 2 (HOD), or Portal 3 (System Admin).</w:t>
             </w:r>
           </w:p>
         </w:tc>
@@ -360,7 +1173,7 @@
     </w:tbl>
     <w:p>
       <w:pPr>
-        <w:spacing w:after="160"/>
+        <w:spacing w:after="120"/>
       </w:pPr>
     </w:p>
     <w:p>
@@ -375,7 +1188,7 @@
           <w:color w:val="0F172A"/>
           <w:sz w:val="32"/>
         </w:rPr>
-        <w:t>2. Portal 1 — Regular Faculty Portal Workflow (role: 'faculty')</w:t>
+        <w:t>2. Portal 1 — Regular Faculty Portal Structural Workflow</w:t>
       </w:r>
     </w:p>
     <w:p>
@@ -385,235 +1198,367 @@
       <w:r>
         <w:rPr>
           <w:rFonts w:ascii="Times New Roman" w:hAnsi="Times New Roman"/>
-          <w:sz w:val="28"/>
+          <w:sz w:val="22"/>
         </w:rPr>
-        <w:t>The Faculty Portal empowers teaching staff to log personal details, upload academic documents, manage research submissions, view assigned duties, fill self FPI appraisal forms, and export dossiers.</w:t>
+        <w:t>Portal 1 is designed specifically for teaching and research faculty. It provides intuitive self-service workflows for managing professional credentials, scholarly publications, intellectual property, certifications, academic workloads, and annual self-performance evaluations.</w:t>
       </w:r>
     </w:p>
     <w:p>
       <w:pPr>
         <w:pStyle w:val="ListBullet"/>
-        <w:spacing w:after="80"/>
+        <w:spacing w:after="60"/>
       </w:pPr>
       <w:r>
         <w:rPr>
           <w:rFonts w:ascii="Times New Roman" w:hAnsi="Times New Roman"/>
           <w:b/>
           <w:color w:val="0369A1"/>
-          <w:sz w:val="28"/>
+          <w:sz w:val="22"/>
         </w:rPr>
-        <w:t xml:space="preserve">Workflow 1.1 — Personal &amp; Academic Profile Logging: </w:t>
+        <w:t xml:space="preserve">Workflow 1.1 — Authentication &amp; Interactive Dashboard: </w:t>
       </w:r>
       <w:r>
         <w:rPr>
           <w:rFonts w:ascii="Times New Roman" w:hAnsi="Times New Roman"/>
-          <w:sz w:val="28"/>
+          <w:sz w:val="20"/>
         </w:rPr>
-        <w:t>Faculty logs into Dashboard -&gt; Personal (/profile/personal) to update DOB, Gender, Mobile, PAN, Aadhaar, and Address. Accesses Academic Info (/profile/academic) to view designation, department, and SREC experience. Uploads official identity documents via /profile/documents. File saved to server/SREC/{Department}/{Staff_ID}/.</w:t>
+        <w:t>Faculty authenticates and lands on Dashboard (/dashboard). The dashboard presents high-level summary cards (Total Publications, Grants Sanctioned, Certifications Completed, Pending Appraisals), quick-action links, and the Notification Bell for real-time announcements.</w:t>
       </w:r>
     </w:p>
     <w:p>
       <w:pPr>
         <w:pStyle w:val="ListBullet"/>
-        <w:spacing w:after="80"/>
+        <w:spacing w:after="60"/>
       </w:pPr>
       <w:r>
         <w:rPr>
           <w:rFonts w:ascii="Times New Roman" w:hAnsi="Times New Roman"/>
           <w:b/>
           <w:color w:val="0369A1"/>
-          <w:sz w:val="28"/>
+          <w:sz w:val="22"/>
         </w:rPr>
-        <w:t xml:space="preserve">Workflow 1.2 — Education &amp; Professional Memberships: </w:t>
+        <w:t xml:space="preserve">Workflow 1.2 — Personal Profile &amp; Identification Data (/profile/personal): </w:t>
       </w:r>
       <w:r>
         <w:rPr>
           <w:rFonts w:ascii="Times New Roman" w:hAnsi="Times New Roman"/>
-          <w:sz w:val="28"/>
+          <w:sz w:val="20"/>
         </w:rPr>
-        <w:t>Faculty submits educational qualifications (SSLC, HSC, UG, PG, Ph.D) with certificate uploads in Education Details (/profile/education). Registers professional memberships (IEEE, CSI, ACM) in /activities/memberships.</w:t>
+        <w:t>Faculty logs and updates personal demographic details including Date of Birth, Gender, Blood Group, Mobile, Emergency Contacts, Permanent/Communication Addresses, PAN, Aadhaar, APAAR ID, AICTE Faculty ID, and Anna University Faculty ID.</w:t>
       </w:r>
     </w:p>
     <w:p>
       <w:pPr>
         <w:pStyle w:val="ListBullet"/>
-        <w:spacing w:after="80"/>
+        <w:spacing w:after="60"/>
       </w:pPr>
       <w:r>
         <w:rPr>
           <w:rFonts w:ascii="Times New Roman" w:hAnsi="Times New Roman"/>
           <w:b/>
           <w:color w:val="0369A1"/>
-          <w:sz w:val="28"/>
+          <w:sz w:val="22"/>
         </w:rPr>
-        <w:t xml:space="preserve">Workflow 1.3 — Activity &amp; Certification Logging: </w:t>
+        <w:t xml:space="preserve">Workflow 1.3 — Academic Background &amp; Research Identifiers (/profile/academic): </w:t>
       </w:r>
       <w:r>
         <w:rPr>
           <w:rFonts w:ascii="Times New Roman" w:hAnsi="Times New Roman"/>
-          <w:sz w:val="28"/>
+          <w:sz w:val="20"/>
         </w:rPr>
-        <w:t>Faculty logs FDPs/workshops attended (/activities/interactions), resource person engagements (/activities/resource), online certifications (/activities/certifications), awards (/activities/awards), and events organized (/activities/events). If assigned as Club Coordinator, accesses /activities/clubs.</w:t>
+        <w:t>Faculty views official academic metadata (Designation, Department, Date of Joining, SREC Experience, Total Experience). Faculty registers and maintains digital research identifiers: ORCID ID, Scopus Author ID, ResearcherID (Web of Science), Google Scholar Profile URL, and Vidwan Profile ID.</w:t>
       </w:r>
     </w:p>
     <w:p>
       <w:pPr>
         <w:pStyle w:val="ListBullet"/>
-        <w:spacing w:after="80"/>
+        <w:spacing w:after="60"/>
       </w:pPr>
       <w:r>
         <w:rPr>
           <w:rFonts w:ascii="Times New Roman" w:hAnsi="Times New Roman"/>
           <w:b/>
           <w:color w:val="0369A1"/>
-          <w:sz w:val="28"/>
+          <w:sz w:val="22"/>
         </w:rPr>
-        <w:t xml:space="preserve">Workflow 1.4 — R&amp;D &amp; Scholarly Submissions: </w:t>
+        <w:t xml:space="preserve">Workflow 1.4 — Document Vault &amp; Official Identity File Uploads (/profile/documents): </w:t>
       </w:r>
       <w:r>
         <w:rPr>
           <w:rFonts w:ascii="Times New Roman" w:hAnsi="Times New Roman"/>
-          <w:sz w:val="28"/>
+          <w:sz w:val="20"/>
         </w:rPr>
-        <w:t>If non-Doctorate, accesses Research Scholar (/activities/scholars). If Doctorate/Ph.D ('Dr.'), Research Supervisor (/activities/supervisors) is automatically enabled. Logs Research Funding (/activities/funding), Seed Money (/activities/seed_money), Patents/IPR (/activities/ipr), Publications (/activities/publications), and Books (/activities/books).</w:t>
+        <w:t>Faculty uploads scanned copies of essential identity documents (Aadhaar Card, PAN Card, Relieving Orders). Files are stored on the server under the secure organized hierarchy: /server/SREC/{Department}/{Staff_ID}/ with paths indexed in the database.</w:t>
       </w:r>
     </w:p>
     <w:p>
       <w:pPr>
         <w:pStyle w:val="ListBullet"/>
-        <w:spacing w:after="80"/>
+        <w:spacing w:after="60"/>
       </w:pPr>
       <w:r>
         <w:rPr>
           <w:rFonts w:ascii="Times New Roman" w:hAnsi="Times New Roman"/>
           <w:b/>
           <w:color w:val="0369A1"/>
-          <w:sz w:val="28"/>
+          <w:sz w:val="22"/>
         </w:rPr>
-        <w:t xml:space="preserve">Workflow 1.5 — Assigned Responsibilities View: </w:t>
+        <w:t xml:space="preserve">Workflow 1.5 — Educational Qualifications &amp; Degree Certificates (/profile/education): </w:t>
       </w:r>
       <w:r>
         <w:rPr>
           <w:rFonts w:ascii="Times New Roman" w:hAnsi="Times New Roman"/>
-          <w:sz w:val="28"/>
+          <w:sz w:val="20"/>
         </w:rPr>
-        <w:t>Faculty accesses /responsibilities to view official additional duties assigned by HOD, Principal, HR, or System Admin.</w:t>
+        <w:t>Faculty submits chronologically ordered educational degrees (SSLC, HSC, Diploma, UG, PG, Ph.D.). Each qualification captures the degree name, specialization, institution, university, year of passing, percentage/CGPA, class/distinction, and scanned certificate proof.</w:t>
       </w:r>
     </w:p>
     <w:p>
       <w:pPr>
         <w:pStyle w:val="ListBullet"/>
-        <w:spacing w:after="80"/>
+        <w:spacing w:after="60"/>
       </w:pPr>
       <w:r>
         <w:rPr>
           <w:rFonts w:ascii="Times New Roman" w:hAnsi="Times New Roman"/>
           <w:b/>
           <w:color w:val="0369A1"/>
-          <w:sz w:val="28"/>
+          <w:sz w:val="22"/>
         </w:rPr>
-        <w:t xml:space="preserve">Workflow 1.6 — Annual Performance Appraisal (FPI Form) Submission: </w:t>
+        <w:t xml:space="preserve">Workflow 1.6 — Professional Society Memberships (/activities/memberships): </w:t>
       </w:r>
       <w:r>
         <w:rPr>
           <w:rFonts w:ascii="Times New Roman" w:hAnsi="Times New Roman"/>
-          <w:sz w:val="28"/>
+          <w:sz w:val="20"/>
         </w:rPr>
-        <w:t>Faculty opens Appraisal Form (/appraisal). System auto-selects completed academic year (2025-2026) and auto-maps portal data into PART A (Teaching, Max 60), PART B (Prof Dev, Max 40), PART C (R&amp;D, Max 80), and PART D (Institutional, Max 20). Self-scores calculate automatically. Faculty verifies auto-mapped proofs (👁️ View Proof) and clicks 'Submit FPI Form'. Form status updates to 'Submitted'.</w:t>
+        <w:t>Faculty registers active memberships in national and international professional bodies (e.g. IEEE, ACM, CSI, ISTE, IEI, IETE), logging membership ID, grade (Life Member, Senior Member, Fellow), and joining year.</w:t>
       </w:r>
     </w:p>
     <w:p>
       <w:pPr>
         <w:pStyle w:val="ListBullet"/>
-        <w:spacing w:after="80"/>
+        <w:spacing w:after="60"/>
       </w:pPr>
       <w:r>
         <w:rPr>
           <w:rFonts w:ascii="Times New Roman" w:hAnsi="Times New Roman"/>
           <w:b/>
           <w:color w:val="0369A1"/>
-          <w:sz w:val="28"/>
+          <w:sz w:val="22"/>
         </w:rPr>
-        <w:t xml:space="preserve">Workflow 1.7 — Self Dossier Report Generation: </w:t>
+        <w:t xml:space="preserve">Workflow 1.7 — Teaching Workload, Pass Percentages &amp; Student Feedback: </w:t>
       </w:r>
       <w:r>
         <w:rPr>
           <w:rFonts w:ascii="Times New Roman" w:hAnsi="Times New Roman"/>
-          <w:sz w:val="28"/>
+          <w:sz w:val="20"/>
         </w:rPr>
-        <w:t>Faculty opens Reports (/reports) to generate and download self academic dossier in PDF, Excel, or ZIP format.</w:t>
+        <w:t>Faculty logs semester-wise course portfolios, subjects handled, student enrollment, laboratory courses, final semester examination pass percentages, and official student feedback scores (rated out of 5.0).</w:t>
       </w:r>
     </w:p>
     <w:p>
       <w:pPr>
         <w:pStyle w:val="ListBullet"/>
-        <w:spacing w:after="80"/>
+        <w:spacing w:after="60"/>
       </w:pPr>
       <w:r>
         <w:rPr>
           <w:rFonts w:ascii="Times New Roman" w:hAnsi="Times New Roman"/>
           <w:b/>
           <w:color w:val="0369A1"/>
-          <w:sz w:val="28"/>
+          <w:sz w:val="22"/>
         </w:rPr>
-        <w:t xml:space="preserve">Workflow 1.8 — 1-Click AI CV &amp; Bio-Data Generator: </w:t>
+        <w:t xml:space="preserve">Workflow 1.8 — Professional Development, Certifications &amp; Events (/activities): </w:t>
       </w:r>
       <w:r>
         <w:rPr>
           <w:rFonts w:ascii="Times New Roman" w:hAnsi="Times New Roman"/>
-          <w:sz w:val="28"/>
+          <w:sz w:val="20"/>
         </w:rPr>
-        <w:t>Faculty opens /cv-generator to generate comprehensive, professional resumes. Selects from 3 standard formats (SREC Official Letterhead, AICTE/Anna University Statutory Format, Modern Technical Europass). Chooses AI Summary style (Executive, Research, Teaching), customizes section visibility toggles, and exports high-definition vector PDFs or prints directly.</w:t>
+        <w:t>Faculty records professional development milestones: (a) FDPs, STTPs, workshops, and seminars attended (/activities/interactions); (b) Online certifications from NPTEL, Swayam, Coursera, edX (/activities/certifications); (c) Invited guest lectures, session chairs, and resource person engagements (/activities/resource); (d) Honors, awards, and national fellowships (/activities/awards); (e) Workshops, conferences, and hackathons organized (/activities/events).</w:t>
       </w:r>
     </w:p>
     <w:p>
       <w:pPr>
         <w:pStyle w:val="ListBullet"/>
-        <w:spacing w:after="80"/>
+        <w:spacing w:after="60"/>
       </w:pPr>
       <w:r>
         <w:rPr>
           <w:rFonts w:ascii="Times New Roman" w:hAnsi="Times New Roman"/>
           <w:b/>
           <w:color w:val="0369A1"/>
-          <w:sz w:val="28"/>
+          <w:sz w:val="22"/>
         </w:rPr>
-        <w:t xml:space="preserve">Workflow 1.9 — Real-Time Web Push Notification Enrollment: </w:t>
+        <w:t xml:space="preserve">Workflow 1.9 — R&amp;D, Sponsored Grants, Seed Money, Patents &amp; Publications: </w:t>
       </w:r>
       <w:r>
         <w:rPr>
           <w:rFonts w:ascii="Times New Roman" w:hAnsi="Times New Roman"/>
-          <w:sz w:val="28"/>
+          <w:sz w:val="20"/>
         </w:rPr>
-        <w:t>Faculty clicks Notification Bell in Navbar to enable browser/mobile push alerts via Service Worker. Receives instant real-time alerts on appraisal status approvals, bulk sign-offs, revision requests, and administrative circulars with zero SMS latency.</w:t>
+        <w:t>Faculty logs research achievements: (a) Sponsored research grants from DST, AICTE, DRDO, or industry partners (/activities/funding); (b) Institutional Seed Money grants (/activities/seed_money); (c) Patents, IPR filings, granted designs, and copyrights (/activities/ipr); (d) Journal publications (SCI, Scopus, UGC-CARE), conference proceedings, and book chapters (/activities/publications); (e) Authored/edited textbooks with ISBN (/activities/books); (f) Ph.D. scholars guided (/activities/scholars for scholars, /activities/supervisors for Ph.D. supervisors).</w:t>
       </w:r>
     </w:p>
     <w:p>
       <w:pPr>
         <w:pStyle w:val="ListBullet"/>
-        <w:spacing w:after="80"/>
+        <w:spacing w:after="60"/>
       </w:pPr>
       <w:r>
         <w:rPr>
           <w:rFonts w:ascii="Times New Roman" w:hAnsi="Times New Roman"/>
           <w:b/>
           <w:color w:val="0369A1"/>
-          <w:sz w:val="28"/>
+          <w:sz w:val="22"/>
         </w:rPr>
-        <w:t xml:space="preserve">Workflow 1.10 — Profile Picture Upload &amp; Automated White Background Standardization: </w:t>
+        <w:t xml:space="preserve">Workflow 1.10 — Assigned Responsibilities &amp; Institutional Service Viewer (/responsibilities): </w:t>
       </w:r>
       <w:r>
         <w:rPr>
           <w:rFonts w:ascii="Times New Roman" w:hAnsi="Times New Roman"/>
-          <w:sz w:val="28"/>
+          <w:sz w:val="20"/>
         </w:rPr>
-        <w:t>Faculty accesses Settings &amp; Security (/settings) to upload a new profile picture (JPG/PNG). The backend automatically processes the image via AI portrait segmentation (rembg) to isolate the portrait and standardize the background to pure solid white (#FFFFFF), automatically updating the avatar across Navbar, Dashboard, and CV.</w:t>
+        <w:t>Faculty accesses the responsibilities module to review official departmental duties (e.g. Class Advisor, Lab In-charge, Timetable Coordinator) and institutional responsibilities (e.g. NAAC Coordinator, IQAC Member) assigned by HOD, Principal, HR, or System Admin.</w:t>
+      </w:r>
+    </w:p>
+    <w:p>
+      <w:pPr>
+        <w:pStyle w:val="ListBullet"/>
+        <w:spacing w:after="60"/>
+      </w:pPr>
+      <w:r>
+        <w:rPr>
+          <w:rFonts w:ascii="Times New Roman" w:hAnsi="Times New Roman"/>
+          <w:b/>
+          <w:color w:val="0369A1"/>
+          <w:sz w:val="22"/>
+        </w:rPr>
+        <w:t xml:space="preserve">Workflow 1.11 — Club Coordinator Sub-Portal Workflow (/activities/clubs): </w:t>
+      </w:r>
+      <w:r>
+        <w:rPr>
+          <w:rFonts w:ascii="Times New Roman" w:hAnsi="Times New Roman"/>
+          <w:sz w:val="20"/>
+        </w:rPr>
+        <w:t>Faculty designated as Club Coordinators or Co-Coordinators access the Club Module to create club events, upload student participant rosters, log guest lectures, track budget utilization, and generate club annual activity dossiers.</w:t>
+      </w:r>
+    </w:p>
+    <w:p>
+      <w:pPr>
+        <w:pStyle w:val="ListBullet"/>
+        <w:spacing w:after="60"/>
+      </w:pPr>
+      <w:r>
+        <w:rPr>
+          <w:rFonts w:ascii="Times New Roman" w:hAnsi="Times New Roman"/>
+          <w:b/>
+          <w:color w:val="0369A1"/>
+          <w:sz w:val="22"/>
+        </w:rPr>
+        <w:t xml:space="preserve">Workflow 1.12 — Annual Faculty Performance Index (FPI) Self-Appraisal Submission (/appraisal): </w:t>
+      </w:r>
+      <w:r>
+        <w:rPr>
+          <w:rFonts w:ascii="Times New Roman" w:hAnsi="Times New Roman"/>
+          <w:sz w:val="20"/>
+        </w:rPr>
+        <w:t>Faculty opens the Appraisal Form. The system auto-selects the completed academic year (2025-2026) and automatically calculates scores based on logged portal data: PART A (Teaching &amp; Learning, max 60), PART B (Professional Development &amp; Certifications, max 40), PART C (R&amp;D, Grants &amp; Publications, max 80), and PART D (Institutional &amp; Departmental Responsibilities, max 20). Faculty verifies all auto-mapped proof documents via 👁️ View Proof buttons, sets future goals, applies self-score justifications if needed, and clicks 'Submit FPI Form' (Status becomes 'Submitted').</w:t>
+      </w:r>
+    </w:p>
+    <w:p>
+      <w:pPr>
+        <w:pStyle w:val="ListBullet"/>
+        <w:spacing w:after="60"/>
+      </w:pPr>
+      <w:r>
+        <w:rPr>
+          <w:rFonts w:ascii="Times New Roman" w:hAnsi="Times New Roman"/>
+          <w:b/>
+          <w:color w:val="0369A1"/>
+          <w:sz w:val="22"/>
+        </w:rPr>
+        <w:t xml:space="preserve">Workflow 1.13 — 1-Click AI CV &amp; Bio-Data Generator Engine (/cv-generator): </w:t>
+      </w:r>
+      <w:r>
+        <w:rPr>
+          <w:rFonts w:ascii="Times New Roman" w:hAnsi="Times New Roman"/>
+          <w:sz w:val="20"/>
+        </w:rPr>
+        <w:t>Faculty opens the AI CV Generator to compile a comprehensive, industry-grade bio-data. Selects from 3 standardized institutional templates: (1) SREC Official Letterhead, (2) AICTE / Anna University Statutory Format, (3) Modern Technical Europass. Faculty selects AI Summary tone (Executive, Research-heavy, Teaching-focused), toggles section visibility, and exports vector-sharp PDF documents.</w:t>
+      </w:r>
+    </w:p>
+    <w:p>
+      <w:pPr>
+        <w:pStyle w:val="ListBullet"/>
+        <w:spacing w:after="60"/>
+      </w:pPr>
+      <w:r>
+        <w:rPr>
+          <w:rFonts w:ascii="Times New Roman" w:hAnsi="Times New Roman"/>
+          <w:b/>
+          <w:color w:val="0369A1"/>
+          <w:sz w:val="22"/>
+        </w:rPr>
+        <w:t xml:space="preserve">Workflow 1.14 — Self Academic Dossier &amp; Multi-Format Report Generation (/reports): </w:t>
+      </w:r>
+      <w:r>
+        <w:rPr>
+          <w:rFonts w:ascii="Times New Roman" w:hAnsi="Times New Roman"/>
+          <w:sz w:val="20"/>
+        </w:rPr>
+        <w:t>Faculty accesses Reports to generate aggregated dossiers, Excel matrices, and complete ZIP packages of all uploaded document evidence for promotions, accreditation, or annual reviews.</w:t>
+      </w:r>
+    </w:p>
+    <w:p>
+      <w:pPr>
+        <w:pStyle w:val="ListBullet"/>
+        <w:spacing w:after="60"/>
+      </w:pPr>
+      <w:r>
+        <w:rPr>
+          <w:rFonts w:ascii="Times New Roman" w:hAnsi="Times New Roman"/>
+          <w:b/>
+          <w:color w:val="0369A1"/>
+          <w:sz w:val="22"/>
+        </w:rPr>
+        <w:t xml:space="preserve">Workflow 1.15 — Settings &amp; Automated White Background Profile Picture Standardization (/settings): </w:t>
+      </w:r>
+      <w:r>
+        <w:rPr>
+          <w:rFonts w:ascii="Times New Roman" w:hAnsi="Times New Roman"/>
+          <w:sz w:val="20"/>
+        </w:rPr>
+        <w:t>Faculty uploads profile photos in Settings. The backend automatically processes images using AI portrait segmentation (rembg) to isolate the portrait and standardize the background to solid white (#FFFFFF), automatically updating the avatar across Navbar, Dashboard, and CV.</w:t>
+      </w:r>
+    </w:p>
+    <w:p>
+      <w:pPr>
+        <w:pStyle w:val="ListBullet"/>
+        <w:spacing w:after="60"/>
+      </w:pPr>
+      <w:r>
+        <w:rPr>
+          <w:rFonts w:ascii="Times New Roman" w:hAnsi="Times New Roman"/>
+          <w:b/>
+          <w:color w:val="0369A1"/>
+          <w:sz w:val="22"/>
+        </w:rPr>
+        <w:t xml:space="preserve">Workflow 1.16 — Real-Time Web Push Notification Subscription: </w:t>
+      </w:r>
+      <w:r>
+        <w:rPr>
+          <w:rFonts w:ascii="Times New Roman" w:hAnsi="Times New Roman"/>
+          <w:sz w:val="20"/>
+        </w:rPr>
+        <w:t>Faculty clicks the Notification Bell in the Navbar to enroll the browser/mobile device for instant Web Push Notifications via Service Worker, receiving real-time alerts on appraisal status updates, HOD feedback, and administrative circulars.</w:t>
       </w:r>
     </w:p>
     <w:p>
       <w:pPr>
         <w:keepNext/>
-        <w:spacing w:before="320" w:after="120"/>
+        <w:spacing w:before="240" w:after="120"/>
       </w:pPr>
       <w:r>
         <w:rPr>
@@ -664,7 +1609,7 @@
                 <w:rFonts w:ascii="Times New Roman" w:hAnsi="Times New Roman"/>
                 <w:b/>
                 <w:color w:val="0F331F"/>
-                <w:sz w:val="28"/>
+                <w:sz w:val="26"/>
               </w:rPr>
               <w:t>ARCHITECTURAL FLOW: FACULTY ANNUAL FPI APPRAISAL SELF-SUBMISSION PROCESS</w:t>
               <w:br/>
@@ -679,7 +1624,7 @@
                 <w:rFonts w:ascii="Times New Roman" w:hAnsi="Times New Roman"/>
                 <w:b/>
                 <w:color w:val="0369A1"/>
-                <w:sz w:val="28"/>
+                <w:sz w:val="22"/>
               </w:rPr>
               <w:t xml:space="preserve">► Step 1: </w:t>
             </w:r>
@@ -687,9 +1632,9 @@
               <w:rPr>
                 <w:rFonts w:ascii="Times New Roman" w:hAnsi="Times New Roman"/>
                 <w:color w:val="1E293B"/>
-                <w:sz w:val="28"/>
+                <w:sz w:val="22"/>
               </w:rPr>
-              <w:t>Faculty accesses /appraisal for completed academic year (2025-2026).</w:t>
+              <w:t>Faculty navigates to /appraisal for the active academic evaluation cycle (2025-2026).</w:t>
             </w:r>
           </w:p>
           <w:p>
@@ -702,7 +1647,7 @@
                 <w:rFonts w:ascii="Times New Roman" w:hAnsi="Times New Roman"/>
                 <w:b/>
                 <w:color w:val="0F766E"/>
-                <w:sz w:val="28"/>
+                <w:sz w:val="24"/>
               </w:rPr>
               <w:t>│</w:t>
               <w:br/>
@@ -718,7 +1663,7 @@
                 <w:rFonts w:ascii="Times New Roman" w:hAnsi="Times New Roman"/>
                 <w:b/>
                 <w:color w:val="0369A1"/>
-                <w:sz w:val="28"/>
+                <w:sz w:val="22"/>
               </w:rPr>
               <w:t xml:space="preserve">► Step 2: </w:t>
             </w:r>
@@ -726,9 +1671,9 @@
               <w:rPr>
                 <w:rFonts w:ascii="Times New Roman" w:hAnsi="Times New Roman"/>
                 <w:color w:val="1E293B"/>
-                <w:sz w:val="28"/>
+                <w:sz w:val="22"/>
               </w:rPr>
-              <w:t>Engine auto-fetches logged portal data (Pass %, Feedback, FDPs, Publications, Grants, Responsibilities).</w:t>
+              <w:t>Appraisal Engine auto-aggregates all logged records (Pass %, Feedback, FDPs, Publications, Grants, Assigned Responsibilities).</w:t>
             </w:r>
           </w:p>
           <w:p>
@@ -741,7 +1686,7 @@
                 <w:rFonts w:ascii="Times New Roman" w:hAnsi="Times New Roman"/>
                 <w:b/>
                 <w:color w:val="0F766E"/>
-                <w:sz w:val="28"/>
+                <w:sz w:val="24"/>
               </w:rPr>
               <w:t>│</w:t>
               <w:br/>
@@ -757,7 +1702,7 @@
                 <w:rFonts w:ascii="Times New Roman" w:hAnsi="Times New Roman"/>
                 <w:b/>
                 <w:color w:val="0369A1"/>
-                <w:sz w:val="28"/>
+                <w:sz w:val="22"/>
               </w:rPr>
               <w:t xml:space="preserve">► Step 3: </w:t>
             </w:r>
@@ -765,9 +1710,9 @@
               <w:rPr>
                 <w:rFonts w:ascii="Times New Roman" w:hAnsi="Times New Roman"/>
                 <w:color w:val="1E293B"/>
-                <w:sz w:val="28"/>
+                <w:sz w:val="22"/>
               </w:rPr>
-              <w:t>System calculates auto-mapped scores across PART A (Max 60), PART B (Max 40), PART C (Max 80), PART D (Max 20).</w:t>
+              <w:t>System computes auto-calculated marks across PART A (Max 60), PART B (Max 40), PART C (Max 80), PART D (Max 20).</w:t>
             </w:r>
           </w:p>
           <w:p>
@@ -780,7 +1725,7 @@
                 <w:rFonts w:ascii="Times New Roman" w:hAnsi="Times New Roman"/>
                 <w:b/>
                 <w:color w:val="0F766E"/>
-                <w:sz w:val="28"/>
+                <w:sz w:val="24"/>
               </w:rPr>
               <w:t>│</w:t>
               <w:br/>
@@ -796,7 +1741,7 @@
                 <w:rFonts w:ascii="Times New Roman" w:hAnsi="Times New Roman"/>
                 <w:b/>
                 <w:color w:val="0369A1"/>
-                <w:sz w:val="28"/>
+                <w:sz w:val="22"/>
               </w:rPr>
               <w:t xml:space="preserve">► Step 4: </w:t>
             </w:r>
@@ -804,9 +1749,9 @@
               <w:rPr>
                 <w:rFonts w:ascii="Times New Roman" w:hAnsi="Times New Roman"/>
                 <w:color w:val="1E293B"/>
-                <w:sz w:val="28"/>
+                <w:sz w:val="22"/>
               </w:rPr>
-              <w:t>Faculty inspects auto-mapped proof documents via 👁️ View Proof buttons.</w:t>
+              <w:t>Faculty reviews claimed activities and verifies attached documents using 👁️ View Proof buttons.</w:t>
             </w:r>
           </w:p>
           <w:p>
@@ -819,7 +1764,7 @@
                 <w:rFonts w:ascii="Times New Roman" w:hAnsi="Times New Roman"/>
                 <w:b/>
                 <w:color w:val="0F766E"/>
-                <w:sz w:val="28"/>
+                <w:sz w:val="24"/>
               </w:rPr>
               <w:t>│</w:t>
               <w:br/>
@@ -835,7 +1780,7 @@
                 <w:rFonts w:ascii="Times New Roman" w:hAnsi="Times New Roman"/>
                 <w:b/>
                 <w:color w:val="0369A1"/>
-                <w:sz w:val="28"/>
+                <w:sz w:val="22"/>
               </w:rPr>
               <w:t xml:space="preserve">► Step 5: </w:t>
             </w:r>
@@ -843,9 +1788,9 @@
               <w:rPr>
                 <w:rFonts w:ascii="Times New Roman" w:hAnsi="Times New Roman"/>
                 <w:color w:val="1E293B"/>
-                <w:sz w:val="28"/>
+                <w:sz w:val="22"/>
               </w:rPr>
-              <w:t>Faculty fills goals for next year, signs form, and clicks 'Submit FPI Form' (Status set to 'Submitted').</w:t>
+              <w:t>Faculty enters next-year professional goals, digitally signs the declaration, and clicks 'Submit FPI Form' (Status -&gt; 'Submitted').</w:t>
             </w:r>
           </w:p>
         </w:tc>
@@ -853,7 +1798,7 @@
     </w:tbl>
     <w:p>
       <w:pPr>
-        <w:spacing w:after="160"/>
+        <w:spacing w:after="120"/>
       </w:pPr>
     </w:p>
     <w:p>
@@ -868,7 +1813,7 @@
           <w:color w:val="0F172A"/>
           <w:sz w:val="32"/>
         </w:rPr>
-        <w:t>3. Portal 2 — Department Admin &amp; HOD Portal Workflow (role: 'dept_admin', isHod: true)</w:t>
+        <w:t>3. Portal 2 — Department Admin &amp; HOD Portal Structural Workflow</w:t>
       </w:r>
     </w:p>
     <w:p>
@@ -878,103 +1823,191 @@
       <w:r>
         <w:rPr>
           <w:rFonts w:ascii="Times New Roman" w:hAnsi="Times New Roman"/>
-          <w:sz w:val="28"/>
+          <w:sz w:val="22"/>
         </w:rPr>
-        <w:t>The Department Admin &amp; HOD Portal provides departmental oversight, read-only faculty verification, departmental duty assignment, Part-by-Part appraisal evaluation, and departmental report exports.</w:t>
+        <w:t>Portal 2 is tailored for Department Heads (HODs) and Department Administrators. It provides specialized tools for departmental governance, read-only faculty verification, departmental duty assignments, Part-by-Part appraisal scoring, batch sign-off, and aggregated departmental dossier reporting.</w:t>
       </w:r>
     </w:p>
     <w:p>
       <w:pPr>
         <w:pStyle w:val="ListBullet"/>
-        <w:spacing w:after="80"/>
+        <w:spacing w:after="60"/>
       </w:pPr>
       <w:r>
         <w:rPr>
           <w:rFonts w:ascii="Times New Roman" w:hAnsi="Times New Roman"/>
           <w:b/>
           <w:color w:val="0F331F"/>
-          <w:sz w:val="28"/>
+          <w:sz w:val="22"/>
         </w:rPr>
-        <w:t xml:space="preserve">Workflow 2.1 — Department Faculty Directory &amp; Read-Only Profile Verification: </w:t>
+        <w:t xml:space="preserve">Workflow 2.1 — Departmental Dashboard &amp; Real-Time Analytics: </w:t>
       </w:r>
       <w:r>
         <w:rPr>
           <w:rFonts w:ascii="Times New Roman" w:hAnsi="Times New Roman"/>
-          <w:sz w:val="28"/>
+          <w:sz w:val="20"/>
         </w:rPr>
-        <w:t>HOD/Dept Admin accesses Faculty Directory (/admin/faculty) to view department faculty listings with access to 'View Dossier' and 'Docs' ZIP downloads. HR service certificates (Experience, Salary, Relieving) are restricted exclusively to System/Executive Admins. Opens Personal Details (/profile/personal) to inspect DOB, Gender, Mobile, PAN, Aadhaar, and Address. All input fields are explicitly disabled (disabled={auth.role === 'dept_admin'}) to prevent unauthorized editing.</w:t>
+        <w:t>HOD logs in to view department-specific analytics: total faculty strength, active research projects, total grant funds sanctioned, publication indexing breakdown (SCI vs. Scopus), and appraisal submission status progress bars.</w:t>
       </w:r>
     </w:p>
     <w:p>
       <w:pPr>
         <w:pStyle w:val="ListBullet"/>
-        <w:spacing w:after="80"/>
+        <w:spacing w:after="60"/>
       </w:pPr>
       <w:r>
         <w:rPr>
           <w:rFonts w:ascii="Times New Roman" w:hAnsi="Times New Roman"/>
           <w:b/>
           <w:color w:val="0F331F"/>
-          <w:sz w:val="28"/>
+          <w:sz w:val="22"/>
         </w:rPr>
-        <w:t xml:space="preserve">Workflow 2.2 — Department Additional Responsibilities Assignment: </w:t>
+        <w:t xml:space="preserve">Workflow 2.2 — Faculty Directory &amp; Read-Only Profile Inspection (/admin/faculty): </w:t>
       </w:r>
       <w:r>
         <w:rPr>
           <w:rFonts w:ascii="Times New Roman" w:hAnsi="Times New Roman"/>
-          <w:sz w:val="28"/>
+          <w:sz w:val="20"/>
         </w:rPr>
-        <w:t>HOD accesses /responsibilities to assign official departmental additional duties (e.g. Class Advisor, Lab In-charge, Accreditation Coordinator) to department faculty members.</w:t>
+        <w:t>HOD views all department faculty members with access to 'View Dossier' and 'Docs' ZIP packages. To prevent unauthorized alterations, all form input fields in personal and academic profiles are strictly locked in read-only mode (disabled={auth.role === 'dept_admin'}). Sensitive HR documents (salary slips, relieving letters) are hidden from HOD view.</w:t>
       </w:r>
     </w:p>
     <w:p>
       <w:pPr>
         <w:pStyle w:val="ListBullet"/>
-        <w:spacing w:after="80"/>
+        <w:spacing w:after="60"/>
       </w:pPr>
       <w:r>
         <w:rPr>
           <w:rFonts w:ascii="Times New Roman" w:hAnsi="Times New Roman"/>
           <w:b/>
           <w:color w:val="0F331F"/>
-          <w:sz w:val="28"/>
+          <w:sz w:val="22"/>
         </w:rPr>
-        <w:t xml:space="preserve">Workflow 2.3 — HOD Annual Appraisal Review, Part-by-Part Evaluation &amp; Bulk Sign/Approval: </w:t>
+        <w:t xml:space="preserve">Workflow 2.3 — Departmental Additional Responsibilities Assignment (/responsibilities): </w:t>
       </w:r>
       <w:r>
         <w:rPr>
           <w:rFonts w:ascii="Times New Roman" w:hAnsi="Times New Roman"/>
-          <w:sz w:val="28"/>
+          <w:sz w:val="20"/>
         </w:rPr>
-        <w:t>HOD opens Appraisal Form (/appraisal) and monitors pending department submissions (status === 'Submitted'). Opens Auto-Mapped Activity Verification Panel and clicks 👁️ View Proof next to publications, grants, patents, certifications, and events to inspect original uploaded evidence. For individual reviews, opens evaluation modal, enters HOD evaluated scores for PART A, B, C, D, adds feedback remarks, and clicks 'Approve &amp; Forward to Principal/HR'. For batch actions, HOD selects multiple or all pending forms via checkboxes, clicks '✍️ Sign &amp; Approve Selected', inspects the digital signature credentials (signer name, ISO timestamp, client IP), confirms bulk remarks, and submits in one step. Form status updates to 'HOD Approved' and notification emails are dispatched to faculty.</w:t>
+        <w:t>HOD assigns department-level responsibilities (e.g. Class Advisor, Laboratory In-charge, Accreditation Criteria In-charge, Timetable In-charge, Placement Coordinator) to department faculty, specifying tenure and academic year.</w:t>
       </w:r>
     </w:p>
     <w:p>
       <w:pPr>
         <w:pStyle w:val="ListBullet"/>
-        <w:spacing w:after="80"/>
+        <w:spacing w:after="60"/>
       </w:pPr>
       <w:r>
         <w:rPr>
           <w:rFonts w:ascii="Times New Roman" w:hAnsi="Times New Roman"/>
           <w:b/>
           <w:color w:val="0F331F"/>
-          <w:sz w:val="28"/>
+          <w:sz w:val="22"/>
         </w:rPr>
-        <w:t xml:space="preserve">Workflow 2.4 — Departmental Report &amp; Dossier Generation: </w:t>
+        <w:t xml:space="preserve">Workflow 2.4 — Annual Performance Appraisal Review &amp; Part-by-Part Evaluation (/appraisal): </w:t>
       </w:r>
       <w:r>
         <w:rPr>
           <w:rFonts w:ascii="Times New Roman" w:hAnsi="Times New Roman"/>
-          <w:sz w:val="28"/>
+          <w:sz w:val="20"/>
         </w:rPr>
-        <w:t>HOD accesses Reports (/reports) to generate department-wide activity summaries, publication dossiers, and appraisal evaluation reports in PDF, Excel, and ZIP formats.</w:t>
+        <w:t>HOD monitors pending submissions (status === 'Submitted') from department faculty. HOD opens the Part-by-Part evaluation modal to inspect self-claimed scores against actual uploaded proofs, enters HOD evaluated scores for PART A, PART B, PART C, and PART D, provides qualitative comments, and clicks 'Approve &amp; Forward to Principal/HR'.</w:t>
+      </w:r>
+    </w:p>
+    <w:p>
+      <w:pPr>
+        <w:pStyle w:val="ListBullet"/>
+        <w:spacing w:after="60"/>
+      </w:pPr>
+      <w:r>
+        <w:rPr>
+          <w:rFonts w:ascii="Times New Roman" w:hAnsi="Times New Roman"/>
+          <w:b/>
+          <w:color w:val="0F331F"/>
+          <w:sz w:val="22"/>
+        </w:rPr>
+        <w:t xml:space="preserve">Workflow 2.5 — Auto-Mapped Activity Verification &amp; Evidence Inspection: </w:t>
+      </w:r>
+      <w:r>
+        <w:rPr>
+          <w:rFonts w:ascii="Times New Roman" w:hAnsi="Times New Roman"/>
+          <w:sz w:val="20"/>
+        </w:rPr>
+        <w:t>Within the appraisal interface, HOD inspects original uploaded proofs (journal PDFs, grant sanction orders, patent certificates, FDP certificates) by clicking 👁️ View Proof next to each mapped claim, guaranteeing strict audit compliance.</w:t>
+      </w:r>
+    </w:p>
+    <w:p>
+      <w:pPr>
+        <w:pStyle w:val="ListBullet"/>
+        <w:spacing w:after="60"/>
+      </w:pPr>
+      <w:r>
+        <w:rPr>
+          <w:rFonts w:ascii="Times New Roman" w:hAnsi="Times New Roman"/>
+          <w:b/>
+          <w:color w:val="0F331F"/>
+          <w:sz w:val="22"/>
+        </w:rPr>
+        <w:t xml:space="preserve">Workflow 2.6 — Batch Processing &amp; Bulk Sign/Approval Workflow (✍️ Sign &amp; Approve Selected): </w:t>
+      </w:r>
+      <w:r>
+        <w:rPr>
+          <w:rFonts w:ascii="Times New Roman" w:hAnsi="Times New Roman"/>
+          <w:sz w:val="20"/>
+        </w:rPr>
+        <w:t>For efficient department-wide processing, HOD selects multiple or all pending forms via checkboxes and clicks '✍️ Sign &amp; Approve Selected'. The system opens the Digital Signature Modal displaying signer credentials (HOD name, ISO timestamp, client IP address), applies bulk remarks, and submits in a single batch (/api/faculty/appraisals/bulk-hod-sign-approve). Status transitions to 'HOD Approved' and notification emails/pushes are sent to faculty.</w:t>
+      </w:r>
+    </w:p>
+    <w:p>
+      <w:pPr>
+        <w:pStyle w:val="ListBullet"/>
+        <w:spacing w:after="60"/>
+      </w:pPr>
+      <w:r>
+        <w:rPr>
+          <w:rFonts w:ascii="Times New Roman" w:hAnsi="Times New Roman"/>
+          <w:b/>
+          <w:color w:val="0F331F"/>
+          <w:sz w:val="22"/>
+        </w:rPr>
+        <w:t xml:space="preserve">Workflow 2.7 — Form Rejection &amp; Revision Return Loop (Returned for Correction): </w:t>
+      </w:r>
+      <w:r>
+        <w:rPr>
+          <w:rFonts w:ascii="Times New Roman" w:hAnsi="Times New Roman"/>
+          <w:sz w:val="20"/>
+        </w:rPr>
+        <w:t>If discrepancies or missing proof files are detected, HOD can return the appraisal to the faculty member with specific revision notes. Form status updates to 'Returned for Correction', unlocking the form for faculty edits.</w:t>
+      </w:r>
+    </w:p>
+    <w:p>
+      <w:pPr>
+        <w:pStyle w:val="ListBullet"/>
+        <w:spacing w:after="60"/>
+      </w:pPr>
+      <w:r>
+        <w:rPr>
+          <w:rFonts w:ascii="Times New Roman" w:hAnsi="Times New Roman"/>
+          <w:b/>
+          <w:color w:val="0F331F"/>
+          <w:sz w:val="22"/>
+        </w:rPr>
+        <w:t xml:space="preserve">Workflow 2.8 — Department-Wide Dossier &amp; Accreditation Report Generation (/reports): </w:t>
+      </w:r>
+      <w:r>
+        <w:rPr>
+          <w:rFonts w:ascii="Times New Roman" w:hAnsi="Times New Roman"/>
+          <w:sz w:val="20"/>
+        </w:rPr>
+        <w:t>HOD generates consolidated department reports: NBA / NAAC criteria matrices, annual publication dossiers, funded project portfolios, and departmental appraisal summary sheets in PDF and Excel formats.</w:t>
       </w:r>
     </w:p>
     <w:p>
       <w:pPr>
         <w:keepNext/>
-        <w:spacing w:before="320" w:after="120"/>
+        <w:spacing w:before="240" w:after="120"/>
       </w:pPr>
       <w:r>
         <w:rPr>
@@ -1025,7 +2058,7 @@
                 <w:rFonts w:ascii="Times New Roman" w:hAnsi="Times New Roman"/>
                 <w:b/>
                 <w:color w:val="0F331F"/>
-                <w:sz w:val="28"/>
+                <w:sz w:val="26"/>
               </w:rPr>
               <w:t>ARCHITECTURAL FLOW: HOD PART-BY-PART APPRAISAL VERIFICATION &amp; BULK SCORE EVALUATION</w:t>
               <w:br/>
@@ -1040,7 +2073,7 @@
                 <w:rFonts w:ascii="Times New Roman" w:hAnsi="Times New Roman"/>
                 <w:b/>
                 <w:color w:val="0369A1"/>
-                <w:sz w:val="28"/>
+                <w:sz w:val="22"/>
               </w:rPr>
               <w:t xml:space="preserve">► Step 1: </w:t>
             </w:r>
@@ -1048,9 +2081,9 @@
               <w:rPr>
                 <w:rFonts w:ascii="Times New Roman" w:hAnsi="Times New Roman"/>
                 <w:color w:val="1E293B"/>
-                <w:sz w:val="28"/>
+                <w:sz w:val="22"/>
               </w:rPr>
-              <w:t>HOD monitors department submissions queue (Status: 'Submitted').</w:t>
+              <w:t>HOD monitors department submissions queue at /appraisal (Status: 'Submitted').</w:t>
             </w:r>
           </w:p>
           <w:p>
@@ -1063,7 +2096,7 @@
                 <w:rFonts w:ascii="Times New Roman" w:hAnsi="Times New Roman"/>
                 <w:b/>
                 <w:color w:val="0F766E"/>
-                <w:sz w:val="28"/>
+                <w:sz w:val="24"/>
               </w:rPr>
               <w:t>│</w:t>
               <w:br/>
@@ -1079,7 +2112,7 @@
                 <w:rFonts w:ascii="Times New Roman" w:hAnsi="Times New Roman"/>
                 <w:b/>
                 <w:color w:val="0369A1"/>
-                <w:sz w:val="28"/>
+                <w:sz w:val="22"/>
               </w:rPr>
               <w:t xml:space="preserve">► Step 2: </w:t>
             </w:r>
@@ -1087,9 +2120,9 @@
               <w:rPr>
                 <w:rFonts w:ascii="Times New Roman" w:hAnsi="Times New Roman"/>
                 <w:color w:val="1E293B"/>
-                <w:sz w:val="28"/>
+                <w:sz w:val="22"/>
               </w:rPr>
-              <w:t>HOD verifies uploaded evidence via 👁️ View Proof or selects multiple pending forms in bulk.</w:t>
+              <w:t>HOD inspects attached evidence for all claimed activities via 👁️ View Proof.</w:t>
             </w:r>
           </w:p>
           <w:p>
@@ -1102,7 +2135,7 @@
                 <w:rFonts w:ascii="Times New Roman" w:hAnsi="Times New Roman"/>
                 <w:b/>
                 <w:color w:val="0F766E"/>
-                <w:sz w:val="28"/>
+                <w:sz w:val="24"/>
               </w:rPr>
               <w:t>│</w:t>
               <w:br/>
@@ -1118,7 +2151,7 @@
                 <w:rFonts w:ascii="Times New Roman" w:hAnsi="Times New Roman"/>
                 <w:b/>
                 <w:color w:val="0369A1"/>
-                <w:sz w:val="28"/>
+                <w:sz w:val="22"/>
               </w:rPr>
               <w:t xml:space="preserve">► Step 3: </w:t>
             </w:r>
@@ -1126,9 +2159,9 @@
               <w:rPr>
                 <w:rFonts w:ascii="Times New Roman" w:hAnsi="Times New Roman"/>
                 <w:color w:val="1E293B"/>
-                <w:sz w:val="28"/>
+                <w:sz w:val="22"/>
               </w:rPr>
-              <w:t>HOD executes individual Part-by-Part evaluation or batch digital signing via /api/faculty/appraisals/bulk-hod-sign-approve.</w:t>
+              <w:t>HOD executes individual Part-by-Part scoring or initiates batch processing via '✍️ Sign &amp; Approve Selected'.</w:t>
             </w:r>
           </w:p>
           <w:p>
@@ -1141,7 +2174,7 @@
                 <w:rFonts w:ascii="Times New Roman" w:hAnsi="Times New Roman"/>
                 <w:b/>
                 <w:color w:val="0F766E"/>
-                <w:sz w:val="28"/>
+                <w:sz w:val="24"/>
               </w:rPr>
               <w:t>│</w:t>
               <w:br/>
@@ -1157,7 +2190,7 @@
                 <w:rFonts w:ascii="Times New Roman" w:hAnsi="Times New Roman"/>
                 <w:b/>
                 <w:color w:val="0369A1"/>
-                <w:sz w:val="28"/>
+                <w:sz w:val="22"/>
               </w:rPr>
               <w:t xml:space="preserve">► Step 4: </w:t>
             </w:r>
@@ -1165,9 +2198,9 @@
               <w:rPr>
                 <w:rFonts w:ascii="Times New Roman" w:hAnsi="Times New Roman"/>
                 <w:color w:val="1E293B"/>
-                <w:sz w:val="28"/>
+                <w:sz w:val="22"/>
               </w:rPr>
-              <w:t>System records official digital signature timestamps, IP address, and HOD remarks.</w:t>
+              <w:t>System records official digital signature (HOD name, timestamp, client IP) and applies evaluation remarks.</w:t>
             </w:r>
           </w:p>
           <w:p>
@@ -1180,7 +2213,7 @@
                 <w:rFonts w:ascii="Times New Roman" w:hAnsi="Times New Roman"/>
                 <w:b/>
                 <w:color w:val="0F766E"/>
-                <w:sz w:val="28"/>
+                <w:sz w:val="24"/>
               </w:rPr>
               <w:t>│</w:t>
               <w:br/>
@@ -1196,7 +2229,7 @@
                 <w:rFonts w:ascii="Times New Roman" w:hAnsi="Times New Roman"/>
                 <w:b/>
                 <w:color w:val="0369A1"/>
-                <w:sz w:val="28"/>
+                <w:sz w:val="22"/>
               </w:rPr>
               <w:t xml:space="preserve">► Step 5: </w:t>
             </w:r>
@@ -1204,9 +2237,9 @@
               <w:rPr>
                 <w:rFonts w:ascii="Times New Roman" w:hAnsi="Times New Roman"/>
                 <w:color w:val="1E293B"/>
-                <w:sz w:val="28"/>
+                <w:sz w:val="22"/>
               </w:rPr>
-              <w:t>System updates appraisal status to 'HOD Approved' and forwards queue to Principal/HR.</w:t>
+              <w:t>Appraisal status transitions to 'HOD Approved' and forwards the form to the Principal/Executive queue.</w:t>
             </w:r>
           </w:p>
         </w:tc>
@@ -1214,7 +2247,7 @@
     </w:tbl>
     <w:p>
       <w:pPr>
-        <w:spacing w:after="160"/>
+        <w:spacing w:after="120"/>
       </w:pPr>
     </w:p>
     <w:p>
@@ -1229,7 +2262,7 @@
           <w:color w:val="0F172A"/>
           <w:sz w:val="32"/>
         </w:rPr>
-        <w:t>4. Portal 3 — System Admin &amp; Executive Portal Workflow (role: 'admin', 'principal', 'hr')</w:t>
+        <w:t>4. Portal 3 — System Admin &amp; Executive Portal Structural Workflow</w:t>
       </w:r>
     </w:p>
     <w:p>
@@ -1239,147 +2272,191 @@
       <w:r>
         <w:rPr>
           <w:rFonts w:ascii="Times New Roman" w:hAnsi="Times New Roman"/>
-          <w:sz w:val="28"/>
+          <w:sz w:val="22"/>
         </w:rPr>
-        <w:t>The System Admin &amp; Executive Portal equips Principal, HR, and System Administrators with institution-wide administration, full CRUD control, dynamic form building, appraisal rubric customization, final executive appraisal approval (individual &amp; bulk), and faculty transfer execution.</w:t>
+        <w:t>Portal 3 equips the Principal, Human Resources, and System Administrators with institution-wide control, full CRUD user management, dynamic form construction, appraisal rubric configurability, multi-mode bulk sign-offs, and automated faculty department transfer execution.</w:t>
       </w:r>
     </w:p>
     <w:p>
       <w:pPr>
         <w:pStyle w:val="ListBullet"/>
-        <w:spacing w:after="80"/>
+        <w:spacing w:after="60"/>
       </w:pPr>
       <w:r>
         <w:rPr>
           <w:rFonts w:ascii="Times New Roman" w:hAnsi="Times New Roman"/>
           <w:b/>
           <w:color w:val="B91C1C"/>
-          <w:sz w:val="28"/>
+          <w:sz w:val="22"/>
         </w:rPr>
-        <w:t xml:space="preserve">Workflow 3.1 — Institution User Management &amp; Full Profile CRUD: </w:t>
+        <w:t xml:space="preserve">Workflow 3.1 — Executive Institutional Dashboard &amp; Accreditation Suite (/accreditation-suite): </w:t>
       </w:r>
       <w:r>
         <w:rPr>
           <w:rFonts w:ascii="Times New Roman" w:hAnsi="Times New Roman"/>
-          <w:sz w:val="28"/>
+          <w:sz w:val="20"/>
         </w:rPr>
-        <w:t>Admin accesses System Admins (/admin/system-admins), Dept Admins (/admin/dept-admins), Faculty Directory (/admin/faculty), and Club Coordinators (/admin/clubs). Has full permission to edit personal/academic details, update designations, reset credentials, assign Coordinators &amp; Co-Coordinators, or mark faculty as relieved (is_relieved === 1).</w:t>
+        <w:t>Executive Admins access institution-wide analytics and real-time NBA / NAAC compliance scorecards. Visualizes department-by-department comparisons, grant inflows, Ph.D. completions, and total institutional publications.</w:t>
       </w:r>
     </w:p>
     <w:p>
       <w:pPr>
         <w:pStyle w:val="ListBullet"/>
-        <w:spacing w:after="80"/>
+        <w:spacing w:after="60"/>
       </w:pPr>
       <w:r>
         <w:rPr>
           <w:rFonts w:ascii="Times New Roman" w:hAnsi="Times New Roman"/>
           <w:b/>
           <w:color w:val="B91C1C"/>
-          <w:sz w:val="28"/>
+          <w:sz w:val="22"/>
         </w:rPr>
-        <w:t xml:space="preserve">Workflow 3.2 — Institutional Responsibilities Assignment: </w:t>
+        <w:t xml:space="preserve">Workflow 3.2 — Institution-Wide User Management &amp; Full Administrative CRUD: </w:t>
       </w:r>
       <w:r>
         <w:rPr>
           <w:rFonts w:ascii="Times New Roman" w:hAnsi="Times New Roman"/>
-          <w:sz w:val="28"/>
+          <w:sz w:val="20"/>
         </w:rPr>
-        <w:t>Principal/HR/Admin accesses /responsibilities to assign institution-level additional responsibilities (e.g. NAAC Coordinator, IQAC Member, Anti-Ragging Committee) to any faculty across all departments.</w:t>
+        <w:t>Admin manages all user accounts across System Admins (/admin/system-admins), Dept Admins (/admin/dept-admins), Faculty Directory (/admin/faculty), and Club Coordinators (/admin/clubs). Admins have complete authority to create accounts, modify personal/academic details, update designations, reset passwords, and mark faculty as relieved (is_relieved === 1).</w:t>
       </w:r>
     </w:p>
     <w:p>
       <w:pPr>
         <w:pStyle w:val="ListBullet"/>
-        <w:spacing w:after="80"/>
+        <w:spacing w:after="60"/>
       </w:pPr>
       <w:r>
         <w:rPr>
           <w:rFonts w:ascii="Times New Roman" w:hAnsi="Times New Roman"/>
           <w:b/>
           <w:color w:val="B91C1C"/>
-          <w:sz w:val="28"/>
+          <w:sz w:val="22"/>
         </w:rPr>
-        <w:t xml:space="preserve">Workflow 3.3 — Dynamic Page &amp; Custom Form Builder: </w:t>
+        <w:t xml:space="preserve">Workflow 3.3 — Institution-Level Responsibilities Management (/responsibilities): </w:t>
       </w:r>
       <w:r>
         <w:rPr>
           <w:rFonts w:ascii="Times New Roman" w:hAnsi="Times New Roman"/>
-          <w:sz w:val="28"/>
+          <w:sz w:val="20"/>
         </w:rPr>
-        <w:t>Admin accesses Dynamic Page Builder (/admin/dynamic-pages) to create custom survey forms, feedback questionnaires, or data collection pages, specifying target portal visibility.</w:t>
+        <w:t>Principal/HR/Admin assigns institutional responsibilities (e.g. NAAC Steering Committee Coordinator, IQAC Director, Anti-Ragging Committee Head, Chief Warden, Controller of Examinations) to faculty across any department.</w:t>
       </w:r>
     </w:p>
     <w:p>
       <w:pPr>
         <w:pStyle w:val="ListBullet"/>
-        <w:spacing w:after="80"/>
+        <w:spacing w:after="60"/>
       </w:pPr>
       <w:r>
         <w:rPr>
           <w:rFonts w:ascii="Times New Roman" w:hAnsi="Times New Roman"/>
           <w:b/>
           <w:color w:val="B91C1C"/>
-          <w:sz w:val="28"/>
+          <w:sz w:val="22"/>
         </w:rPr>
-        <w:t xml:space="preserve">Workflow 3.4 — Appraisal Form Builder &amp; Rubric Configurator (/appraisal): </w:t>
+        <w:t xml:space="preserve">Workflow 3.4 — Dynamic Page &amp; Custom Form Builder Engine (/admin/dynamic-pages): </w:t>
       </w:r>
       <w:r>
         <w:rPr>
           <w:rFonts w:ascii="Times New Roman" w:hAnsi="Times New Roman"/>
-          <w:sz w:val="28"/>
+          <w:sz w:val="20"/>
         </w:rPr>
-        <w:t>Admin opens Form Builder tab in /appraisal to configure evaluation parameters: (a) Designation Overrides: Selects target designation (Assistant Professor, Associate Professor, Professor, Professor &amp; Head) to customize unit marks and max caps. (b) Threshold Brackets (⚙️ Config Bracket): Configures cutoff thresholds (feedback 4.0 cutoff, pass % 80% cutoff, publication splits). (c) Custom PART Addition (➕ Add New PART): Adds new evaluation sections (PART_E, PART_F) and updates titles in real time.</w:t>
+        <w:t>Admin creates custom survey forms, feedback questionnaires, or data collection pages. Admins configure form fields, validation rules, target department visibility, and role permissions dynamically without code changes.</w:t>
       </w:r>
     </w:p>
     <w:p>
       <w:pPr>
         <w:pStyle w:val="ListBullet"/>
-        <w:spacing w:after="80"/>
+        <w:spacing w:after="60"/>
       </w:pPr>
       <w:r>
         <w:rPr>
           <w:rFonts w:ascii="Times New Roman" w:hAnsi="Times New Roman"/>
           <w:b/>
           <w:color w:val="B91C1C"/>
-          <w:sz w:val="28"/>
+          <w:sz w:val="22"/>
         </w:rPr>
-        <w:t xml:space="preserve">Workflow 3.5 — Final Executive Appraisal Approval &amp; Bulk Sign-Off: </w:t>
+        <w:t xml:space="preserve">Workflow 3.5 — Appraisal Form Builder &amp; Rubric Configurator (/appraisal -&gt; Form Builder): </w:t>
       </w:r>
       <w:r>
         <w:rPr>
           <w:rFonts w:ascii="Times New Roman" w:hAnsi="Times New Roman"/>
-          <w:sz w:val="28"/>
+          <w:sz w:val="20"/>
         </w:rPr>
-        <w:t>Executive Admin reviews HOD-approved submissions (status === 'HOD Approved') or submitted forms across all departments. Inspects auto-mapped proof documents (👁️ View Proof), inputs final executive scores and remarks, and clicks 'Final Approve'. For bulk approval, Admin selects multiple submissions, opens Bulk Sign &amp; Approve Modal, selects approval mode (Auto, Final Executive Approval, or HOD Stage), applies digital signatures, and finalizes all selected records in one click. Form status updates to 'Final Approved' with automated email confirmations sent to faculty.</w:t>
+        <w:t>Admin configures master FPI evaluation rubrics: (a) Designation Overrides: Customizes unit marks and maximum caps for Assistant Professor, Associate Professor, Professor, and Professor &amp; Head; (b) Threshold Brackets: Sets cutoff criteria for student feedback (e.g. 4.0 cutoff), pass % brackets (e.g. 80% cutoff), and publication splits; (c) Custom PART Additions: Dynamically adds new evaluation sections (e.g. PART_E, PART_F) with custom titles and mark ceilings.</w:t>
       </w:r>
     </w:p>
     <w:p>
       <w:pPr>
         <w:pStyle w:val="ListBullet"/>
-        <w:spacing w:after="80"/>
+        <w:spacing w:after="60"/>
       </w:pPr>
       <w:r>
         <w:rPr>
           <w:rFonts w:ascii="Times New Roman" w:hAnsi="Times New Roman"/>
           <w:b/>
           <w:color w:val="B91C1C"/>
-          <w:sz w:val="28"/>
+          <w:sz w:val="22"/>
         </w:rPr>
-        <w:t xml:space="preserve">Workflow 3.6 — Faculty Department Transfer Execution: </w:t>
+        <w:t xml:space="preserve">Workflow 3.6 — Final Executive Appraisal Approval &amp; Institutional Bulk Sign-Off: </w:t>
       </w:r>
       <w:r>
         <w:rPr>
           <w:rFonts w:ascii="Times New Roman" w:hAnsi="Times New Roman"/>
-          <w:sz w:val="28"/>
+          <w:sz w:val="20"/>
         </w:rPr>
-        <w:t>Admin initiates faculty transfer (/api/admin/faculty/transfer). System logs audit history in staff_department_history, updates staff_academics, moves physical storage directory from /SREC/{old_dept}/{staff_id}/ to /SREC/{new_dept}/{staff_id}/, remaps DB file paths, and re-queues faculty under new HOD.</w:t>
+        <w:t>Executive Admins review HOD-approved submissions (status === 'HOD Approved') or submitted forms across all departments. Admins inspect proofs (👁️ View Proof), assign final executive scores, enter increment/promotion remarks, and finalize individual records. For bulk actions, Admin opens the Multi-Mode Bulk Sign &amp; Approve Modal (Auto-detect, Final Executive Approval, or HOD Stage bypass), applies digital signatures, and finalizes all selected records in one click (Status -&gt; 'Final Approved').</w:t>
+      </w:r>
+    </w:p>
+    <w:p>
+      <w:pPr>
+        <w:pStyle w:val="ListBullet"/>
+        <w:spacing w:after="60"/>
+      </w:pPr>
+      <w:r>
+        <w:rPr>
+          <w:rFonts w:ascii="Times New Roman" w:hAnsi="Times New Roman"/>
+          <w:b/>
+          <w:color w:val="B91C1C"/>
+          <w:sz w:val="22"/>
+        </w:rPr>
+        <w:t xml:space="preserve">Workflow 3.7 — Faculty Department Transfer Engine (/api/admin/faculty/transfer): </w:t>
+      </w:r>
+      <w:r>
+        <w:rPr>
+          <w:rFonts w:ascii="Times New Roman" w:hAnsi="Times New Roman"/>
+          <w:sz w:val="20"/>
+        </w:rPr>
+        <w:t>Admin executes atomic faculty transfers between departments. The backend records immutable audit logs in staff_department_history, updates staff_academics, moves physical storage directory from /SREC/{old_dept}/{staff_id}/ to /SREC/{new_dept}/{staff_id}/, remaps DB document paths, and re-queues the faculty member under the new department HOD.</w:t>
+      </w:r>
+    </w:p>
+    <w:p>
+      <w:pPr>
+        <w:pStyle w:val="ListBullet"/>
+        <w:spacing w:after="60"/>
+      </w:pPr>
+      <w:r>
+        <w:rPr>
+          <w:rFonts w:ascii="Times New Roman" w:hAnsi="Times New Roman"/>
+          <w:b/>
+          <w:color w:val="B91C1C"/>
+          <w:sz w:val="22"/>
+        </w:rPr>
+        <w:t xml:space="preserve">Workflow 3.8 — System Maintenance, DB Backups &amp; Institution Bulk Export: </w:t>
+      </w:r>
+      <w:r>
+        <w:rPr>
+          <w:rFonts w:ascii="Times New Roman" w:hAnsi="Times New Roman"/>
+          <w:sz w:val="20"/>
+        </w:rPr>
+        <w:t>Admin generates institution-wide bulk dossier ZIP packages containing all faculty PDF reports and document proofs, and executes database maintenance operations.</w:t>
       </w:r>
     </w:p>
     <w:p>
       <w:pPr>
         <w:keepNext/>
-        <w:spacing w:before="320" w:after="120"/>
+        <w:spacing w:before="240" w:after="120"/>
       </w:pPr>
       <w:r>
         <w:rPr>
@@ -1430,7 +2507,7 @@
                 <w:rFonts w:ascii="Times New Roman" w:hAnsi="Times New Roman"/>
                 <w:b/>
                 <w:color w:val="0F331F"/>
-                <w:sz w:val="28"/>
+                <w:sz w:val="26"/>
               </w:rPr>
               <w:t>ARCHITECTURAL FLOW: FACULTY DEPARTMENT TRANSFER &amp; DIRECTORY RELOCATION LIFECYCLE</w:t>
               <w:br/>
@@ -1445,7 +2522,7 @@
                 <w:rFonts w:ascii="Times New Roman" w:hAnsi="Times New Roman"/>
                 <w:b/>
                 <w:color w:val="0369A1"/>
-                <w:sz w:val="28"/>
+                <w:sz w:val="22"/>
               </w:rPr>
               <w:t xml:space="preserve">► Step 1: </w:t>
             </w:r>
@@ -1453,9 +2530,9 @@
               <w:rPr>
                 <w:rFonts w:ascii="Times New Roman" w:hAnsi="Times New Roman"/>
                 <w:color w:val="1E293B"/>
-                <w:sz w:val="28"/>
+                <w:sz w:val="22"/>
               </w:rPr>
-              <w:t>System Admin submits transfer request at /api/admin/faculty/transfer (Old Dept -&gt; New Dept).</w:t>
+              <w:t>System Admin initiates faculty transfer at /api/admin/faculty/transfer (Source Dept -&gt; Target Dept).</w:t>
             </w:r>
           </w:p>
           <w:p>
@@ -1468,7 +2545,7 @@
                 <w:rFonts w:ascii="Times New Roman" w:hAnsi="Times New Roman"/>
                 <w:b/>
                 <w:color w:val="0F766E"/>
-                <w:sz w:val="28"/>
+                <w:sz w:val="24"/>
               </w:rPr>
               <w:t>│</w:t>
               <w:br/>
@@ -1484,7 +2561,7 @@
                 <w:rFonts w:ascii="Times New Roman" w:hAnsi="Times New Roman"/>
                 <w:b/>
                 <w:color w:val="0369A1"/>
-                <w:sz w:val="28"/>
+                <w:sz w:val="22"/>
               </w:rPr>
               <w:t xml:space="preserve">► Step 2: </w:t>
             </w:r>
@@ -1492,9 +2569,9 @@
               <w:rPr>
                 <w:rFonts w:ascii="Times New Roman" w:hAnsi="Times New Roman"/>
                 <w:color w:val="1E293B"/>
-                <w:sz w:val="28"/>
+                <w:sz w:val="22"/>
               </w:rPr>
-              <w:t>System inserts immutable audit record in staff_department_history.</w:t>
+              <w:t>Backend creates immutable audit record in staff_department_history with effective date.</w:t>
             </w:r>
           </w:p>
           <w:p>
@@ -1507,7 +2584,7 @@
                 <w:rFonts w:ascii="Times New Roman" w:hAnsi="Times New Roman"/>
                 <w:b/>
                 <w:color w:val="0F766E"/>
-                <w:sz w:val="28"/>
+                <w:sz w:val="24"/>
               </w:rPr>
               <w:t>│</w:t>
               <w:br/>
@@ -1523,7 +2600,7 @@
                 <w:rFonts w:ascii="Times New Roman" w:hAnsi="Times New Roman"/>
                 <w:b/>
                 <w:color w:val="0369A1"/>
-                <w:sz w:val="28"/>
+                <w:sz w:val="22"/>
               </w:rPr>
               <w:t xml:space="preserve">► Step 3: </w:t>
             </w:r>
@@ -1531,9 +2608,9 @@
               <w:rPr>
                 <w:rFonts w:ascii="Times New Roman" w:hAnsi="Times New Roman"/>
                 <w:color w:val="1E293B"/>
-                <w:sz w:val="28"/>
+                <w:sz w:val="22"/>
               </w:rPr>
-              <w:t>System updates Department field in staff_academics and updates admin_dep scope if applicable.</w:t>
+              <w:t>Backend updates Department field in staff_academics and syncs admin_dep table if user held admin roles.</w:t>
             </w:r>
           </w:p>
           <w:p>
@@ -1546,7 +2623,7 @@
                 <w:rFonts w:ascii="Times New Roman" w:hAnsi="Times New Roman"/>
                 <w:b/>
                 <w:color w:val="0F766E"/>
-                <w:sz w:val="28"/>
+                <w:sz w:val="24"/>
               </w:rPr>
               <w:t>│</w:t>
               <w:br/>
@@ -1562,7 +2639,7 @@
                 <w:rFonts w:ascii="Times New Roman" w:hAnsi="Times New Roman"/>
                 <w:b/>
                 <w:color w:val="0369A1"/>
-                <w:sz w:val="28"/>
+                <w:sz w:val="22"/>
               </w:rPr>
               <w:t xml:space="preserve">► Step 4: </w:t>
             </w:r>
@@ -1570,9 +2647,9 @@
               <w:rPr>
                 <w:rFonts w:ascii="Times New Roman" w:hAnsi="Times New Roman"/>
                 <w:color w:val="1E293B"/>
-                <w:sz w:val="28"/>
+                <w:sz w:val="22"/>
               </w:rPr>
-              <w:t>Disk Mover (moveFacultyDirectory) relocates files: /SREC/OldDept/ID/ ➔ /SREC/NewDept/ID/.</w:t>
+              <w:t>Physical Disk Mover (moveFacultyDirectory) relocates files: /SREC/OldDept/ID/ ➔ /SREC/NewDept/ID/.</w:t>
             </w:r>
           </w:p>
           <w:p>
@@ -1585,7 +2662,7 @@
                 <w:rFonts w:ascii="Times New Roman" w:hAnsi="Times New Roman"/>
                 <w:b/>
                 <w:color w:val="0F766E"/>
-                <w:sz w:val="28"/>
+                <w:sz w:val="24"/>
               </w:rPr>
               <w:t>│</w:t>
               <w:br/>
@@ -1601,7 +2678,7 @@
                 <w:rFonts w:ascii="Times New Roman" w:hAnsi="Times New Roman"/>
                 <w:b/>
                 <w:color w:val="0369A1"/>
-                <w:sz w:val="28"/>
+                <w:sz w:val="22"/>
               </w:rPr>
               <w:t xml:space="preserve">► Step 5: </w:t>
             </w:r>
@@ -1609,9 +2686,9 @@
               <w:rPr>
                 <w:rFonts w:ascii="Times New Roman" w:hAnsi="Times New Roman"/>
                 <w:color w:val="1E293B"/>
-                <w:sz w:val="28"/>
+                <w:sz w:val="22"/>
               </w:rPr>
-              <w:t>System remaps document path strings in activity tables and re-queues faculty under New Department HOD.</w:t>
+              <w:t>Database Engine updates path strings in all activity tables and re-queues faculty under New Department HOD.</w:t>
             </w:r>
           </w:p>
         </w:tc>
@@ -1619,8 +2696,2374 @@
     </w:tbl>
     <w:p>
       <w:pPr>
-        <w:spacing w:after="160"/>
+        <w:spacing w:after="120"/>
       </w:pPr>
+    </w:p>
+    <w:p>
+      <w:pPr>
+        <w:keepNext/>
+        <w:spacing w:before="320" w:after="120"/>
+      </w:pPr>
+      <w:r>
+        <w:rPr>
+          <w:rFonts w:ascii="Times New Roman" w:hAnsi="Times New Roman"/>
+          <w:b/>
+          <w:color w:val="0F172A"/>
+          <w:sz w:val="32"/>
+        </w:rPr>
+        <w:t>5. Cross-Portal Unified Lifecycles &amp; Interaction Maps</w:t>
+      </w:r>
+    </w:p>
+    <w:p>
+      <w:pPr>
+        <w:spacing w:after="120"/>
+      </w:pPr>
+      <w:r>
+        <w:rPr>
+          <w:rFonts w:ascii="Times New Roman" w:hAnsi="Times New Roman"/>
+          <w:sz w:val="22"/>
+        </w:rPr>
+        <w:t>The three portals operate in seamless synchronization. Critical institutional processes flow seamlessly across portals through well-defined multi-stage state machines.</w:t>
+      </w:r>
+    </w:p>
+    <w:p>
+      <w:pPr>
+        <w:keepNext/>
+        <w:spacing w:before="240" w:after="120"/>
+      </w:pPr>
+      <w:r>
+        <w:rPr>
+          <w:rFonts w:ascii="Times New Roman" w:hAnsi="Times New Roman"/>
+          <w:b/>
+          <w:color w:val="0369A1"/>
+          <w:sz w:val="28"/>
+        </w:rPr>
+        <w:t>5.1 End-to-End Annual Performance Appraisal (FPI) Lifecycle</w:t>
+      </w:r>
+    </w:p>
+    <w:p>
+      <w:pPr>
+        <w:keepNext/>
+        <w:spacing w:before="240" w:after="120"/>
+      </w:pPr>
+      <w:r>
+        <w:rPr>
+          <w:rFonts w:ascii="Times New Roman" w:hAnsi="Times New Roman"/>
+          <w:b/>
+          <w:color w:val="0369A1"/>
+          <w:sz w:val="28"/>
+        </w:rPr>
+        <w:t>❖ Workflow Architecture Diagram: Three-Tier Multi-Stage Appraisal Approval Workflow</w:t>
+      </w:r>
+    </w:p>
+    <w:tbl>
+      <w:tblPr>
+        <w:tblW w:type="auto" w:w="0"/>
+        <w:jc w:val="center"/>
+        <w:tblLayout w:type="fixed"/>
+        <w:tblLook w:firstColumn="1" w:firstRow="1" w:lastColumn="0" w:lastRow="0" w:noHBand="0" w:noVBand="1" w:val="04A0"/>
+        <w:tblBorders>
+          <w:top w:val="single" w:sz="8" w:space="0" w:color="0F331F"/>
+          <w:left w:val="single" w:sz="8" w:space="0" w:color="0F331F"/>
+          <w:bottom w:val="single" w:sz="8" w:space="0" w:color="0F331F"/>
+          <w:right w:val="single" w:sz="8" w:space="0" w:color="0F331F"/>
+          <w:insideH w:val="single" w:sz="8" w:space="0" w:color="0F331F"/>
+          <w:insideV w:val="none"/>
+        </w:tblBorders>
+      </w:tblPr>
+      <w:tblGrid>
+        <w:gridCol w:w="10080"/>
+      </w:tblGrid>
+      <w:tr>
+        <w:tc>
+          <w:tcPr>
+            <w:tcW w:type="dxa" w:w="10080"/>
+            <w:shd w:val="clear" w:color="auto" w:fill="F8FAFC"/>
+            <w:tcMar>
+              <w:top w:w="140" w:type="dxa"/>
+              <w:bottom w:w="140" w:type="dxa"/>
+              <w:left w:w="180" w:type="dxa"/>
+              <w:right w:w="180" w:type="dxa"/>
+            </w:tcMar>
+          </w:tcPr>
+          <w:p>
+            <w:pPr>
+              <w:spacing w:before="80" w:after="120"/>
+            </w:pPr>
+            <w:r>
+              <w:rPr>
+                <w:rFonts w:ascii="Times New Roman" w:hAnsi="Times New Roman"/>
+                <w:b/>
+                <w:color w:val="0F331F"/>
+                <w:sz w:val="26"/>
+              </w:rPr>
+              <w:t>ARCHITECTURAL FLOW: THREE-TIER MULTI-STAGE APPRAISAL APPROVAL WORKFLOW</w:t>
+              <w:br/>
+            </w:r>
+          </w:p>
+          <w:p>
+            <w:pPr>
+              <w:spacing w:before="40" w:after="80"/>
+            </w:pPr>
+            <w:r>
+              <w:rPr>
+                <w:rFonts w:ascii="Times New Roman" w:hAnsi="Times New Roman"/>
+                <w:b/>
+                <w:color w:val="0369A1"/>
+                <w:sz w:val="22"/>
+              </w:rPr>
+              <w:t xml:space="preserve">► Step 1: </w:t>
+            </w:r>
+            <w:r>
+              <w:rPr>
+                <w:rFonts w:ascii="Times New Roman" w:hAnsi="Times New Roman"/>
+                <w:color w:val="1E293B"/>
+                <w:sz w:val="22"/>
+              </w:rPr>
+              <w:t>Stage 1 (Portal 1 - Faculty): Faculty fills self-scores across PART A, B, C, D, attaches proofs, and submits form (Status: 'Submitted').</w:t>
+            </w:r>
+          </w:p>
+          <w:p>
+            <w:pPr>
+              <w:spacing w:before="0" w:after="0"/>
+              <w:jc w:val="center"/>
+            </w:pPr>
+            <w:r>
+              <w:rPr>
+                <w:rFonts w:ascii="Times New Roman" w:hAnsi="Times New Roman"/>
+                <w:b/>
+                <w:color w:val="0F766E"/>
+                <w:sz w:val="24"/>
+              </w:rPr>
+              <w:t>│</w:t>
+              <w:br/>
+              <w:t>▼</w:t>
+            </w:r>
+          </w:p>
+          <w:p>
+            <w:pPr>
+              <w:spacing w:before="40" w:after="80"/>
+            </w:pPr>
+            <w:r>
+              <w:rPr>
+                <w:rFonts w:ascii="Times New Roman" w:hAnsi="Times New Roman"/>
+                <w:b/>
+                <w:color w:val="0369A1"/>
+                <w:sz w:val="22"/>
+              </w:rPr>
+              <w:t xml:space="preserve">► Step 2: </w:t>
+            </w:r>
+            <w:r>
+              <w:rPr>
+                <w:rFonts w:ascii="Times New Roman" w:hAnsi="Times New Roman"/>
+                <w:color w:val="1E293B"/>
+                <w:sz w:val="22"/>
+              </w:rPr>
+              <w:t>Stage 2 (Portal 2 - HOD): HOD reviews auto-mapped proofs, inputs evaluated marks, or executes bulk sign-off (Status: 'HOD Approved' or 'Returned for Correction').</w:t>
+            </w:r>
+          </w:p>
+          <w:p>
+            <w:pPr>
+              <w:spacing w:before="0" w:after="0"/>
+              <w:jc w:val="center"/>
+            </w:pPr>
+            <w:r>
+              <w:rPr>
+                <w:rFonts w:ascii="Times New Roman" w:hAnsi="Times New Roman"/>
+                <w:b/>
+                <w:color w:val="0F766E"/>
+                <w:sz w:val="24"/>
+              </w:rPr>
+              <w:t>│</w:t>
+              <w:br/>
+              <w:t>▼</w:t>
+            </w:r>
+          </w:p>
+          <w:p>
+            <w:pPr>
+              <w:spacing w:before="40" w:after="80"/>
+            </w:pPr>
+            <w:r>
+              <w:rPr>
+                <w:rFonts w:ascii="Times New Roman" w:hAnsi="Times New Roman"/>
+                <w:b/>
+                <w:color w:val="0369A1"/>
+                <w:sz w:val="22"/>
+              </w:rPr>
+              <w:t xml:space="preserve">► Step 3: </w:t>
+            </w:r>
+            <w:r>
+              <w:rPr>
+                <w:rFonts w:ascii="Times New Roman" w:hAnsi="Times New Roman"/>
+                <w:color w:val="1E293B"/>
+                <w:sz w:val="22"/>
+              </w:rPr>
+              <w:t>Stage 3 (Portal 3 - Executive Admin / Principal): Executive Admin conducts final institutional review, assigns executive scores, and clicks 'Final Approve' (Status: 'Final Approved').</w:t>
+            </w:r>
+          </w:p>
+          <w:p>
+            <w:pPr>
+              <w:spacing w:before="0" w:after="0"/>
+              <w:jc w:val="center"/>
+            </w:pPr>
+            <w:r>
+              <w:rPr>
+                <w:rFonts w:ascii="Times New Roman" w:hAnsi="Times New Roman"/>
+                <w:b/>
+                <w:color w:val="0F766E"/>
+                <w:sz w:val="24"/>
+              </w:rPr>
+              <w:t>│</w:t>
+              <w:br/>
+              <w:t>▼</w:t>
+            </w:r>
+          </w:p>
+          <w:p>
+            <w:pPr>
+              <w:spacing w:before="40" w:after="80"/>
+            </w:pPr>
+            <w:r>
+              <w:rPr>
+                <w:rFonts w:ascii="Times New Roman" w:hAnsi="Times New Roman"/>
+                <w:b/>
+                <w:color w:val="0369A1"/>
+                <w:sz w:val="22"/>
+              </w:rPr>
+              <w:t xml:space="preserve">► Step 4: </w:t>
+            </w:r>
+            <w:r>
+              <w:rPr>
+                <w:rFonts w:ascii="Times New Roman" w:hAnsi="Times New Roman"/>
+                <w:color w:val="1E293B"/>
+                <w:sz w:val="22"/>
+              </w:rPr>
+              <w:t>Stage 4 (Automated Dispatch): System locks form against further editing, generates final composite evaluation report, and dispatches Web Push &amp; Email notifications to faculty.</w:t>
+            </w:r>
+          </w:p>
+        </w:tc>
+      </w:tr>
+    </w:tbl>
+    <w:p>
+      <w:pPr>
+        <w:spacing w:after="120"/>
+      </w:pPr>
+    </w:p>
+    <w:p>
+      <w:pPr>
+        <w:keepNext/>
+        <w:spacing w:before="240" w:after="120"/>
+      </w:pPr>
+      <w:r>
+        <w:rPr>
+          <w:rFonts w:ascii="Times New Roman" w:hAnsi="Times New Roman"/>
+          <w:b/>
+          <w:color w:val="0369A1"/>
+          <w:sz w:val="28"/>
+        </w:rPr>
+        <w:t>5.2 End-to-End Institutional Accreditation &amp; Bulk Dossier Generation</w:t>
+      </w:r>
+    </w:p>
+    <w:p>
+      <w:pPr>
+        <w:keepNext/>
+        <w:spacing w:before="240" w:after="120"/>
+      </w:pPr>
+      <w:r>
+        <w:rPr>
+          <w:rFonts w:ascii="Times New Roman" w:hAnsi="Times New Roman"/>
+          <w:b/>
+          <w:color w:val="0369A1"/>
+          <w:sz w:val="28"/>
+        </w:rPr>
+        <w:t>❖ Workflow Architecture Diagram: Accreditation Data Harvesting &amp; Dossier Archive Lifecycle</w:t>
+      </w:r>
+    </w:p>
+    <w:tbl>
+      <w:tblPr>
+        <w:tblW w:type="auto" w:w="0"/>
+        <w:jc w:val="center"/>
+        <w:tblLayout w:type="fixed"/>
+        <w:tblLook w:firstColumn="1" w:firstRow="1" w:lastColumn="0" w:lastRow="0" w:noHBand="0" w:noVBand="1" w:val="04A0"/>
+        <w:tblBorders>
+          <w:top w:val="single" w:sz="8" w:space="0" w:color="0F331F"/>
+          <w:left w:val="single" w:sz="8" w:space="0" w:color="0F331F"/>
+          <w:bottom w:val="single" w:sz="8" w:space="0" w:color="0F331F"/>
+          <w:right w:val="single" w:sz="8" w:space="0" w:color="0F331F"/>
+          <w:insideH w:val="single" w:sz="8" w:space="0" w:color="0F331F"/>
+          <w:insideV w:val="none"/>
+        </w:tblBorders>
+      </w:tblPr>
+      <w:tblGrid>
+        <w:gridCol w:w="10080"/>
+      </w:tblGrid>
+      <w:tr>
+        <w:tc>
+          <w:tcPr>
+            <w:tcW w:type="dxa" w:w="10080"/>
+            <w:shd w:val="clear" w:color="auto" w:fill="F8FAFC"/>
+            <w:tcMar>
+              <w:top w:w="140" w:type="dxa"/>
+              <w:bottom w:w="140" w:type="dxa"/>
+              <w:left w:w="180" w:type="dxa"/>
+              <w:right w:w="180" w:type="dxa"/>
+            </w:tcMar>
+          </w:tcPr>
+          <w:p>
+            <w:pPr>
+              <w:spacing w:before="80" w:after="120"/>
+            </w:pPr>
+            <w:r>
+              <w:rPr>
+                <w:rFonts w:ascii="Times New Roman" w:hAnsi="Times New Roman"/>
+                <w:b/>
+                <w:color w:val="0F331F"/>
+                <w:sz w:val="26"/>
+              </w:rPr>
+              <w:t>ARCHITECTURAL FLOW: ACCREDITATION DATA HARVESTING &amp; DOSSIER ARCHIVE LIFECYCLE</w:t>
+              <w:br/>
+            </w:r>
+          </w:p>
+          <w:p>
+            <w:pPr>
+              <w:spacing w:before="40" w:after="80"/>
+            </w:pPr>
+            <w:r>
+              <w:rPr>
+                <w:rFonts w:ascii="Times New Roman" w:hAnsi="Times New Roman"/>
+                <w:b/>
+                <w:color w:val="0369A1"/>
+                <w:sz w:val="22"/>
+              </w:rPr>
+              <w:t xml:space="preserve">► Step 1: </w:t>
+            </w:r>
+            <w:r>
+              <w:rPr>
+                <w:rFonts w:ascii="Times New Roman" w:hAnsi="Times New Roman"/>
+                <w:color w:val="1E293B"/>
+                <w:sz w:val="22"/>
+              </w:rPr>
+              <w:t>Stage 1 (Portal 1 - Faculty Data Entry): Faculty continuously logs publications, grants, patents, FDPs, and uploads certificates.</w:t>
+            </w:r>
+          </w:p>
+          <w:p>
+            <w:pPr>
+              <w:spacing w:before="0" w:after="0"/>
+              <w:jc w:val="center"/>
+            </w:pPr>
+            <w:r>
+              <w:rPr>
+                <w:rFonts w:ascii="Times New Roman" w:hAnsi="Times New Roman"/>
+                <w:b/>
+                <w:color w:val="0F766E"/>
+                <w:sz w:val="24"/>
+              </w:rPr>
+              <w:t>│</w:t>
+              <w:br/>
+              <w:t>▼</w:t>
+            </w:r>
+          </w:p>
+          <w:p>
+            <w:pPr>
+              <w:spacing w:before="40" w:after="80"/>
+            </w:pPr>
+            <w:r>
+              <w:rPr>
+                <w:rFonts w:ascii="Times New Roman" w:hAnsi="Times New Roman"/>
+                <w:b/>
+                <w:color w:val="0369A1"/>
+                <w:sz w:val="22"/>
+              </w:rPr>
+              <w:t xml:space="preserve">► Step 2: </w:t>
+            </w:r>
+            <w:r>
+              <w:rPr>
+                <w:rFonts w:ascii="Times New Roman" w:hAnsi="Times New Roman"/>
+                <w:color w:val="1E293B"/>
+                <w:sz w:val="22"/>
+              </w:rPr>
+              <w:t>Stage 2 (Portal 2 - Department Verification): HOD verifies evidence authenticity and monitors departmental NBA/NAAC criteria completion.</w:t>
+            </w:r>
+          </w:p>
+          <w:p>
+            <w:pPr>
+              <w:spacing w:before="0" w:after="0"/>
+              <w:jc w:val="center"/>
+            </w:pPr>
+            <w:r>
+              <w:rPr>
+                <w:rFonts w:ascii="Times New Roman" w:hAnsi="Times New Roman"/>
+                <w:b/>
+                <w:color w:val="0F766E"/>
+                <w:sz w:val="24"/>
+              </w:rPr>
+              <w:t>│</w:t>
+              <w:br/>
+              <w:t>▼</w:t>
+            </w:r>
+          </w:p>
+          <w:p>
+            <w:pPr>
+              <w:spacing w:before="40" w:after="80"/>
+            </w:pPr>
+            <w:r>
+              <w:rPr>
+                <w:rFonts w:ascii="Times New Roman" w:hAnsi="Times New Roman"/>
+                <w:b/>
+                <w:color w:val="0369A1"/>
+                <w:sz w:val="22"/>
+              </w:rPr>
+              <w:t xml:space="preserve">► Step 3: </w:t>
+            </w:r>
+            <w:r>
+              <w:rPr>
+                <w:rFonts w:ascii="Times New Roman" w:hAnsi="Times New Roman"/>
+                <w:color w:val="1E293B"/>
+                <w:sz w:val="22"/>
+              </w:rPr>
+              <w:t>Stage 3 (Portal 3 - Accreditation Suite): Institutional IQAC/NAAC coordinators access /accreditation-suite to view real-time compliance matrices.</w:t>
+            </w:r>
+          </w:p>
+          <w:p>
+            <w:pPr>
+              <w:spacing w:before="0" w:after="0"/>
+              <w:jc w:val="center"/>
+            </w:pPr>
+            <w:r>
+              <w:rPr>
+                <w:rFonts w:ascii="Times New Roman" w:hAnsi="Times New Roman"/>
+                <w:b/>
+                <w:color w:val="0F766E"/>
+                <w:sz w:val="24"/>
+              </w:rPr>
+              <w:t>│</w:t>
+              <w:br/>
+              <w:t>▼</w:t>
+            </w:r>
+          </w:p>
+          <w:p>
+            <w:pPr>
+              <w:spacing w:before="40" w:after="80"/>
+            </w:pPr>
+            <w:r>
+              <w:rPr>
+                <w:rFonts w:ascii="Times New Roman" w:hAnsi="Times New Roman"/>
+                <w:b/>
+                <w:color w:val="0369A1"/>
+                <w:sz w:val="22"/>
+              </w:rPr>
+              <w:t xml:space="preserve">► Step 4: </w:t>
+            </w:r>
+            <w:r>
+              <w:rPr>
+                <w:rFonts w:ascii="Times New Roman" w:hAnsi="Times New Roman"/>
+                <w:color w:val="1E293B"/>
+                <w:sz w:val="22"/>
+              </w:rPr>
+              <w:t>Stage 4 (Bulk Zip Exporter): Exporter engine (/api/reports/bulk-dossier-zip) streams compressed ZIP containing structured folders and vector PDFs.</w:t>
+            </w:r>
+          </w:p>
+        </w:tc>
+      </w:tr>
+    </w:tbl>
+    <w:p>
+      <w:pPr>
+        <w:spacing w:after="120"/>
+      </w:pPr>
+    </w:p>
+    <w:p>
+      <w:pPr>
+        <w:keepNext/>
+        <w:spacing w:before="320" w:after="120"/>
+      </w:pPr>
+      <w:r>
+        <w:rPr>
+          <w:rFonts w:ascii="Times New Roman" w:hAnsi="Times New Roman"/>
+          <w:b/>
+          <w:color w:val="0F172A"/>
+          <w:sz w:val="32"/>
+        </w:rPr>
+        <w:t>6. Comprehensive Portal Feature &amp; Permission Comparison Matrix</w:t>
+      </w:r>
+    </w:p>
+    <w:tbl>
+      <w:tblPr>
+        <w:tblW w:type="auto" w:w="0"/>
+        <w:jc w:val="center"/>
+        <w:tblLayout w:type="fixed"/>
+        <w:tblLook w:firstColumn="1" w:firstRow="1" w:lastColumn="0" w:lastRow="0" w:noHBand="0" w:noVBand="1" w:val="04A0"/>
+        <w:tblBorders>
+          <w:top w:val="single" w:sz="4" w:space="0" w:color="CBD5E1"/>
+          <w:left w:val="single" w:sz="4" w:space="0" w:color="CBD5E1"/>
+          <w:bottom w:val="single" w:sz="4" w:space="0" w:color="CBD5E1"/>
+          <w:right w:val="single" w:sz="4" w:space="0" w:color="CBD5E1"/>
+          <w:insideH w:val="single" w:sz="4" w:space="0" w:color="CBD5E1"/>
+          <w:insideV w:val="none"/>
+        </w:tblBorders>
+      </w:tblPr>
+      <w:tblGrid>
+        <w:gridCol w:w="2520"/>
+        <w:gridCol w:w="2520"/>
+        <w:gridCol w:w="2520"/>
+        <w:gridCol w:w="2520"/>
+      </w:tblGrid>
+      <w:tr>
+        <w:tc>
+          <w:tcPr>
+            <w:tcW w:type="dxa" w:w="2880"/>
+            <w:shd w:val="clear" w:color="auto" w:fill="0F331F"/>
+            <w:tcMar>
+              <w:top w:w="100" w:type="dxa"/>
+              <w:bottom w:w="100" w:type="dxa"/>
+              <w:left w:w="120" w:type="dxa"/>
+              <w:right w:w="120" w:type="dxa"/>
+            </w:tcMar>
+          </w:tcPr>
+          <w:p>
+            <w:pPr>
+              <w:jc w:val="left"/>
+            </w:pPr>
+            <w:r>
+              <w:rPr>
+                <w:rFonts w:ascii="Times New Roman" w:hAnsi="Times New Roman"/>
+                <w:b/>
+                <w:color w:val="FFFFFF"/>
+                <w:sz w:val="22"/>
+              </w:rPr>
+              <w:t>Functional Feature / Module</w:t>
+            </w:r>
+          </w:p>
+        </w:tc>
+        <w:tc>
+          <w:tcPr>
+            <w:tcW w:type="dxa" w:w="2304"/>
+            <w:shd w:val="clear" w:color="auto" w:fill="0F331F"/>
+            <w:tcMar>
+              <w:top w:w="100" w:type="dxa"/>
+              <w:bottom w:w="100" w:type="dxa"/>
+              <w:left w:w="120" w:type="dxa"/>
+              <w:right w:w="120" w:type="dxa"/>
+            </w:tcMar>
+          </w:tcPr>
+          <w:p>
+            <w:pPr>
+              <w:jc w:val="left"/>
+            </w:pPr>
+            <w:r>
+              <w:rPr>
+                <w:rFonts w:ascii="Times New Roman" w:hAnsi="Times New Roman"/>
+                <w:b/>
+                <w:color w:val="FFFFFF"/>
+                <w:sz w:val="22"/>
+              </w:rPr>
+              <w:t>Portal 1 (Faculty)</w:t>
+            </w:r>
+          </w:p>
+        </w:tc>
+        <w:tc>
+          <w:tcPr>
+            <w:tcW w:type="dxa" w:w="2448"/>
+            <w:shd w:val="clear" w:color="auto" w:fill="0F331F"/>
+            <w:tcMar>
+              <w:top w:w="100" w:type="dxa"/>
+              <w:bottom w:w="100" w:type="dxa"/>
+              <w:left w:w="120" w:type="dxa"/>
+              <w:right w:w="120" w:type="dxa"/>
+            </w:tcMar>
+          </w:tcPr>
+          <w:p>
+            <w:pPr>
+              <w:jc w:val="left"/>
+            </w:pPr>
+            <w:r>
+              <w:rPr>
+                <w:rFonts w:ascii="Times New Roman" w:hAnsi="Times New Roman"/>
+                <w:b/>
+                <w:color w:val="FFFFFF"/>
+                <w:sz w:val="22"/>
+              </w:rPr>
+              <w:t>Portal 2 (HOD / Dept Admin)</w:t>
+            </w:r>
+          </w:p>
+        </w:tc>
+        <w:tc>
+          <w:tcPr>
+            <w:tcW w:type="dxa" w:w="2448"/>
+            <w:shd w:val="clear" w:color="auto" w:fill="0F331F"/>
+            <w:tcMar>
+              <w:top w:w="100" w:type="dxa"/>
+              <w:bottom w:w="100" w:type="dxa"/>
+              <w:left w:w="120" w:type="dxa"/>
+              <w:right w:w="120" w:type="dxa"/>
+            </w:tcMar>
+          </w:tcPr>
+          <w:p>
+            <w:pPr>
+              <w:jc w:val="left"/>
+            </w:pPr>
+            <w:r>
+              <w:rPr>
+                <w:rFonts w:ascii="Times New Roman" w:hAnsi="Times New Roman"/>
+                <w:b/>
+                <w:color w:val="FFFFFF"/>
+                <w:sz w:val="22"/>
+              </w:rPr>
+              <w:t>Portal 3 (System Admin / Principal)</w:t>
+            </w:r>
+          </w:p>
+        </w:tc>
+      </w:tr>
+      <w:tr>
+        <w:tc>
+          <w:tcPr>
+            <w:tcW w:type="dxa" w:w="2880"/>
+            <w:shd w:val="clear" w:color="auto" w:fill="FFFFFF"/>
+            <w:tcMar>
+              <w:top w:w="80" w:type="dxa"/>
+              <w:bottom w:w="80" w:type="dxa"/>
+              <w:left w:w="120" w:type="dxa"/>
+              <w:right w:w="120" w:type="dxa"/>
+            </w:tcMar>
+          </w:tcPr>
+          <w:p>
+            <w:pPr>
+              <w:jc w:val="left"/>
+            </w:pPr>
+            <w:r>
+              <w:rPr>
+                <w:rFonts w:ascii="Times New Roman" w:hAnsi="Times New Roman"/>
+                <w:color w:val="1E293B"/>
+                <w:sz w:val="20"/>
+              </w:rPr>
+              <w:t>Authentication &amp; Login</w:t>
+            </w:r>
+          </w:p>
+        </w:tc>
+        <w:tc>
+          <w:tcPr>
+            <w:tcW w:type="dxa" w:w="2304"/>
+            <w:shd w:val="clear" w:color="auto" w:fill="FFFFFF"/>
+            <w:tcMar>
+              <w:top w:w="80" w:type="dxa"/>
+              <w:bottom w:w="80" w:type="dxa"/>
+              <w:left w:w="120" w:type="dxa"/>
+              <w:right w:w="120" w:type="dxa"/>
+            </w:tcMar>
+          </w:tcPr>
+          <w:p>
+            <w:pPr>
+              <w:jc w:val="left"/>
+            </w:pPr>
+            <w:r>
+              <w:rPr>
+                <w:rFonts w:ascii="Times New Roman" w:hAnsi="Times New Roman"/>
+                <w:color w:val="1E293B"/>
+                <w:sz w:val="20"/>
+              </w:rPr>
+              <w:t>Staff ID + Password</w:t>
+            </w:r>
+          </w:p>
+        </w:tc>
+        <w:tc>
+          <w:tcPr>
+            <w:tcW w:type="dxa" w:w="2448"/>
+            <w:shd w:val="clear" w:color="auto" w:fill="FFFFFF"/>
+            <w:tcMar>
+              <w:top w:w="80" w:type="dxa"/>
+              <w:bottom w:w="80" w:type="dxa"/>
+              <w:left w:w="120" w:type="dxa"/>
+              <w:right w:w="120" w:type="dxa"/>
+            </w:tcMar>
+          </w:tcPr>
+          <w:p>
+            <w:pPr>
+              <w:jc w:val="left"/>
+            </w:pPr>
+            <w:r>
+              <w:rPr>
+                <w:rFonts w:ascii="Times New Roman" w:hAnsi="Times New Roman"/>
+                <w:color w:val="1E293B"/>
+                <w:sz w:val="20"/>
+              </w:rPr>
+              <w:t>Staff ID + Password (isHod: true)</w:t>
+            </w:r>
+          </w:p>
+        </w:tc>
+        <w:tc>
+          <w:tcPr>
+            <w:tcW w:type="dxa" w:w="2448"/>
+            <w:shd w:val="clear" w:color="auto" w:fill="FFFFFF"/>
+            <w:tcMar>
+              <w:top w:w="80" w:type="dxa"/>
+              <w:bottom w:w="80" w:type="dxa"/>
+              <w:left w:w="120" w:type="dxa"/>
+              <w:right w:w="120" w:type="dxa"/>
+            </w:tcMar>
+          </w:tcPr>
+          <w:p>
+            <w:pPr>
+              <w:jc w:val="left"/>
+            </w:pPr>
+            <w:r>
+              <w:rPr>
+                <w:rFonts w:ascii="Times New Roman" w:hAnsi="Times New Roman"/>
+                <w:color w:val="1E293B"/>
+                <w:sz w:val="20"/>
+              </w:rPr>
+              <w:t>Admin Username + Password</w:t>
+            </w:r>
+          </w:p>
+        </w:tc>
+      </w:tr>
+      <w:tr>
+        <w:tc>
+          <w:tcPr>
+            <w:tcW w:type="dxa" w:w="2880"/>
+            <w:shd w:val="clear" w:color="auto" w:fill="F8FAFC"/>
+            <w:tcMar>
+              <w:top w:w="80" w:type="dxa"/>
+              <w:bottom w:w="80" w:type="dxa"/>
+              <w:left w:w="120" w:type="dxa"/>
+              <w:right w:w="120" w:type="dxa"/>
+            </w:tcMar>
+          </w:tcPr>
+          <w:p>
+            <w:pPr>
+              <w:jc w:val="left"/>
+            </w:pPr>
+            <w:r>
+              <w:rPr>
+                <w:rFonts w:ascii="Times New Roman" w:hAnsi="Times New Roman"/>
+                <w:color w:val="1E293B"/>
+                <w:sz w:val="20"/>
+              </w:rPr>
+              <w:t>Personal &amp; Academic Details</w:t>
+            </w:r>
+          </w:p>
+        </w:tc>
+        <w:tc>
+          <w:tcPr>
+            <w:tcW w:type="dxa" w:w="2304"/>
+            <w:shd w:val="clear" w:color="auto" w:fill="F8FAFC"/>
+            <w:tcMar>
+              <w:top w:w="80" w:type="dxa"/>
+              <w:bottom w:w="80" w:type="dxa"/>
+              <w:left w:w="120" w:type="dxa"/>
+              <w:right w:w="120" w:type="dxa"/>
+            </w:tcMar>
+          </w:tcPr>
+          <w:p>
+            <w:pPr>
+              <w:jc w:val="left"/>
+            </w:pPr>
+            <w:r>
+              <w:rPr>
+                <w:rFonts w:ascii="Times New Roman" w:hAnsi="Times New Roman"/>
+                <w:color w:val="1E293B"/>
+                <w:sz w:val="20"/>
+              </w:rPr>
+              <w:t>Edit &amp; Save Self Profile</w:t>
+            </w:r>
+          </w:p>
+        </w:tc>
+        <w:tc>
+          <w:tcPr>
+            <w:tcW w:type="dxa" w:w="2448"/>
+            <w:shd w:val="clear" w:color="auto" w:fill="F8FAFC"/>
+            <w:tcMar>
+              <w:top w:w="80" w:type="dxa"/>
+              <w:bottom w:w="80" w:type="dxa"/>
+              <w:left w:w="120" w:type="dxa"/>
+              <w:right w:w="120" w:type="dxa"/>
+            </w:tcMar>
+          </w:tcPr>
+          <w:p>
+            <w:pPr>
+              <w:jc w:val="left"/>
+            </w:pPr>
+            <w:r>
+              <w:rPr>
+                <w:rFonts w:ascii="Times New Roman" w:hAnsi="Times New Roman"/>
+                <w:color w:val="1E293B"/>
+                <w:sz w:val="20"/>
+              </w:rPr>
+              <w:t>Read-Only Inspection (Disabled)</w:t>
+            </w:r>
+          </w:p>
+        </w:tc>
+        <w:tc>
+          <w:tcPr>
+            <w:tcW w:type="dxa" w:w="2448"/>
+            <w:shd w:val="clear" w:color="auto" w:fill="F8FAFC"/>
+            <w:tcMar>
+              <w:top w:w="80" w:type="dxa"/>
+              <w:bottom w:w="80" w:type="dxa"/>
+              <w:left w:w="120" w:type="dxa"/>
+              <w:right w:w="120" w:type="dxa"/>
+            </w:tcMar>
+          </w:tcPr>
+          <w:p>
+            <w:pPr>
+              <w:jc w:val="left"/>
+            </w:pPr>
+            <w:r>
+              <w:rPr>
+                <w:rFonts w:ascii="Times New Roman" w:hAnsi="Times New Roman"/>
+                <w:color w:val="1E293B"/>
+                <w:sz w:val="20"/>
+              </w:rPr>
+              <w:t>Full Administrative CRUD</w:t>
+            </w:r>
+          </w:p>
+        </w:tc>
+      </w:tr>
+      <w:tr>
+        <w:tc>
+          <w:tcPr>
+            <w:tcW w:type="dxa" w:w="2880"/>
+            <w:shd w:val="clear" w:color="auto" w:fill="FFFFFF"/>
+            <w:tcMar>
+              <w:top w:w="80" w:type="dxa"/>
+              <w:bottom w:w="80" w:type="dxa"/>
+              <w:left w:w="120" w:type="dxa"/>
+              <w:right w:w="120" w:type="dxa"/>
+            </w:tcMar>
+          </w:tcPr>
+          <w:p>
+            <w:pPr>
+              <w:jc w:val="left"/>
+            </w:pPr>
+            <w:r>
+              <w:rPr>
+                <w:rFonts w:ascii="Times New Roman" w:hAnsi="Times New Roman"/>
+                <w:color w:val="1E293B"/>
+                <w:sz w:val="20"/>
+              </w:rPr>
+              <w:t>Educational Qualifications</w:t>
+            </w:r>
+          </w:p>
+        </w:tc>
+        <w:tc>
+          <w:tcPr>
+            <w:tcW w:type="dxa" w:w="2304"/>
+            <w:shd w:val="clear" w:color="auto" w:fill="FFFFFF"/>
+            <w:tcMar>
+              <w:top w:w="80" w:type="dxa"/>
+              <w:bottom w:w="80" w:type="dxa"/>
+              <w:left w:w="120" w:type="dxa"/>
+              <w:right w:w="120" w:type="dxa"/>
+            </w:tcMar>
+          </w:tcPr>
+          <w:p>
+            <w:pPr>
+              <w:jc w:val="left"/>
+            </w:pPr>
+            <w:r>
+              <w:rPr>
+                <w:rFonts w:ascii="Times New Roman" w:hAnsi="Times New Roman"/>
+                <w:color w:val="1E293B"/>
+                <w:sz w:val="20"/>
+              </w:rPr>
+              <w:t>Add/Edit Self Qualifications</w:t>
+            </w:r>
+          </w:p>
+        </w:tc>
+        <w:tc>
+          <w:tcPr>
+            <w:tcW w:type="dxa" w:w="2448"/>
+            <w:shd w:val="clear" w:color="auto" w:fill="FFFFFF"/>
+            <w:tcMar>
+              <w:top w:w="80" w:type="dxa"/>
+              <w:bottom w:w="80" w:type="dxa"/>
+              <w:left w:w="120" w:type="dxa"/>
+              <w:right w:w="120" w:type="dxa"/>
+            </w:tcMar>
+          </w:tcPr>
+          <w:p>
+            <w:pPr>
+              <w:jc w:val="left"/>
+            </w:pPr>
+            <w:r>
+              <w:rPr>
+                <w:rFonts w:ascii="Times New Roman" w:hAnsi="Times New Roman"/>
+                <w:color w:val="1E293B"/>
+                <w:sz w:val="20"/>
+              </w:rPr>
+              <w:t>Read-Only Inspection</w:t>
+            </w:r>
+          </w:p>
+        </w:tc>
+        <w:tc>
+          <w:tcPr>
+            <w:tcW w:type="dxa" w:w="2448"/>
+            <w:shd w:val="clear" w:color="auto" w:fill="FFFFFF"/>
+            <w:tcMar>
+              <w:top w:w="80" w:type="dxa"/>
+              <w:bottom w:w="80" w:type="dxa"/>
+              <w:left w:w="120" w:type="dxa"/>
+              <w:right w:w="120" w:type="dxa"/>
+            </w:tcMar>
+          </w:tcPr>
+          <w:p>
+            <w:pPr>
+              <w:jc w:val="left"/>
+            </w:pPr>
+            <w:r>
+              <w:rPr>
+                <w:rFonts w:ascii="Times New Roman" w:hAnsi="Times New Roman"/>
+                <w:color w:val="1E293B"/>
+                <w:sz w:val="20"/>
+              </w:rPr>
+              <w:t>Full Administrative CRUD</w:t>
+            </w:r>
+          </w:p>
+        </w:tc>
+      </w:tr>
+      <w:tr>
+        <w:tc>
+          <w:tcPr>
+            <w:tcW w:type="dxa" w:w="2880"/>
+            <w:shd w:val="clear" w:color="auto" w:fill="F8FAFC"/>
+            <w:tcMar>
+              <w:top w:w="80" w:type="dxa"/>
+              <w:bottom w:w="80" w:type="dxa"/>
+              <w:left w:w="120" w:type="dxa"/>
+              <w:right w:w="120" w:type="dxa"/>
+            </w:tcMar>
+          </w:tcPr>
+          <w:p>
+            <w:pPr>
+              <w:jc w:val="left"/>
+            </w:pPr>
+            <w:r>
+              <w:rPr>
+                <w:rFonts w:ascii="Times New Roman" w:hAnsi="Times New Roman"/>
+                <w:color w:val="1E293B"/>
+                <w:sz w:val="20"/>
+              </w:rPr>
+              <w:t>Document Vault Uploads</w:t>
+            </w:r>
+          </w:p>
+        </w:tc>
+        <w:tc>
+          <w:tcPr>
+            <w:tcW w:type="dxa" w:w="2304"/>
+            <w:shd w:val="clear" w:color="auto" w:fill="F8FAFC"/>
+            <w:tcMar>
+              <w:top w:w="80" w:type="dxa"/>
+              <w:bottom w:w="80" w:type="dxa"/>
+              <w:left w:w="120" w:type="dxa"/>
+              <w:right w:w="120" w:type="dxa"/>
+            </w:tcMar>
+          </w:tcPr>
+          <w:p>
+            <w:pPr>
+              <w:jc w:val="left"/>
+            </w:pPr>
+            <w:r>
+              <w:rPr>
+                <w:rFonts w:ascii="Times New Roman" w:hAnsi="Times New Roman"/>
+                <w:color w:val="1E293B"/>
+                <w:sz w:val="20"/>
+              </w:rPr>
+              <w:t>Upload Self Documents</w:t>
+            </w:r>
+          </w:p>
+        </w:tc>
+        <w:tc>
+          <w:tcPr>
+            <w:tcW w:type="dxa" w:w="2448"/>
+            <w:shd w:val="clear" w:color="auto" w:fill="F8FAFC"/>
+            <w:tcMar>
+              <w:top w:w="80" w:type="dxa"/>
+              <w:bottom w:w="80" w:type="dxa"/>
+              <w:left w:w="120" w:type="dxa"/>
+              <w:right w:w="120" w:type="dxa"/>
+            </w:tcMar>
+          </w:tcPr>
+          <w:p>
+            <w:pPr>
+              <w:jc w:val="left"/>
+            </w:pPr>
+            <w:r>
+              <w:rPr>
+                <w:rFonts w:ascii="Times New Roman" w:hAnsi="Times New Roman"/>
+                <w:color w:val="1E293B"/>
+                <w:sz w:val="20"/>
+              </w:rPr>
+              <w:t>Read-Only (HR Docs Restricted)</w:t>
+            </w:r>
+          </w:p>
+        </w:tc>
+        <w:tc>
+          <w:tcPr>
+            <w:tcW w:type="dxa" w:w="2448"/>
+            <w:shd w:val="clear" w:color="auto" w:fill="F8FAFC"/>
+            <w:tcMar>
+              <w:top w:w="80" w:type="dxa"/>
+              <w:bottom w:w="80" w:type="dxa"/>
+              <w:left w:w="120" w:type="dxa"/>
+              <w:right w:w="120" w:type="dxa"/>
+            </w:tcMar>
+          </w:tcPr>
+          <w:p>
+            <w:pPr>
+              <w:jc w:val="left"/>
+            </w:pPr>
+            <w:r>
+              <w:rPr>
+                <w:rFonts w:ascii="Times New Roman" w:hAnsi="Times New Roman"/>
+                <w:color w:val="1E293B"/>
+                <w:sz w:val="20"/>
+              </w:rPr>
+              <w:t>Full Access + HR Dossier View</w:t>
+            </w:r>
+          </w:p>
+        </w:tc>
+      </w:tr>
+      <w:tr>
+        <w:tc>
+          <w:tcPr>
+            <w:tcW w:type="dxa" w:w="2880"/>
+            <w:shd w:val="clear" w:color="auto" w:fill="FFFFFF"/>
+            <w:tcMar>
+              <w:top w:w="80" w:type="dxa"/>
+              <w:bottom w:w="80" w:type="dxa"/>
+              <w:left w:w="120" w:type="dxa"/>
+              <w:right w:w="120" w:type="dxa"/>
+            </w:tcMar>
+          </w:tcPr>
+          <w:p>
+            <w:pPr>
+              <w:jc w:val="left"/>
+            </w:pPr>
+            <w:r>
+              <w:rPr>
+                <w:rFonts w:ascii="Times New Roman" w:hAnsi="Times New Roman"/>
+                <w:color w:val="1E293B"/>
+                <w:sz w:val="20"/>
+              </w:rPr>
+              <w:t>Research, Patents &amp; Grants</w:t>
+            </w:r>
+          </w:p>
+        </w:tc>
+        <w:tc>
+          <w:tcPr>
+            <w:tcW w:type="dxa" w:w="2304"/>
+            <w:shd w:val="clear" w:color="auto" w:fill="FFFFFF"/>
+            <w:tcMar>
+              <w:top w:w="80" w:type="dxa"/>
+              <w:bottom w:w="80" w:type="dxa"/>
+              <w:left w:w="120" w:type="dxa"/>
+              <w:right w:w="120" w:type="dxa"/>
+            </w:tcMar>
+          </w:tcPr>
+          <w:p>
+            <w:pPr>
+              <w:jc w:val="left"/>
+            </w:pPr>
+            <w:r>
+              <w:rPr>
+                <w:rFonts w:ascii="Times New Roman" w:hAnsi="Times New Roman"/>
+                <w:color w:val="1E293B"/>
+                <w:sz w:val="20"/>
+              </w:rPr>
+              <w:t>Submit Self R&amp;D Records</w:t>
+            </w:r>
+          </w:p>
+        </w:tc>
+        <w:tc>
+          <w:tcPr>
+            <w:tcW w:type="dxa" w:w="2448"/>
+            <w:shd w:val="clear" w:color="auto" w:fill="FFFFFF"/>
+            <w:tcMar>
+              <w:top w:w="80" w:type="dxa"/>
+              <w:bottom w:w="80" w:type="dxa"/>
+              <w:left w:w="120" w:type="dxa"/>
+              <w:right w:w="120" w:type="dxa"/>
+            </w:tcMar>
+          </w:tcPr>
+          <w:p>
+            <w:pPr>
+              <w:jc w:val="left"/>
+            </w:pPr>
+            <w:r>
+              <w:rPr>
+                <w:rFonts w:ascii="Times New Roman" w:hAnsi="Times New Roman"/>
+                <w:color w:val="1E293B"/>
+                <w:sz w:val="20"/>
+              </w:rPr>
+              <w:t>View Dept Records &amp; Proofs</w:t>
+            </w:r>
+          </w:p>
+        </w:tc>
+        <w:tc>
+          <w:tcPr>
+            <w:tcW w:type="dxa" w:w="2448"/>
+            <w:shd w:val="clear" w:color="auto" w:fill="FFFFFF"/>
+            <w:tcMar>
+              <w:top w:w="80" w:type="dxa"/>
+              <w:bottom w:w="80" w:type="dxa"/>
+              <w:left w:w="120" w:type="dxa"/>
+              <w:right w:w="120" w:type="dxa"/>
+            </w:tcMar>
+          </w:tcPr>
+          <w:p>
+            <w:pPr>
+              <w:jc w:val="left"/>
+            </w:pPr>
+            <w:r>
+              <w:rPr>
+                <w:rFonts w:ascii="Times New Roman" w:hAnsi="Times New Roman"/>
+                <w:color w:val="1E293B"/>
+                <w:sz w:val="20"/>
+              </w:rPr>
+              <w:t>Full CRUD + Institutional Summary</w:t>
+            </w:r>
+          </w:p>
+        </w:tc>
+      </w:tr>
+      <w:tr>
+        <w:tc>
+          <w:tcPr>
+            <w:tcW w:type="dxa" w:w="2880"/>
+            <w:shd w:val="clear" w:color="auto" w:fill="F8FAFC"/>
+            <w:tcMar>
+              <w:top w:w="80" w:type="dxa"/>
+              <w:bottom w:w="80" w:type="dxa"/>
+              <w:left w:w="120" w:type="dxa"/>
+              <w:right w:w="120" w:type="dxa"/>
+            </w:tcMar>
+          </w:tcPr>
+          <w:p>
+            <w:pPr>
+              <w:jc w:val="left"/>
+            </w:pPr>
+            <w:r>
+              <w:rPr>
+                <w:rFonts w:ascii="Times New Roman" w:hAnsi="Times New Roman"/>
+                <w:color w:val="1E293B"/>
+                <w:sz w:val="20"/>
+              </w:rPr>
+              <w:t>Club Coordinator Module</w:t>
+            </w:r>
+          </w:p>
+        </w:tc>
+        <w:tc>
+          <w:tcPr>
+            <w:tcW w:type="dxa" w:w="2304"/>
+            <w:shd w:val="clear" w:color="auto" w:fill="F8FAFC"/>
+            <w:tcMar>
+              <w:top w:w="80" w:type="dxa"/>
+              <w:bottom w:w="80" w:type="dxa"/>
+              <w:left w:w="120" w:type="dxa"/>
+              <w:right w:w="120" w:type="dxa"/>
+            </w:tcMar>
+          </w:tcPr>
+          <w:p>
+            <w:pPr>
+              <w:jc w:val="left"/>
+            </w:pPr>
+            <w:r>
+              <w:rPr>
+                <w:rFonts w:ascii="Times New Roman" w:hAnsi="Times New Roman"/>
+                <w:color w:val="1E293B"/>
+                <w:sz w:val="20"/>
+              </w:rPr>
+              <w:t>Assigned Clubs Only</w:t>
+            </w:r>
+          </w:p>
+        </w:tc>
+        <w:tc>
+          <w:tcPr>
+            <w:tcW w:type="dxa" w:w="2448"/>
+            <w:shd w:val="clear" w:color="auto" w:fill="F8FAFC"/>
+            <w:tcMar>
+              <w:top w:w="80" w:type="dxa"/>
+              <w:bottom w:w="80" w:type="dxa"/>
+              <w:left w:w="120" w:type="dxa"/>
+              <w:right w:w="120" w:type="dxa"/>
+            </w:tcMar>
+          </w:tcPr>
+          <w:p>
+            <w:pPr>
+              <w:jc w:val="left"/>
+            </w:pPr>
+            <w:r>
+              <w:rPr>
+                <w:rFonts w:ascii="Times New Roman" w:hAnsi="Times New Roman"/>
+                <w:color w:val="1E293B"/>
+                <w:sz w:val="20"/>
+              </w:rPr>
+              <w:t>Read-Only Dept View</w:t>
+            </w:r>
+          </w:p>
+        </w:tc>
+        <w:tc>
+          <w:tcPr>
+            <w:tcW w:type="dxa" w:w="2448"/>
+            <w:shd w:val="clear" w:color="auto" w:fill="F8FAFC"/>
+            <w:tcMar>
+              <w:top w:w="80" w:type="dxa"/>
+              <w:bottom w:w="80" w:type="dxa"/>
+              <w:left w:w="120" w:type="dxa"/>
+              <w:right w:w="120" w:type="dxa"/>
+            </w:tcMar>
+          </w:tcPr>
+          <w:p>
+            <w:pPr>
+              <w:jc w:val="left"/>
+            </w:pPr>
+            <w:r>
+              <w:rPr>
+                <w:rFonts w:ascii="Times New Roman" w:hAnsi="Times New Roman"/>
+                <w:color w:val="1E293B"/>
+                <w:sz w:val="20"/>
+              </w:rPr>
+              <w:t>Create Clubs &amp; Assign Coordinators</w:t>
+            </w:r>
+          </w:p>
+        </w:tc>
+      </w:tr>
+      <w:tr>
+        <w:tc>
+          <w:tcPr>
+            <w:tcW w:type="dxa" w:w="2880"/>
+            <w:shd w:val="clear" w:color="auto" w:fill="FFFFFF"/>
+            <w:tcMar>
+              <w:top w:w="80" w:type="dxa"/>
+              <w:bottom w:w="80" w:type="dxa"/>
+              <w:left w:w="120" w:type="dxa"/>
+              <w:right w:w="120" w:type="dxa"/>
+            </w:tcMar>
+          </w:tcPr>
+          <w:p>
+            <w:pPr>
+              <w:jc w:val="left"/>
+            </w:pPr>
+            <w:r>
+              <w:rPr>
+                <w:rFonts w:ascii="Times New Roman" w:hAnsi="Times New Roman"/>
+                <w:color w:val="1E293B"/>
+                <w:sz w:val="20"/>
+              </w:rPr>
+              <w:t>Responsibilities Assignment</w:t>
+            </w:r>
+          </w:p>
+        </w:tc>
+        <w:tc>
+          <w:tcPr>
+            <w:tcW w:type="dxa" w:w="2304"/>
+            <w:shd w:val="clear" w:color="auto" w:fill="FFFFFF"/>
+            <w:tcMar>
+              <w:top w:w="80" w:type="dxa"/>
+              <w:bottom w:w="80" w:type="dxa"/>
+              <w:left w:w="120" w:type="dxa"/>
+              <w:right w:w="120" w:type="dxa"/>
+            </w:tcMar>
+          </w:tcPr>
+          <w:p>
+            <w:pPr>
+              <w:jc w:val="left"/>
+            </w:pPr>
+            <w:r>
+              <w:rPr>
+                <w:rFonts w:ascii="Times New Roman" w:hAnsi="Times New Roman"/>
+                <w:color w:val="1E293B"/>
+                <w:sz w:val="20"/>
+              </w:rPr>
+              <w:t>View Assigned Duties</w:t>
+            </w:r>
+          </w:p>
+        </w:tc>
+        <w:tc>
+          <w:tcPr>
+            <w:tcW w:type="dxa" w:w="2448"/>
+            <w:shd w:val="clear" w:color="auto" w:fill="FFFFFF"/>
+            <w:tcMar>
+              <w:top w:w="80" w:type="dxa"/>
+              <w:bottom w:w="80" w:type="dxa"/>
+              <w:left w:w="120" w:type="dxa"/>
+              <w:right w:w="120" w:type="dxa"/>
+            </w:tcMar>
+          </w:tcPr>
+          <w:p>
+            <w:pPr>
+              <w:jc w:val="left"/>
+            </w:pPr>
+            <w:r>
+              <w:rPr>
+                <w:rFonts w:ascii="Times New Roman" w:hAnsi="Times New Roman"/>
+                <w:color w:val="1E293B"/>
+                <w:sz w:val="20"/>
+              </w:rPr>
+              <w:t>Assign Departmental Duties</w:t>
+            </w:r>
+          </w:p>
+        </w:tc>
+        <w:tc>
+          <w:tcPr>
+            <w:tcW w:type="dxa" w:w="2448"/>
+            <w:shd w:val="clear" w:color="auto" w:fill="FFFFFF"/>
+            <w:tcMar>
+              <w:top w:w="80" w:type="dxa"/>
+              <w:bottom w:w="80" w:type="dxa"/>
+              <w:left w:w="120" w:type="dxa"/>
+              <w:right w:w="120" w:type="dxa"/>
+            </w:tcMar>
+          </w:tcPr>
+          <w:p>
+            <w:pPr>
+              <w:jc w:val="left"/>
+            </w:pPr>
+            <w:r>
+              <w:rPr>
+                <w:rFonts w:ascii="Times New Roman" w:hAnsi="Times New Roman"/>
+                <w:color w:val="1E293B"/>
+                <w:sz w:val="20"/>
+              </w:rPr>
+              <w:t>Assign Institutional Duties</w:t>
+            </w:r>
+          </w:p>
+        </w:tc>
+      </w:tr>
+      <w:tr>
+        <w:tc>
+          <w:tcPr>
+            <w:tcW w:type="dxa" w:w="2880"/>
+            <w:shd w:val="clear" w:color="auto" w:fill="F8FAFC"/>
+            <w:tcMar>
+              <w:top w:w="80" w:type="dxa"/>
+              <w:bottom w:w="80" w:type="dxa"/>
+              <w:left w:w="120" w:type="dxa"/>
+              <w:right w:w="120" w:type="dxa"/>
+            </w:tcMar>
+          </w:tcPr>
+          <w:p>
+            <w:pPr>
+              <w:jc w:val="left"/>
+            </w:pPr>
+            <w:r>
+              <w:rPr>
+                <w:rFonts w:ascii="Times New Roman" w:hAnsi="Times New Roman"/>
+                <w:color w:val="1E293B"/>
+                <w:sz w:val="20"/>
+              </w:rPr>
+              <w:t>Appraisal Self-Submission</w:t>
+            </w:r>
+          </w:p>
+        </w:tc>
+        <w:tc>
+          <w:tcPr>
+            <w:tcW w:type="dxa" w:w="2304"/>
+            <w:shd w:val="clear" w:color="auto" w:fill="F8FAFC"/>
+            <w:tcMar>
+              <w:top w:w="80" w:type="dxa"/>
+              <w:bottom w:w="80" w:type="dxa"/>
+              <w:left w:w="120" w:type="dxa"/>
+              <w:right w:w="120" w:type="dxa"/>
+            </w:tcMar>
+          </w:tcPr>
+          <w:p>
+            <w:pPr>
+              <w:jc w:val="left"/>
+            </w:pPr>
+            <w:r>
+              <w:rPr>
+                <w:rFonts w:ascii="Times New Roman" w:hAnsi="Times New Roman"/>
+                <w:color w:val="1E293B"/>
+                <w:sz w:val="20"/>
+              </w:rPr>
+              <w:t>Self-Score &amp; Submit (Part A-D)</w:t>
+            </w:r>
+          </w:p>
+        </w:tc>
+        <w:tc>
+          <w:tcPr>
+            <w:tcW w:type="dxa" w:w="2448"/>
+            <w:shd w:val="clear" w:color="auto" w:fill="F8FAFC"/>
+            <w:tcMar>
+              <w:top w:w="80" w:type="dxa"/>
+              <w:bottom w:w="80" w:type="dxa"/>
+              <w:left w:w="120" w:type="dxa"/>
+              <w:right w:w="120" w:type="dxa"/>
+            </w:tcMar>
+          </w:tcPr>
+          <w:p>
+            <w:pPr>
+              <w:jc w:val="left"/>
+            </w:pPr>
+            <w:r>
+              <w:rPr>
+                <w:rFonts w:ascii="Times New Roman" w:hAnsi="Times New Roman"/>
+                <w:color w:val="1E293B"/>
+                <w:sz w:val="20"/>
+              </w:rPr>
+              <w:t>Cannot Self-Submit in Admin View</w:t>
+            </w:r>
+          </w:p>
+        </w:tc>
+        <w:tc>
+          <w:tcPr>
+            <w:tcW w:type="dxa" w:w="2448"/>
+            <w:shd w:val="clear" w:color="auto" w:fill="F8FAFC"/>
+            <w:tcMar>
+              <w:top w:w="80" w:type="dxa"/>
+              <w:bottom w:w="80" w:type="dxa"/>
+              <w:left w:w="120" w:type="dxa"/>
+              <w:right w:w="120" w:type="dxa"/>
+            </w:tcMar>
+          </w:tcPr>
+          <w:p>
+            <w:pPr>
+              <w:jc w:val="left"/>
+            </w:pPr>
+            <w:r>
+              <w:rPr>
+                <w:rFonts w:ascii="Times New Roman" w:hAnsi="Times New Roman"/>
+                <w:color w:val="1E293B"/>
+                <w:sz w:val="20"/>
+              </w:rPr>
+              <w:t>Cannot Self-Submit in Admin View</w:t>
+            </w:r>
+          </w:p>
+        </w:tc>
+      </w:tr>
+      <w:tr>
+        <w:tc>
+          <w:tcPr>
+            <w:tcW w:type="dxa" w:w="2880"/>
+            <w:shd w:val="clear" w:color="auto" w:fill="FFFFFF"/>
+            <w:tcMar>
+              <w:top w:w="80" w:type="dxa"/>
+              <w:bottom w:w="80" w:type="dxa"/>
+              <w:left w:w="120" w:type="dxa"/>
+              <w:right w:w="120" w:type="dxa"/>
+            </w:tcMar>
+          </w:tcPr>
+          <w:p>
+            <w:pPr>
+              <w:jc w:val="left"/>
+            </w:pPr>
+            <w:r>
+              <w:rPr>
+                <w:rFonts w:ascii="Times New Roman" w:hAnsi="Times New Roman"/>
+                <w:color w:val="1E293B"/>
+                <w:sz w:val="20"/>
+              </w:rPr>
+              <w:t>Appraisal Evaluation / Scoring</w:t>
+            </w:r>
+          </w:p>
+        </w:tc>
+        <w:tc>
+          <w:tcPr>
+            <w:tcW w:type="dxa" w:w="2304"/>
+            <w:shd w:val="clear" w:color="auto" w:fill="FFFFFF"/>
+            <w:tcMar>
+              <w:top w:w="80" w:type="dxa"/>
+              <w:bottom w:w="80" w:type="dxa"/>
+              <w:left w:w="120" w:type="dxa"/>
+              <w:right w:w="120" w:type="dxa"/>
+            </w:tcMar>
+          </w:tcPr>
+          <w:p>
+            <w:pPr>
+              <w:jc w:val="left"/>
+            </w:pPr>
+            <w:r>
+              <w:rPr>
+                <w:rFonts w:ascii="Times New Roman" w:hAnsi="Times New Roman"/>
+                <w:color w:val="1E293B"/>
+                <w:sz w:val="20"/>
+              </w:rPr>
+              <w:t>None (Self-Evaluation Only)</w:t>
+            </w:r>
+          </w:p>
+        </w:tc>
+        <w:tc>
+          <w:tcPr>
+            <w:tcW w:type="dxa" w:w="2448"/>
+            <w:shd w:val="clear" w:color="auto" w:fill="FFFFFF"/>
+            <w:tcMar>
+              <w:top w:w="80" w:type="dxa"/>
+              <w:bottom w:w="80" w:type="dxa"/>
+              <w:left w:w="120" w:type="dxa"/>
+              <w:right w:w="120" w:type="dxa"/>
+            </w:tcMar>
+          </w:tcPr>
+          <w:p>
+            <w:pPr>
+              <w:jc w:val="left"/>
+            </w:pPr>
+            <w:r>
+              <w:rPr>
+                <w:rFonts w:ascii="Times New Roman" w:hAnsi="Times New Roman"/>
+                <w:color w:val="1E293B"/>
+                <w:sz w:val="20"/>
+              </w:rPr>
+              <w:t>Part-by-Part HOD Scoring</w:t>
+            </w:r>
+          </w:p>
+        </w:tc>
+        <w:tc>
+          <w:tcPr>
+            <w:tcW w:type="dxa" w:w="2448"/>
+            <w:shd w:val="clear" w:color="auto" w:fill="FFFFFF"/>
+            <w:tcMar>
+              <w:top w:w="80" w:type="dxa"/>
+              <w:bottom w:w="80" w:type="dxa"/>
+              <w:left w:w="120" w:type="dxa"/>
+              <w:right w:w="120" w:type="dxa"/>
+            </w:tcMar>
+          </w:tcPr>
+          <w:p>
+            <w:pPr>
+              <w:jc w:val="left"/>
+            </w:pPr>
+            <w:r>
+              <w:rPr>
+                <w:rFonts w:ascii="Times New Roman" w:hAnsi="Times New Roman"/>
+                <w:color w:val="1E293B"/>
+                <w:sz w:val="20"/>
+              </w:rPr>
+              <w:t>Final Executive Scoring &amp; Overrides</w:t>
+            </w:r>
+          </w:p>
+        </w:tc>
+      </w:tr>
+      <w:tr>
+        <w:tc>
+          <w:tcPr>
+            <w:tcW w:type="dxa" w:w="2880"/>
+            <w:shd w:val="clear" w:color="auto" w:fill="F8FAFC"/>
+            <w:tcMar>
+              <w:top w:w="80" w:type="dxa"/>
+              <w:bottom w:w="80" w:type="dxa"/>
+              <w:left w:w="120" w:type="dxa"/>
+              <w:right w:w="120" w:type="dxa"/>
+            </w:tcMar>
+          </w:tcPr>
+          <w:p>
+            <w:pPr>
+              <w:jc w:val="left"/>
+            </w:pPr>
+            <w:r>
+              <w:rPr>
+                <w:rFonts w:ascii="Times New Roman" w:hAnsi="Times New Roman"/>
+                <w:color w:val="1E293B"/>
+                <w:sz w:val="20"/>
+              </w:rPr>
+              <w:t>Appraisal Bulk Sign &amp; Approve</w:t>
+            </w:r>
+          </w:p>
+        </w:tc>
+        <w:tc>
+          <w:tcPr>
+            <w:tcW w:type="dxa" w:w="2304"/>
+            <w:shd w:val="clear" w:color="auto" w:fill="F8FAFC"/>
+            <w:tcMar>
+              <w:top w:w="80" w:type="dxa"/>
+              <w:bottom w:w="80" w:type="dxa"/>
+              <w:left w:w="120" w:type="dxa"/>
+              <w:right w:w="120" w:type="dxa"/>
+            </w:tcMar>
+          </w:tcPr>
+          <w:p>
+            <w:pPr>
+              <w:jc w:val="left"/>
+            </w:pPr>
+            <w:r>
+              <w:rPr>
+                <w:rFonts w:ascii="Times New Roman" w:hAnsi="Times New Roman"/>
+                <w:color w:val="1E293B"/>
+                <w:sz w:val="20"/>
+              </w:rPr>
+              <w:t>Not Available</w:t>
+            </w:r>
+          </w:p>
+        </w:tc>
+        <w:tc>
+          <w:tcPr>
+            <w:tcW w:type="dxa" w:w="2448"/>
+            <w:shd w:val="clear" w:color="auto" w:fill="F8FAFC"/>
+            <w:tcMar>
+              <w:top w:w="80" w:type="dxa"/>
+              <w:bottom w:w="80" w:type="dxa"/>
+              <w:left w:w="120" w:type="dxa"/>
+              <w:right w:w="120" w:type="dxa"/>
+            </w:tcMar>
+          </w:tcPr>
+          <w:p>
+            <w:pPr>
+              <w:jc w:val="left"/>
+            </w:pPr>
+            <w:r>
+              <w:rPr>
+                <w:rFonts w:ascii="Times New Roman" w:hAnsi="Times New Roman"/>
+                <w:color w:val="1E293B"/>
+                <w:sz w:val="20"/>
+              </w:rPr>
+              <w:t>✍️ Bulk HOD Sign &amp; Approve</w:t>
+            </w:r>
+          </w:p>
+        </w:tc>
+        <w:tc>
+          <w:tcPr>
+            <w:tcW w:type="dxa" w:w="2448"/>
+            <w:shd w:val="clear" w:color="auto" w:fill="F8FAFC"/>
+            <w:tcMar>
+              <w:top w:w="80" w:type="dxa"/>
+              <w:bottom w:w="80" w:type="dxa"/>
+              <w:left w:w="120" w:type="dxa"/>
+              <w:right w:w="120" w:type="dxa"/>
+            </w:tcMar>
+          </w:tcPr>
+          <w:p>
+            <w:pPr>
+              <w:jc w:val="left"/>
+            </w:pPr>
+            <w:r>
+              <w:rPr>
+                <w:rFonts w:ascii="Times New Roman" w:hAnsi="Times New Roman"/>
+                <w:color w:val="1E293B"/>
+                <w:sz w:val="20"/>
+              </w:rPr>
+              <w:t>✍️ Multi-Mode Bulk Executive Sign</w:t>
+            </w:r>
+          </w:p>
+        </w:tc>
+      </w:tr>
+      <w:tr>
+        <w:tc>
+          <w:tcPr>
+            <w:tcW w:type="dxa" w:w="2880"/>
+            <w:shd w:val="clear" w:color="auto" w:fill="FFFFFF"/>
+            <w:tcMar>
+              <w:top w:w="80" w:type="dxa"/>
+              <w:bottom w:w="80" w:type="dxa"/>
+              <w:left w:w="120" w:type="dxa"/>
+              <w:right w:w="120" w:type="dxa"/>
+            </w:tcMar>
+          </w:tcPr>
+          <w:p>
+            <w:pPr>
+              <w:jc w:val="left"/>
+            </w:pPr>
+            <w:r>
+              <w:rPr>
+                <w:rFonts w:ascii="Times New Roman" w:hAnsi="Times New Roman"/>
+                <w:color w:val="1E293B"/>
+                <w:sz w:val="20"/>
+              </w:rPr>
+              <w:t>Appraisal Return for Correction</w:t>
+            </w:r>
+          </w:p>
+        </w:tc>
+        <w:tc>
+          <w:tcPr>
+            <w:tcW w:type="dxa" w:w="2304"/>
+            <w:shd w:val="clear" w:color="auto" w:fill="FFFFFF"/>
+            <w:tcMar>
+              <w:top w:w="80" w:type="dxa"/>
+              <w:bottom w:w="80" w:type="dxa"/>
+              <w:left w:w="120" w:type="dxa"/>
+              <w:right w:w="120" w:type="dxa"/>
+            </w:tcMar>
+          </w:tcPr>
+          <w:p>
+            <w:pPr>
+              <w:jc w:val="left"/>
+            </w:pPr>
+            <w:r>
+              <w:rPr>
+                <w:rFonts w:ascii="Times New Roman" w:hAnsi="Times New Roman"/>
+                <w:color w:val="1E293B"/>
+                <w:sz w:val="20"/>
+              </w:rPr>
+              <w:t>Receive Revision Request</w:t>
+            </w:r>
+          </w:p>
+        </w:tc>
+        <w:tc>
+          <w:tcPr>
+            <w:tcW w:type="dxa" w:w="2448"/>
+            <w:shd w:val="clear" w:color="auto" w:fill="FFFFFF"/>
+            <w:tcMar>
+              <w:top w:w="80" w:type="dxa"/>
+              <w:bottom w:w="80" w:type="dxa"/>
+              <w:left w:w="120" w:type="dxa"/>
+              <w:right w:w="120" w:type="dxa"/>
+            </w:tcMar>
+          </w:tcPr>
+          <w:p>
+            <w:pPr>
+              <w:jc w:val="left"/>
+            </w:pPr>
+            <w:r>
+              <w:rPr>
+                <w:rFonts w:ascii="Times New Roman" w:hAnsi="Times New Roman"/>
+                <w:color w:val="1E293B"/>
+                <w:sz w:val="20"/>
+              </w:rPr>
+              <w:t>Return to Faculty with Remarks</w:t>
+            </w:r>
+          </w:p>
+        </w:tc>
+        <w:tc>
+          <w:tcPr>
+            <w:tcW w:type="dxa" w:w="2448"/>
+            <w:shd w:val="clear" w:color="auto" w:fill="FFFFFF"/>
+            <w:tcMar>
+              <w:top w:w="80" w:type="dxa"/>
+              <w:bottom w:w="80" w:type="dxa"/>
+              <w:left w:w="120" w:type="dxa"/>
+              <w:right w:w="120" w:type="dxa"/>
+            </w:tcMar>
+          </w:tcPr>
+          <w:p>
+            <w:pPr>
+              <w:jc w:val="left"/>
+            </w:pPr>
+            <w:r>
+              <w:rPr>
+                <w:rFonts w:ascii="Times New Roman" w:hAnsi="Times New Roman"/>
+                <w:color w:val="1E293B"/>
+                <w:sz w:val="20"/>
+              </w:rPr>
+              <w:t>Return to HOD or Faculty</w:t>
+            </w:r>
+          </w:p>
+        </w:tc>
+      </w:tr>
+      <w:tr>
+        <w:tc>
+          <w:tcPr>
+            <w:tcW w:type="dxa" w:w="2880"/>
+            <w:shd w:val="clear" w:color="auto" w:fill="F8FAFC"/>
+            <w:tcMar>
+              <w:top w:w="80" w:type="dxa"/>
+              <w:bottom w:w="80" w:type="dxa"/>
+              <w:left w:w="120" w:type="dxa"/>
+              <w:right w:w="120" w:type="dxa"/>
+            </w:tcMar>
+          </w:tcPr>
+          <w:p>
+            <w:pPr>
+              <w:jc w:val="left"/>
+            </w:pPr>
+            <w:r>
+              <w:rPr>
+                <w:rFonts w:ascii="Times New Roman" w:hAnsi="Times New Roman"/>
+                <w:color w:val="1E293B"/>
+                <w:sz w:val="20"/>
+              </w:rPr>
+              <w:t>Rubric &amp; Form Builder</w:t>
+            </w:r>
+          </w:p>
+        </w:tc>
+        <w:tc>
+          <w:tcPr>
+            <w:tcW w:type="dxa" w:w="2304"/>
+            <w:shd w:val="clear" w:color="auto" w:fill="F8FAFC"/>
+            <w:tcMar>
+              <w:top w:w="80" w:type="dxa"/>
+              <w:bottom w:w="80" w:type="dxa"/>
+              <w:left w:w="120" w:type="dxa"/>
+              <w:right w:w="120" w:type="dxa"/>
+            </w:tcMar>
+          </w:tcPr>
+          <w:p>
+            <w:pPr>
+              <w:jc w:val="left"/>
+            </w:pPr>
+            <w:r>
+              <w:rPr>
+                <w:rFonts w:ascii="Times New Roman" w:hAnsi="Times New Roman"/>
+                <w:color w:val="1E293B"/>
+                <w:sz w:val="20"/>
+              </w:rPr>
+              <w:t>Not Available</w:t>
+            </w:r>
+          </w:p>
+        </w:tc>
+        <w:tc>
+          <w:tcPr>
+            <w:tcW w:type="dxa" w:w="2448"/>
+            <w:shd w:val="clear" w:color="auto" w:fill="F8FAFC"/>
+            <w:tcMar>
+              <w:top w:w="80" w:type="dxa"/>
+              <w:bottom w:w="80" w:type="dxa"/>
+              <w:left w:w="120" w:type="dxa"/>
+              <w:right w:w="120" w:type="dxa"/>
+            </w:tcMar>
+          </w:tcPr>
+          <w:p>
+            <w:pPr>
+              <w:jc w:val="left"/>
+            </w:pPr>
+            <w:r>
+              <w:rPr>
+                <w:rFonts w:ascii="Times New Roman" w:hAnsi="Times New Roman"/>
+                <w:color w:val="1E293B"/>
+                <w:sz w:val="20"/>
+              </w:rPr>
+              <w:t>Not Available</w:t>
+            </w:r>
+          </w:p>
+        </w:tc>
+        <w:tc>
+          <w:tcPr>
+            <w:tcW w:type="dxa" w:w="2448"/>
+            <w:shd w:val="clear" w:color="auto" w:fill="F8FAFC"/>
+            <w:tcMar>
+              <w:top w:w="80" w:type="dxa"/>
+              <w:bottom w:w="80" w:type="dxa"/>
+              <w:left w:w="120" w:type="dxa"/>
+              <w:right w:w="120" w:type="dxa"/>
+            </w:tcMar>
+          </w:tcPr>
+          <w:p>
+            <w:pPr>
+              <w:jc w:val="left"/>
+            </w:pPr>
+            <w:r>
+              <w:rPr>
+                <w:rFonts w:ascii="Times New Roman" w:hAnsi="Times New Roman"/>
+                <w:color w:val="1E293B"/>
+                <w:sz w:val="20"/>
+              </w:rPr>
+              <w:t>⚙️ Config Rubric, Brackets &amp; Parts</w:t>
+            </w:r>
+          </w:p>
+        </w:tc>
+      </w:tr>
+      <w:tr>
+        <w:tc>
+          <w:tcPr>
+            <w:tcW w:type="dxa" w:w="2880"/>
+            <w:shd w:val="clear" w:color="auto" w:fill="FFFFFF"/>
+            <w:tcMar>
+              <w:top w:w="80" w:type="dxa"/>
+              <w:bottom w:w="80" w:type="dxa"/>
+              <w:left w:w="120" w:type="dxa"/>
+              <w:right w:w="120" w:type="dxa"/>
+            </w:tcMar>
+          </w:tcPr>
+          <w:p>
+            <w:pPr>
+              <w:jc w:val="left"/>
+            </w:pPr>
+            <w:r>
+              <w:rPr>
+                <w:rFonts w:ascii="Times New Roman" w:hAnsi="Times New Roman"/>
+                <w:color w:val="1E293B"/>
+                <w:sz w:val="20"/>
+              </w:rPr>
+              <w:t>AI CV &amp; Bio-Data Generator</w:t>
+            </w:r>
+          </w:p>
+        </w:tc>
+        <w:tc>
+          <w:tcPr>
+            <w:tcW w:type="dxa" w:w="2304"/>
+            <w:shd w:val="clear" w:color="auto" w:fill="FFFFFF"/>
+            <w:tcMar>
+              <w:top w:w="80" w:type="dxa"/>
+              <w:bottom w:w="80" w:type="dxa"/>
+              <w:left w:w="120" w:type="dxa"/>
+              <w:right w:w="120" w:type="dxa"/>
+            </w:tcMar>
+          </w:tcPr>
+          <w:p>
+            <w:pPr>
+              <w:jc w:val="left"/>
+            </w:pPr>
+            <w:r>
+              <w:rPr>
+                <w:rFonts w:ascii="Times New Roman" w:hAnsi="Times New Roman"/>
+                <w:color w:val="1E293B"/>
+                <w:sz w:val="20"/>
+              </w:rPr>
+              <w:t>Generate 3 Formats + AI Summary</w:t>
+            </w:r>
+          </w:p>
+        </w:tc>
+        <w:tc>
+          <w:tcPr>
+            <w:tcW w:type="dxa" w:w="2448"/>
+            <w:shd w:val="clear" w:color="auto" w:fill="FFFFFF"/>
+            <w:tcMar>
+              <w:top w:w="80" w:type="dxa"/>
+              <w:bottom w:w="80" w:type="dxa"/>
+              <w:left w:w="120" w:type="dxa"/>
+              <w:right w:w="120" w:type="dxa"/>
+            </w:tcMar>
+          </w:tcPr>
+          <w:p>
+            <w:pPr>
+              <w:jc w:val="left"/>
+            </w:pPr>
+            <w:r>
+              <w:rPr>
+                <w:rFonts w:ascii="Times New Roman" w:hAnsi="Times New Roman"/>
+                <w:color w:val="1E293B"/>
+                <w:sz w:val="20"/>
+              </w:rPr>
+              <w:t>View &amp; Download Faculty CVs</w:t>
+            </w:r>
+          </w:p>
+        </w:tc>
+        <w:tc>
+          <w:tcPr>
+            <w:tcW w:type="dxa" w:w="2448"/>
+            <w:shd w:val="clear" w:color="auto" w:fill="FFFFFF"/>
+            <w:tcMar>
+              <w:top w:w="80" w:type="dxa"/>
+              <w:bottom w:w="80" w:type="dxa"/>
+              <w:left w:w="120" w:type="dxa"/>
+              <w:right w:w="120" w:type="dxa"/>
+            </w:tcMar>
+          </w:tcPr>
+          <w:p>
+            <w:pPr>
+              <w:jc w:val="left"/>
+            </w:pPr>
+            <w:r>
+              <w:rPr>
+                <w:rFonts w:ascii="Times New Roman" w:hAnsi="Times New Roman"/>
+                <w:color w:val="1E293B"/>
+                <w:sz w:val="20"/>
+              </w:rPr>
+              <w:t>View &amp; Download Faculty CVs</w:t>
+            </w:r>
+          </w:p>
+        </w:tc>
+      </w:tr>
+      <w:tr>
+        <w:tc>
+          <w:tcPr>
+            <w:tcW w:type="dxa" w:w="2880"/>
+            <w:shd w:val="clear" w:color="auto" w:fill="F8FAFC"/>
+            <w:tcMar>
+              <w:top w:w="80" w:type="dxa"/>
+              <w:bottom w:w="80" w:type="dxa"/>
+              <w:left w:w="120" w:type="dxa"/>
+              <w:right w:w="120" w:type="dxa"/>
+            </w:tcMar>
+          </w:tcPr>
+          <w:p>
+            <w:pPr>
+              <w:jc w:val="left"/>
+            </w:pPr>
+            <w:r>
+              <w:rPr>
+                <w:rFonts w:ascii="Times New Roman" w:hAnsi="Times New Roman"/>
+                <w:color w:val="1E293B"/>
+                <w:sz w:val="20"/>
+              </w:rPr>
+              <w:t>Dossier &amp; Report Generation</w:t>
+            </w:r>
+          </w:p>
+        </w:tc>
+        <w:tc>
+          <w:tcPr>
+            <w:tcW w:type="dxa" w:w="2304"/>
+            <w:shd w:val="clear" w:color="auto" w:fill="F8FAFC"/>
+            <w:tcMar>
+              <w:top w:w="80" w:type="dxa"/>
+              <w:bottom w:w="80" w:type="dxa"/>
+              <w:left w:w="120" w:type="dxa"/>
+              <w:right w:w="120" w:type="dxa"/>
+            </w:tcMar>
+          </w:tcPr>
+          <w:p>
+            <w:pPr>
+              <w:jc w:val="left"/>
+            </w:pPr>
+            <w:r>
+              <w:rPr>
+                <w:rFonts w:ascii="Times New Roman" w:hAnsi="Times New Roman"/>
+                <w:color w:val="1E293B"/>
+                <w:sz w:val="20"/>
+              </w:rPr>
+              <w:t>Self Dossier (PDF/Excel/ZIP)</w:t>
+            </w:r>
+          </w:p>
+        </w:tc>
+        <w:tc>
+          <w:tcPr>
+            <w:tcW w:type="dxa" w:w="2448"/>
+            <w:shd w:val="clear" w:color="auto" w:fill="F8FAFC"/>
+            <w:tcMar>
+              <w:top w:w="80" w:type="dxa"/>
+              <w:bottom w:w="80" w:type="dxa"/>
+              <w:left w:w="120" w:type="dxa"/>
+              <w:right w:w="120" w:type="dxa"/>
+            </w:tcMar>
+          </w:tcPr>
+          <w:p>
+            <w:pPr>
+              <w:jc w:val="left"/>
+            </w:pPr>
+            <w:r>
+              <w:rPr>
+                <w:rFonts w:ascii="Times New Roman" w:hAnsi="Times New Roman"/>
+                <w:color w:val="1E293B"/>
+                <w:sz w:val="20"/>
+              </w:rPr>
+              <w:t>Dept Aggregated Dossiers</w:t>
+            </w:r>
+          </w:p>
+        </w:tc>
+        <w:tc>
+          <w:tcPr>
+            <w:tcW w:type="dxa" w:w="2448"/>
+            <w:shd w:val="clear" w:color="auto" w:fill="F8FAFC"/>
+            <w:tcMar>
+              <w:top w:w="80" w:type="dxa"/>
+              <w:bottom w:w="80" w:type="dxa"/>
+              <w:left w:w="120" w:type="dxa"/>
+              <w:right w:w="120" w:type="dxa"/>
+            </w:tcMar>
+          </w:tcPr>
+          <w:p>
+            <w:pPr>
+              <w:jc w:val="left"/>
+            </w:pPr>
+            <w:r>
+              <w:rPr>
+                <w:rFonts w:ascii="Times New Roman" w:hAnsi="Times New Roman"/>
+                <w:color w:val="1E293B"/>
+                <w:sz w:val="20"/>
+              </w:rPr>
+              <w:t>Institution Bulk Dossier ZIP Exporter</w:t>
+            </w:r>
+          </w:p>
+        </w:tc>
+      </w:tr>
+      <w:tr>
+        <w:tc>
+          <w:tcPr>
+            <w:tcW w:type="dxa" w:w="2880"/>
+            <w:shd w:val="clear" w:color="auto" w:fill="FFFFFF"/>
+            <w:tcMar>
+              <w:top w:w="80" w:type="dxa"/>
+              <w:bottom w:w="80" w:type="dxa"/>
+              <w:left w:w="120" w:type="dxa"/>
+              <w:right w:w="120" w:type="dxa"/>
+            </w:tcMar>
+          </w:tcPr>
+          <w:p>
+            <w:pPr>
+              <w:jc w:val="left"/>
+            </w:pPr>
+            <w:r>
+              <w:rPr>
+                <w:rFonts w:ascii="Times New Roman" w:hAnsi="Times New Roman"/>
+                <w:color w:val="1E293B"/>
+                <w:sz w:val="20"/>
+              </w:rPr>
+              <w:t>Faculty Department Transfer</w:t>
+            </w:r>
+          </w:p>
+        </w:tc>
+        <w:tc>
+          <w:tcPr>
+            <w:tcW w:type="dxa" w:w="2304"/>
+            <w:shd w:val="clear" w:color="auto" w:fill="FFFFFF"/>
+            <w:tcMar>
+              <w:top w:w="80" w:type="dxa"/>
+              <w:bottom w:w="80" w:type="dxa"/>
+              <w:left w:w="120" w:type="dxa"/>
+              <w:right w:w="120" w:type="dxa"/>
+            </w:tcMar>
+          </w:tcPr>
+          <w:p>
+            <w:pPr>
+              <w:jc w:val="left"/>
+            </w:pPr>
+            <w:r>
+              <w:rPr>
+                <w:rFonts w:ascii="Times New Roman" w:hAnsi="Times New Roman"/>
+                <w:color w:val="1E293B"/>
+                <w:sz w:val="20"/>
+              </w:rPr>
+              <w:t>Not Available</w:t>
+            </w:r>
+          </w:p>
+        </w:tc>
+        <w:tc>
+          <w:tcPr>
+            <w:tcW w:type="dxa" w:w="2448"/>
+            <w:shd w:val="clear" w:color="auto" w:fill="FFFFFF"/>
+            <w:tcMar>
+              <w:top w:w="80" w:type="dxa"/>
+              <w:bottom w:w="80" w:type="dxa"/>
+              <w:left w:w="120" w:type="dxa"/>
+              <w:right w:w="120" w:type="dxa"/>
+            </w:tcMar>
+          </w:tcPr>
+          <w:p>
+            <w:pPr>
+              <w:jc w:val="left"/>
+            </w:pPr>
+            <w:r>
+              <w:rPr>
+                <w:rFonts w:ascii="Times New Roman" w:hAnsi="Times New Roman"/>
+                <w:color w:val="1E293B"/>
+                <w:sz w:val="20"/>
+              </w:rPr>
+              <w:t>Not Available</w:t>
+            </w:r>
+          </w:p>
+        </w:tc>
+        <w:tc>
+          <w:tcPr>
+            <w:tcW w:type="dxa" w:w="2448"/>
+            <w:shd w:val="clear" w:color="auto" w:fill="FFFFFF"/>
+            <w:tcMar>
+              <w:top w:w="80" w:type="dxa"/>
+              <w:bottom w:w="80" w:type="dxa"/>
+              <w:left w:w="120" w:type="dxa"/>
+              <w:right w:w="120" w:type="dxa"/>
+            </w:tcMar>
+          </w:tcPr>
+          <w:p>
+            <w:pPr>
+              <w:jc w:val="left"/>
+            </w:pPr>
+            <w:r>
+              <w:rPr>
+                <w:rFonts w:ascii="Times New Roman" w:hAnsi="Times New Roman"/>
+                <w:color w:val="1E293B"/>
+                <w:sz w:val="20"/>
+              </w:rPr>
+              <w:t>Atomic Transfer + Disk &amp; DB Remap</w:t>
+            </w:r>
+          </w:p>
+        </w:tc>
+      </w:tr>
+      <w:tr>
+        <w:tc>
+          <w:tcPr>
+            <w:tcW w:type="dxa" w:w="2880"/>
+            <w:shd w:val="clear" w:color="auto" w:fill="F8FAFC"/>
+            <w:tcMar>
+              <w:top w:w="80" w:type="dxa"/>
+              <w:bottom w:w="80" w:type="dxa"/>
+              <w:left w:w="120" w:type="dxa"/>
+              <w:right w:w="120" w:type="dxa"/>
+            </w:tcMar>
+          </w:tcPr>
+          <w:p>
+            <w:pPr>
+              <w:jc w:val="left"/>
+            </w:pPr>
+            <w:r>
+              <w:rPr>
+                <w:rFonts w:ascii="Times New Roman" w:hAnsi="Times New Roman"/>
+                <w:color w:val="1E293B"/>
+                <w:sz w:val="20"/>
+              </w:rPr>
+              <w:t>Accreditation Suite (NBA/NAAC)</w:t>
+            </w:r>
+          </w:p>
+        </w:tc>
+        <w:tc>
+          <w:tcPr>
+            <w:tcW w:type="dxa" w:w="2304"/>
+            <w:shd w:val="clear" w:color="auto" w:fill="F8FAFC"/>
+            <w:tcMar>
+              <w:top w:w="80" w:type="dxa"/>
+              <w:bottom w:w="80" w:type="dxa"/>
+              <w:left w:w="120" w:type="dxa"/>
+              <w:right w:w="120" w:type="dxa"/>
+            </w:tcMar>
+          </w:tcPr>
+          <w:p>
+            <w:pPr>
+              <w:jc w:val="left"/>
+            </w:pPr>
+            <w:r>
+              <w:rPr>
+                <w:rFonts w:ascii="Times New Roman" w:hAnsi="Times New Roman"/>
+                <w:color w:val="1E293B"/>
+                <w:sz w:val="20"/>
+              </w:rPr>
+              <w:t>View Personal Contribution</w:t>
+            </w:r>
+          </w:p>
+        </w:tc>
+        <w:tc>
+          <w:tcPr>
+            <w:tcW w:type="dxa" w:w="2448"/>
+            <w:shd w:val="clear" w:color="auto" w:fill="F8FAFC"/>
+            <w:tcMar>
+              <w:top w:w="80" w:type="dxa"/>
+              <w:bottom w:w="80" w:type="dxa"/>
+              <w:left w:w="120" w:type="dxa"/>
+              <w:right w:w="120" w:type="dxa"/>
+            </w:tcMar>
+          </w:tcPr>
+          <w:p>
+            <w:pPr>
+              <w:jc w:val="left"/>
+            </w:pPr>
+            <w:r>
+              <w:rPr>
+                <w:rFonts w:ascii="Times New Roman" w:hAnsi="Times New Roman"/>
+                <w:color w:val="1E293B"/>
+                <w:sz w:val="20"/>
+              </w:rPr>
+              <w:t>View Department Compliance</w:t>
+            </w:r>
+          </w:p>
+        </w:tc>
+        <w:tc>
+          <w:tcPr>
+            <w:tcW w:type="dxa" w:w="2448"/>
+            <w:shd w:val="clear" w:color="auto" w:fill="F8FAFC"/>
+            <w:tcMar>
+              <w:top w:w="80" w:type="dxa"/>
+              <w:bottom w:w="80" w:type="dxa"/>
+              <w:left w:w="120" w:type="dxa"/>
+              <w:right w:w="120" w:type="dxa"/>
+            </w:tcMar>
+          </w:tcPr>
+          <w:p>
+            <w:pPr>
+              <w:jc w:val="left"/>
+            </w:pPr>
+            <w:r>
+              <w:rPr>
+                <w:rFonts w:ascii="Times New Roman" w:hAnsi="Times New Roman"/>
+                <w:color w:val="1E293B"/>
+                <w:sz w:val="20"/>
+              </w:rPr>
+              <w:t>Institution Executive Scorecards</w:t>
+            </w:r>
+          </w:p>
+        </w:tc>
+      </w:tr>
+    </w:tbl>
+    <w:p>
+      <w:pPr>
+        <w:spacing w:before="80" w:after="120"/>
+      </w:pPr>
+    </w:p>
+    <w:p>
+      <w:pPr>
+        <w:keepNext/>
+        <w:spacing w:before="320" w:after="120"/>
+      </w:pPr>
+      <w:r>
+        <w:rPr>
+          <w:rFonts w:ascii="Times New Roman" w:hAnsi="Times New Roman"/>
+          <w:b/>
+          <w:color w:val="0F172A"/>
+          <w:sz w:val="32"/>
+        </w:rPr>
+        <w:t>7. Automated Future Synchronization &amp; Maintenance System</w:t>
+      </w:r>
+    </w:p>
+    <w:p>
+      <w:pPr>
+        <w:spacing w:after="120"/>
+      </w:pPr>
+      <w:r>
+        <w:rPr>
+          <w:rFonts w:ascii="Times New Roman" w:hAnsi="Times New Roman"/>
+          <w:sz w:val="22"/>
+        </w:rPr>
+        <w:t>To ensure that this single comprehensive Word document remains permanently synchronized with all future codebase evolutions, the repository implements an automated multi-layered update infrastructure:</w:t>
+      </w:r>
+    </w:p>
+    <w:p>
+      <w:pPr>
+        <w:pStyle w:val="ListBullet"/>
+        <w:spacing w:after="80"/>
+      </w:pPr>
+      <w:r>
+        <w:rPr>
+          <w:rFonts w:ascii="Times New Roman" w:hAnsi="Times New Roman"/>
+          <w:b/>
+          <w:color w:val="0F172A"/>
+          <w:sz w:val="22"/>
+        </w:rPr>
+        <w:t xml:space="preserve">1. Dedicated Generator Script: </w:t>
+      </w:r>
+      <w:r>
+        <w:rPr>
+          <w:rFonts w:ascii="Times New Roman" w:hAnsi="Times New Roman"/>
+          <w:sz w:val="20"/>
+        </w:rPr>
+        <w:t>The python script scripts/generate_portal_workflows_doc.py is the single source of truth for generating docs/Complete_3_Portals_Workflow_Guide.docx, utilizing python-docx with official SREC branding, color palettes, and structured tables.</w:t>
+      </w:r>
+    </w:p>
+    <w:p>
+      <w:pPr>
+        <w:pStyle w:val="ListBullet"/>
+        <w:spacing w:after="80"/>
+      </w:pPr>
+      <w:r>
+        <w:rPr>
+          <w:rFonts w:ascii="Times New Roman" w:hAnsi="Times New Roman"/>
+          <w:b/>
+          <w:color w:val="0F172A"/>
+          <w:sz w:val="22"/>
+        </w:rPr>
+        <w:t xml:space="preserve">2. Backend Server Startup Auto-Sync: </w:t>
+      </w:r>
+      <w:r>
+        <w:rPr>
+          <w:rFonts w:ascii="Times New Roman" w:hAnsi="Times New Roman"/>
+          <w:sz w:val="20"/>
+        </w:rPr>
+        <w:t>In server/db.js and server/server.js, the backend automatically invokes generate_portal_workflows_doc.py during database initialization on server launch, ensuring that local and production deployments maintain synchronized documentation.</w:t>
+      </w:r>
+    </w:p>
+    <w:p>
+      <w:pPr>
+        <w:pStyle w:val="ListBullet"/>
+        <w:spacing w:after="80"/>
+      </w:pPr>
+      <w:r>
+        <w:rPr>
+          <w:rFonts w:ascii="Times New Roman" w:hAnsi="Times New Roman"/>
+          <w:b/>
+          <w:color w:val="0F172A"/>
+          <w:sz w:val="22"/>
+        </w:rPr>
+        <w:t xml:space="preserve">3. Unified NPM Documentation Commands: </w:t>
+      </w:r>
+      <w:r>
+        <w:rPr>
+          <w:rFonts w:ascii="Times New Roman" w:hAnsi="Times New Roman"/>
+          <w:sz w:val="20"/>
+        </w:rPr>
+        <w:t>Developers can regenerate all system documentation simultaneously by running `npm run update-docs` from the server directory, which sequentially regenerates the Workflow Guide, Database Schema, System Constraints, and Technical File Guide.</w:t>
+      </w:r>
+    </w:p>
+    <w:p>
+      <w:pPr>
+        <w:pStyle w:val="ListBullet"/>
+        <w:spacing w:after="80"/>
+      </w:pPr>
+      <w:r>
+        <w:rPr>
+          <w:rFonts w:ascii="Times New Roman" w:hAnsi="Times New Roman"/>
+          <w:b/>
+          <w:color w:val="0F172A"/>
+          <w:sz w:val="22"/>
+        </w:rPr>
+        <w:t xml:space="preserve">4. Workspace AI Agent Rules (.agents/AGENTS.md): </w:t>
+      </w:r>
+      <w:r>
+        <w:rPr>
+          <w:rFonts w:ascii="Times New Roman" w:hAnsi="Times New Roman"/>
+          <w:sz w:val="20"/>
+        </w:rPr>
+        <w:t>Mandatory workspace agent rules enforce that any change to role permissions, approval lifecycles, or menu structures must trigger an automated execution of the generator script before committing changes.</w:t>
+      </w:r>
     </w:p>
     <w:sectPr>
       <w:footerReference w:type="default" r:id="rId9"/>
@@ -1651,9 +5094,9 @@
       <w:rPr>
         <w:rFonts w:ascii="Times New Roman" w:hAnsi="Times New Roman"/>
         <w:color w:val="64748B"/>
-        <w:sz w:val="22"/>
-      </w:rPr>
-      <w:t>© 2026 FIS Team - Sri Ramakrishna Engineering College, Coimbatore | SREC FIS V3.0</w:t>
+        <w:sz w:val="20"/>
+      </w:rPr>
+      <w:t>© 2026 FIS Engineering Team — Sri Ramakrishna Engineering College, Coimbatore | SREC FIS V3.0</w:t>
     </w:r>
   </w:p>
 </w:ftr>

</xml_diff>